<commit_message>
Subido CAP3 Y MAESTRO
</commit_message>
<xml_diff>
--- a/Capitulo 3 - ANÁLISIS Y MODELADO DE SISTEMA/Capitulo3_V1.0.docx
+++ b/Capitulo 3 - ANÁLISIS Y MODELADO DE SISTEMA/Capitulo3_V1.0.docx
@@ -194,7 +194,25 @@
           <w:sz w:val="24"/>
           <w:szCs w:val="24"/>
         </w:rPr>
-        <w:t>En la metodología de “Generative Analysis”, los actores se identifican a partir de la lista de recursos, abstrayendo roles concretos de las descripciones del mundo real, como declaraciones de visión o transcripciones de entrevistas (Arlow &amp; Neustadt, 2024).</w:t>
+        <w:t xml:space="preserve">En la metodología de “Generative </w:t>
+      </w:r>
+      <w:proofErr w:type="spellStart"/>
+      <w:r>
+        <w:rPr>
+          <w:rFonts w:ascii="Times New Roman" w:eastAsia="Times New Roman" w:hAnsi="Times New Roman" w:cs="Times New Roman"/>
+          <w:sz w:val="24"/>
+          <w:szCs w:val="24"/>
+        </w:rPr>
+        <w:t>Analysis</w:t>
+      </w:r>
+      <w:proofErr w:type="spellEnd"/>
+      <w:r>
+        <w:rPr>
+          <w:rFonts w:ascii="Times New Roman" w:eastAsia="Times New Roman" w:hAnsi="Times New Roman" w:cs="Times New Roman"/>
+          <w:sz w:val="24"/>
+          <w:szCs w:val="24"/>
+        </w:rPr>
+        <w:t>”, los actores se identifican a partir de la lista de recursos, abstrayendo roles concretos de las descripciones del mundo real, como declaraciones de visión o transcripciones de entrevistas (Arlow &amp; Neustadt, 2024).</w:t>
       </w:r>
     </w:p>
     <w:p>
@@ -256,7 +274,25 @@
           <w:sz w:val="24"/>
           <w:szCs w:val="24"/>
         </w:rPr>
-        <w:t>Las herramientas de IA como ChatGPT o Bing pueden automatizar la identificación de actores a partir de un texto, aunque a menudo requieren supervisión humana para corregir “alucinaciones” o roles omitidos (Arlow &amp; Neustadt, 2024).</w:t>
+        <w:t xml:space="preserve">Las herramientas de IA como </w:t>
+      </w:r>
+      <w:proofErr w:type="spellStart"/>
+      <w:r>
+        <w:rPr>
+          <w:rFonts w:ascii="Times New Roman" w:eastAsia="Times New Roman" w:hAnsi="Times New Roman" w:cs="Times New Roman"/>
+          <w:sz w:val="24"/>
+          <w:szCs w:val="24"/>
+        </w:rPr>
+        <w:t>ChatGPT</w:t>
+      </w:r>
+      <w:proofErr w:type="spellEnd"/>
+      <w:r>
+        <w:rPr>
+          <w:rFonts w:ascii="Times New Roman" w:eastAsia="Times New Roman" w:hAnsi="Times New Roman" w:cs="Times New Roman"/>
+          <w:sz w:val="24"/>
+          <w:szCs w:val="24"/>
+        </w:rPr>
+        <w:t xml:space="preserve"> o Bing pueden automatizar la identificación de actores a partir de un texto, aunque a menudo requieren supervisión humana para corregir “alucinaciones” o roles omitidos (Arlow &amp; Neustadt, 2024).</w:t>
       </w:r>
     </w:p>
     <w:p>
@@ -543,7 +579,25 @@
           <w:sz w:val="24"/>
           <w:szCs w:val="24"/>
         </w:rPr>
-        <w:t>Existen marcos de trabajo que utilizan modelos de lenguaje para transformar descripciones de características de usuario en código PlantUML, generando automáticamente diagramas de casos de uso y de secuencia que representan estos escenarios (Nguyen et al., 2026).</w:t>
+        <w:t xml:space="preserve">Existen marcos de trabajo que utilizan modelos de lenguaje para transformar descripciones de características de usuario en código </w:t>
+      </w:r>
+      <w:proofErr w:type="spellStart"/>
+      <w:r>
+        <w:rPr>
+          <w:rFonts w:ascii="Times New Roman" w:eastAsia="Times New Roman" w:hAnsi="Times New Roman" w:cs="Times New Roman"/>
+          <w:sz w:val="24"/>
+          <w:szCs w:val="24"/>
+        </w:rPr>
+        <w:t>PlantUML</w:t>
+      </w:r>
+      <w:proofErr w:type="spellEnd"/>
+      <w:r>
+        <w:rPr>
+          <w:rFonts w:ascii="Times New Roman" w:eastAsia="Times New Roman" w:hAnsi="Times New Roman" w:cs="Times New Roman"/>
+          <w:sz w:val="24"/>
+          <w:szCs w:val="24"/>
+        </w:rPr>
+        <w:t>, generando automáticamente diagramas de casos de uso y de secuencia que representan estos escenarios (Nguyen et al., 2026).</w:t>
       </w:r>
     </w:p>
     <w:p>
@@ -649,8 +703,20 @@
           <w:sz w:val="24"/>
           <w:szCs w:val="24"/>
         </w:rPr>
-        <w:t>Business Understanding</w:t>
-      </w:r>
+        <w:t xml:space="preserve">Business </w:t>
+      </w:r>
+      <w:proofErr w:type="spellStart"/>
+      <w:r>
+        <w:rPr>
+          <w:rFonts w:ascii="Times New Roman" w:eastAsia="Times New Roman" w:hAnsi="Times New Roman" w:cs="Times New Roman"/>
+          <w:i/>
+          <w:iCs/>
+          <w:sz w:val="24"/>
+          <w:szCs w:val="24"/>
+        </w:rPr>
+        <w:t>Understanding</w:t>
+      </w:r>
+      <w:proofErr w:type="spellEnd"/>
       <w:r>
         <w:rPr>
           <w:rFonts w:ascii="Times New Roman" w:eastAsia="Times New Roman" w:hAnsi="Times New Roman" w:cs="Times New Roman"/>
@@ -1035,7 +1101,25 @@
           <w:sz w:val="24"/>
           <w:szCs w:val="24"/>
         </w:rPr>
-        <w:t xml:space="preserve"> para generar automáticamente código PlantUML que visualiza estos casos (Nguyen et al., 2026).</w:t>
+        <w:t xml:space="preserve"> para generar automáticamente código </w:t>
+      </w:r>
+      <w:proofErr w:type="spellStart"/>
+      <w:r>
+        <w:rPr>
+          <w:rFonts w:ascii="Times New Roman" w:eastAsia="Times New Roman" w:hAnsi="Times New Roman" w:cs="Times New Roman"/>
+          <w:sz w:val="24"/>
+          <w:szCs w:val="24"/>
+        </w:rPr>
+        <w:t>PlantUML</w:t>
+      </w:r>
+      <w:proofErr w:type="spellEnd"/>
+      <w:r>
+        <w:rPr>
+          <w:rFonts w:ascii="Times New Roman" w:eastAsia="Times New Roman" w:hAnsi="Times New Roman" w:cs="Times New Roman"/>
+          <w:sz w:val="24"/>
+          <w:szCs w:val="24"/>
+        </w:rPr>
+        <w:t xml:space="preserve"> que visualiza estos casos (Nguyen et al., 2026).</w:t>
       </w:r>
     </w:p>
     <w:p>
@@ -1066,7 +1150,43 @@
           <w:sz w:val="24"/>
           <w:szCs w:val="24"/>
         </w:rPr>
-        <w:t>Se nombran desde la perspectiva del actor (ej. “BrowseCatalog” en lugar de “DisplayCatalog”) para definir los límites del sistema (Arlow &amp; Neustadt, 2024).</w:t>
+        <w:t>Se nombran desde la perspectiva del actor (ej. “</w:t>
+      </w:r>
+      <w:proofErr w:type="spellStart"/>
+      <w:r>
+        <w:rPr>
+          <w:rFonts w:ascii="Times New Roman" w:eastAsia="Times New Roman" w:hAnsi="Times New Roman" w:cs="Times New Roman"/>
+          <w:sz w:val="24"/>
+          <w:szCs w:val="24"/>
+        </w:rPr>
+        <w:t>BrowseCatalog</w:t>
+      </w:r>
+      <w:proofErr w:type="spellEnd"/>
+      <w:r>
+        <w:rPr>
+          <w:rFonts w:ascii="Times New Roman" w:eastAsia="Times New Roman" w:hAnsi="Times New Roman" w:cs="Times New Roman"/>
+          <w:sz w:val="24"/>
+          <w:szCs w:val="24"/>
+        </w:rPr>
+        <w:t>” en lugar de “</w:t>
+      </w:r>
+      <w:proofErr w:type="spellStart"/>
+      <w:r>
+        <w:rPr>
+          <w:rFonts w:ascii="Times New Roman" w:eastAsia="Times New Roman" w:hAnsi="Times New Roman" w:cs="Times New Roman"/>
+          <w:sz w:val="24"/>
+          <w:szCs w:val="24"/>
+        </w:rPr>
+        <w:t>DisplayCatalog</w:t>
+      </w:r>
+      <w:proofErr w:type="spellEnd"/>
+      <w:r>
+        <w:rPr>
+          <w:rFonts w:ascii="Times New Roman" w:eastAsia="Times New Roman" w:hAnsi="Times New Roman" w:cs="Times New Roman"/>
+          <w:sz w:val="24"/>
+          <w:szCs w:val="24"/>
+        </w:rPr>
+        <w:t>”) para definir los límites del sistema (Arlow &amp; Neustadt, 2024).</w:t>
       </w:r>
     </w:p>
     <w:p>
@@ -1545,7 +1665,7 @@
           <w:szCs w:val="24"/>
         </w:rPr>
         <w:drawing>
-          <wp:inline distT="0" distB="0" distL="0" distR="0" wp14:anchorId="41B1F05A" wp14:editId="668FAFA7">
+          <wp:inline distT="0" distB="0" distL="0" distR="0" wp14:anchorId="41B1F05A" wp14:editId="0CF2CEC5">
             <wp:extent cx="2800000" cy="2520000"/>
             <wp:effectExtent l="0" t="0" r="635" b="0"/>
             <wp:docPr id="5" name="Imagen 5" descr="C:\Users\DELL\AppData\Local\Microsoft\Windows\INetCache\Content.MSO\A5F482E2.tmp"/>
@@ -1671,41 +1791,116 @@
           <w:szCs w:val="24"/>
         </w:rPr>
         <w:tab/>
-        <w:t>PlantUML para documentar, versionar y mejorar diagramas de manera trazable</w:t>
-      </w:r>
-    </w:p>
-    <w:p>
-      <w:pPr>
-        <w:rPr>
-          <w:rFonts w:ascii="Times New Roman" w:eastAsia="Times New Roman" w:hAnsi="Times New Roman" w:cs="Times New Roman"/>
-          <w:sz w:val="24"/>
-          <w:szCs w:val="24"/>
-        </w:rPr>
-      </w:pPr>
-      <w:r>
-        <w:rPr>
-          <w:rFonts w:ascii="Times New Roman" w:eastAsia="Times New Roman" w:hAnsi="Times New Roman" w:cs="Times New Roman"/>
-          <w:sz w:val="24"/>
-          <w:szCs w:val="24"/>
-        </w:rPr>
-        <w:t>Dentro del marco del Análisis y Modelado de Sistemas con IA Generativa, PlantUML se destaca como la herramienta fundamental para transformar descripciones textuales en modelos visuales, facilitando procesos de documentación, versionamiento y trazabilidad que los formatos tradicionales (como XMI) no permiten con la misma eficacia (Arlow &amp; Neustadt, 2024).</w:t>
-      </w:r>
-    </w:p>
-    <w:p>
-      <w:pPr>
-        <w:rPr>
-          <w:rFonts w:ascii="Times New Roman" w:eastAsia="Times New Roman" w:hAnsi="Times New Roman" w:cs="Times New Roman"/>
-          <w:sz w:val="24"/>
-          <w:szCs w:val="24"/>
-        </w:rPr>
-      </w:pPr>
-      <w:r>
-        <w:rPr>
-          <w:rFonts w:ascii="Times New Roman" w:eastAsia="Times New Roman" w:hAnsi="Times New Roman" w:cs="Times New Roman"/>
-          <w:sz w:val="24"/>
-          <w:szCs w:val="24"/>
-        </w:rPr>
-        <w:t>A continuación, se detalla cómo PlantUML cumple estas funciones:</w:t>
+      </w:r>
+      <w:proofErr w:type="spellStart"/>
+      <w:r>
+        <w:rPr>
+          <w:rFonts w:ascii="Times New Roman" w:eastAsia="Times New Roman" w:hAnsi="Times New Roman" w:cs="Times New Roman"/>
+          <w:b/>
+          <w:bCs/>
+          <w:sz w:val="24"/>
+          <w:szCs w:val="24"/>
+        </w:rPr>
+        <w:t>PlantUML</w:t>
+      </w:r>
+      <w:proofErr w:type="spellEnd"/>
+      <w:r>
+        <w:rPr>
+          <w:rFonts w:ascii="Times New Roman" w:eastAsia="Times New Roman" w:hAnsi="Times New Roman" w:cs="Times New Roman"/>
+          <w:b/>
+          <w:bCs/>
+          <w:sz w:val="24"/>
+          <w:szCs w:val="24"/>
+        </w:rPr>
+        <w:t xml:space="preserve"> para documentar, versionar y mejorar diagramas de manera trazable</w:t>
+      </w:r>
+    </w:p>
+    <w:p>
+      <w:pPr>
+        <w:rPr>
+          <w:rFonts w:ascii="Times New Roman" w:eastAsia="Times New Roman" w:hAnsi="Times New Roman" w:cs="Times New Roman"/>
+          <w:sz w:val="24"/>
+          <w:szCs w:val="24"/>
+        </w:rPr>
+      </w:pPr>
+      <w:r>
+        <w:rPr>
+          <w:rFonts w:ascii="Times New Roman" w:eastAsia="Times New Roman" w:hAnsi="Times New Roman" w:cs="Times New Roman"/>
+          <w:sz w:val="24"/>
+          <w:szCs w:val="24"/>
+        </w:rPr>
+        <w:t xml:space="preserve">Dentro del marco del Análisis y Modelado de Sistemas con IA Generativa, </w:t>
+      </w:r>
+      <w:proofErr w:type="spellStart"/>
+      <w:r>
+        <w:rPr>
+          <w:rFonts w:ascii="Times New Roman" w:eastAsia="Times New Roman" w:hAnsi="Times New Roman" w:cs="Times New Roman"/>
+          <w:sz w:val="24"/>
+          <w:szCs w:val="24"/>
+        </w:rPr>
+        <w:t>PlantUML</w:t>
+      </w:r>
+      <w:proofErr w:type="spellEnd"/>
+      <w:r>
+        <w:rPr>
+          <w:rFonts w:ascii="Times New Roman" w:eastAsia="Times New Roman" w:hAnsi="Times New Roman" w:cs="Times New Roman"/>
+          <w:sz w:val="24"/>
+          <w:szCs w:val="24"/>
+        </w:rPr>
+        <w:t xml:space="preserve"> se destaca como la herramienta fundamental para transformar descripciones textuales en modelos visuales, facilitando procesos de documentación, </w:t>
+      </w:r>
+      <w:proofErr w:type="spellStart"/>
+      <w:r>
+        <w:rPr>
+          <w:rFonts w:ascii="Times New Roman" w:eastAsia="Times New Roman" w:hAnsi="Times New Roman" w:cs="Times New Roman"/>
+          <w:sz w:val="24"/>
+          <w:szCs w:val="24"/>
+        </w:rPr>
+        <w:t>versionamiento</w:t>
+      </w:r>
+      <w:proofErr w:type="spellEnd"/>
+      <w:r>
+        <w:rPr>
+          <w:rFonts w:ascii="Times New Roman" w:eastAsia="Times New Roman" w:hAnsi="Times New Roman" w:cs="Times New Roman"/>
+          <w:sz w:val="24"/>
+          <w:szCs w:val="24"/>
+        </w:rPr>
+        <w:t xml:space="preserve"> y trazabilidad que los formatos tradicionales (como XMI) no permiten con la misma eficacia (Arlow &amp; Neustadt, 2024).</w:t>
+      </w:r>
+    </w:p>
+    <w:p>
+      <w:pPr>
+        <w:rPr>
+          <w:rFonts w:ascii="Times New Roman" w:eastAsia="Times New Roman" w:hAnsi="Times New Roman" w:cs="Times New Roman"/>
+          <w:sz w:val="24"/>
+          <w:szCs w:val="24"/>
+        </w:rPr>
+      </w:pPr>
+      <w:r>
+        <w:rPr>
+          <w:rFonts w:ascii="Times New Roman" w:eastAsia="Times New Roman" w:hAnsi="Times New Roman" w:cs="Times New Roman"/>
+          <w:sz w:val="24"/>
+          <w:szCs w:val="24"/>
+        </w:rPr>
+        <w:t xml:space="preserve">A continuación, se detalla cómo </w:t>
+      </w:r>
+      <w:proofErr w:type="spellStart"/>
+      <w:r>
+        <w:rPr>
+          <w:rFonts w:ascii="Times New Roman" w:eastAsia="Times New Roman" w:hAnsi="Times New Roman" w:cs="Times New Roman"/>
+          <w:sz w:val="24"/>
+          <w:szCs w:val="24"/>
+        </w:rPr>
+        <w:t>PlantUML</w:t>
+      </w:r>
+      <w:proofErr w:type="spellEnd"/>
+      <w:r>
+        <w:rPr>
+          <w:rFonts w:ascii="Times New Roman" w:eastAsia="Times New Roman" w:hAnsi="Times New Roman" w:cs="Times New Roman"/>
+          <w:sz w:val="24"/>
+          <w:szCs w:val="24"/>
+        </w:rPr>
+        <w:t xml:space="preserve"> cumple estas funciones:</w:t>
       </w:r>
     </w:p>
     <w:p>
@@ -1764,13 +1959,23 @@
           <w:szCs w:val="24"/>
         </w:rPr>
       </w:pPr>
-      <w:r>
-        <w:rPr>
-          <w:rFonts w:ascii="Times New Roman" w:eastAsia="Times New Roman" w:hAnsi="Times New Roman" w:cs="Times New Roman"/>
-          <w:sz w:val="24"/>
-          <w:szCs w:val="24"/>
-        </w:rPr>
-        <w:t>PlantUML permite una correlación armoniosa entre el texto y el gráfico, lo que significa que los borradores generados por la IA se traducen con precisión en diagramas (Roques, 2025).</w:t>
+      <w:proofErr w:type="spellStart"/>
+      <w:r>
+        <w:rPr>
+          <w:rFonts w:ascii="Times New Roman" w:eastAsia="Times New Roman" w:hAnsi="Times New Roman" w:cs="Times New Roman"/>
+          <w:sz w:val="24"/>
+          <w:szCs w:val="24"/>
+        </w:rPr>
+        <w:t>PlantUML</w:t>
+      </w:r>
+      <w:proofErr w:type="spellEnd"/>
+      <w:r>
+        <w:rPr>
+          <w:rFonts w:ascii="Times New Roman" w:eastAsia="Times New Roman" w:hAnsi="Times New Roman" w:cs="Times New Roman"/>
+          <w:sz w:val="24"/>
+          <w:szCs w:val="24"/>
+        </w:rPr>
+        <w:t xml:space="preserve"> permite una correlación armoniosa entre el texto y el gráfico, lo que significa que los borradores generados por la IA se traducen con precisión en diagramas (Roques, 2025).</w:t>
       </w:r>
     </w:p>
     <w:p>
@@ -1802,7 +2007,25 @@
           <w:sz w:val="24"/>
           <w:szCs w:val="24"/>
         </w:rPr>
-        <w:t>En el modelado asistido por IA, la narrativa precisa (proposiciones y requisitos) se convierte en el “almacén de la verdad”, y PlantUML actúa como el motor de visualización bajo demanda (Arlow &amp; Neustadt, 2024).</w:t>
+        <w:t xml:space="preserve">En el modelado asistido por IA, la narrativa precisa (proposiciones y requisitos) se convierte en el “almacén de la verdad”, y </w:t>
+      </w:r>
+      <w:proofErr w:type="spellStart"/>
+      <w:r>
+        <w:rPr>
+          <w:rFonts w:ascii="Times New Roman" w:eastAsia="Times New Roman" w:hAnsi="Times New Roman" w:cs="Times New Roman"/>
+          <w:sz w:val="24"/>
+          <w:szCs w:val="24"/>
+        </w:rPr>
+        <w:t>PlantUML</w:t>
+      </w:r>
+      <w:proofErr w:type="spellEnd"/>
+      <w:r>
+        <w:rPr>
+          <w:rFonts w:ascii="Times New Roman" w:eastAsia="Times New Roman" w:hAnsi="Times New Roman" w:cs="Times New Roman"/>
+          <w:sz w:val="24"/>
+          <w:szCs w:val="24"/>
+        </w:rPr>
+        <w:t xml:space="preserve"> actúa como el motor de visualización bajo demanda (Arlow &amp; Neustadt, 2024).</w:t>
       </w:r>
     </w:p>
     <w:p>
@@ -1881,24 +2104,67 @@
           <w:szCs w:val="24"/>
         </w:rPr>
         <w:tab/>
-        <w:t>Versionamiento: “Diagramas como Código”</w:t>
-      </w:r>
-    </w:p>
-    <w:p>
-      <w:pPr>
-        <w:rPr>
-          <w:rFonts w:ascii="Times New Roman" w:eastAsia="Times New Roman" w:hAnsi="Times New Roman" w:cs="Times New Roman"/>
-          <w:sz w:val="24"/>
-          <w:szCs w:val="24"/>
-        </w:rPr>
-      </w:pPr>
-      <w:r>
-        <w:rPr>
-          <w:rFonts w:ascii="Times New Roman" w:eastAsia="Times New Roman" w:hAnsi="Times New Roman" w:cs="Times New Roman"/>
-          <w:sz w:val="24"/>
-          <w:szCs w:val="24"/>
-        </w:rPr>
-        <w:t>El enfoque de “Diagramas como Código” (o “Diagramas como Texto”) es una de las mayores ventajas de PlantUML para el control de versiones (Norvell, 2023).</w:t>
+      </w:r>
+      <w:proofErr w:type="spellStart"/>
+      <w:r>
+        <w:rPr>
+          <w:rFonts w:ascii="Times New Roman" w:eastAsia="Times New Roman" w:hAnsi="Times New Roman" w:cs="Times New Roman"/>
+          <w:b/>
+          <w:bCs/>
+          <w:i/>
+          <w:iCs/>
+          <w:sz w:val="24"/>
+          <w:szCs w:val="24"/>
+        </w:rPr>
+        <w:t>Versionamiento</w:t>
+      </w:r>
+      <w:proofErr w:type="spellEnd"/>
+      <w:r>
+        <w:rPr>
+          <w:rFonts w:ascii="Times New Roman" w:eastAsia="Times New Roman" w:hAnsi="Times New Roman" w:cs="Times New Roman"/>
+          <w:b/>
+          <w:bCs/>
+          <w:i/>
+          <w:iCs/>
+          <w:sz w:val="24"/>
+          <w:szCs w:val="24"/>
+        </w:rPr>
+        <w:t>: “Diagramas como Código”</w:t>
+      </w:r>
+    </w:p>
+    <w:p>
+      <w:pPr>
+        <w:rPr>
+          <w:rFonts w:ascii="Times New Roman" w:eastAsia="Times New Roman" w:hAnsi="Times New Roman" w:cs="Times New Roman"/>
+          <w:sz w:val="24"/>
+          <w:szCs w:val="24"/>
+        </w:rPr>
+      </w:pPr>
+      <w:r>
+        <w:rPr>
+          <w:rFonts w:ascii="Times New Roman" w:eastAsia="Times New Roman" w:hAnsi="Times New Roman" w:cs="Times New Roman"/>
+          <w:sz w:val="24"/>
+          <w:szCs w:val="24"/>
+        </w:rPr>
+        <w:t xml:space="preserve">El enfoque de “Diagramas como Código” (o “Diagramas como Texto”) es una de las mayores ventajas de </w:t>
+      </w:r>
+      <w:proofErr w:type="spellStart"/>
+      <w:r>
+        <w:rPr>
+          <w:rFonts w:ascii="Times New Roman" w:eastAsia="Times New Roman" w:hAnsi="Times New Roman" w:cs="Times New Roman"/>
+          <w:sz w:val="24"/>
+          <w:szCs w:val="24"/>
+        </w:rPr>
+        <w:t>PlantUML</w:t>
+      </w:r>
+      <w:proofErr w:type="spellEnd"/>
+      <w:r>
+        <w:rPr>
+          <w:rFonts w:ascii="Times New Roman" w:eastAsia="Times New Roman" w:hAnsi="Times New Roman" w:cs="Times New Roman"/>
+          <w:sz w:val="24"/>
+          <w:szCs w:val="24"/>
+        </w:rPr>
+        <w:t xml:space="preserve"> para el control de versiones (Norvell, 2023).</w:t>
       </w:r>
     </w:p>
     <w:p>
@@ -1929,7 +2195,61 @@
           <w:sz w:val="24"/>
           <w:szCs w:val="24"/>
         </w:rPr>
-        <w:t>Al ser archivos de texto, se pueden utilizar herramientas estándar como git diff para resaltar las diferencias exactas entre versiones de un diagrama y realizar fusiones (merges) automáticas de cambios independientes (Norvell, 2023).</w:t>
+        <w:t xml:space="preserve">Al ser archivos de texto, se pueden utilizar herramientas estándar como </w:t>
+      </w:r>
+      <w:proofErr w:type="spellStart"/>
+      <w:r>
+        <w:rPr>
+          <w:rFonts w:ascii="Times New Roman" w:eastAsia="Times New Roman" w:hAnsi="Times New Roman" w:cs="Times New Roman"/>
+          <w:sz w:val="24"/>
+          <w:szCs w:val="24"/>
+        </w:rPr>
+        <w:t>git</w:t>
+      </w:r>
+      <w:proofErr w:type="spellEnd"/>
+      <w:r>
+        <w:rPr>
+          <w:rFonts w:ascii="Times New Roman" w:eastAsia="Times New Roman" w:hAnsi="Times New Roman" w:cs="Times New Roman"/>
+          <w:sz w:val="24"/>
+          <w:szCs w:val="24"/>
+        </w:rPr>
+        <w:t xml:space="preserve"> </w:t>
+      </w:r>
+      <w:proofErr w:type="spellStart"/>
+      <w:r>
+        <w:rPr>
+          <w:rFonts w:ascii="Times New Roman" w:eastAsia="Times New Roman" w:hAnsi="Times New Roman" w:cs="Times New Roman"/>
+          <w:sz w:val="24"/>
+          <w:szCs w:val="24"/>
+        </w:rPr>
+        <w:t>diff</w:t>
+      </w:r>
+      <w:proofErr w:type="spellEnd"/>
+      <w:r>
+        <w:rPr>
+          <w:rFonts w:ascii="Times New Roman" w:eastAsia="Times New Roman" w:hAnsi="Times New Roman" w:cs="Times New Roman"/>
+          <w:sz w:val="24"/>
+          <w:szCs w:val="24"/>
+        </w:rPr>
+        <w:t xml:space="preserve"> para resaltar las diferencias exactas entre versiones de un diagrama y realizar fusiones (</w:t>
+      </w:r>
+      <w:proofErr w:type="spellStart"/>
+      <w:r>
+        <w:rPr>
+          <w:rFonts w:ascii="Times New Roman" w:eastAsia="Times New Roman" w:hAnsi="Times New Roman" w:cs="Times New Roman"/>
+          <w:sz w:val="24"/>
+          <w:szCs w:val="24"/>
+        </w:rPr>
+        <w:t>merges</w:t>
+      </w:r>
+      <w:proofErr w:type="spellEnd"/>
+      <w:r>
+        <w:rPr>
+          <w:rFonts w:ascii="Times New Roman" w:eastAsia="Times New Roman" w:hAnsi="Times New Roman" w:cs="Times New Roman"/>
+          <w:sz w:val="24"/>
+          <w:szCs w:val="24"/>
+        </w:rPr>
+        <w:t>) automáticas de cambios independientes (Norvell, 2023).</w:t>
       </w:r>
     </w:p>
     <w:p>
@@ -2008,24 +2328,68 @@
           <w:szCs w:val="24"/>
         </w:rPr>
         <w:tab/>
-        <w:t>Trazabilidad: Vinculando Prompts y Modelos</w:t>
-      </w:r>
-    </w:p>
-    <w:p>
-      <w:pPr>
-        <w:rPr>
-          <w:rFonts w:ascii="Times New Roman" w:eastAsia="Times New Roman" w:hAnsi="Times New Roman" w:cs="Times New Roman"/>
-          <w:sz w:val="24"/>
-          <w:szCs w:val="24"/>
-        </w:rPr>
-      </w:pPr>
-      <w:r>
-        <w:rPr>
-          <w:rFonts w:ascii="Times New Roman" w:eastAsia="Times New Roman" w:hAnsi="Times New Roman" w:cs="Times New Roman"/>
-          <w:sz w:val="24"/>
-          <w:szCs w:val="24"/>
-        </w:rPr>
-        <w:t>La trazabilidad en el modelado con IA se logra mediante la integración de los prompts de ingeniería con los artefactos generados (Arlow &amp; Neustadt, 2024).</w:t>
+        <w:t xml:space="preserve">Trazabilidad: Vinculando </w:t>
+      </w:r>
+      <w:proofErr w:type="spellStart"/>
+      <w:r>
+        <w:rPr>
+          <w:rFonts w:ascii="Times New Roman" w:eastAsia="Times New Roman" w:hAnsi="Times New Roman" w:cs="Times New Roman"/>
+          <w:b/>
+          <w:bCs/>
+          <w:i/>
+          <w:iCs/>
+          <w:sz w:val="24"/>
+          <w:szCs w:val="24"/>
+        </w:rPr>
+        <w:t>Prompts</w:t>
+      </w:r>
+      <w:proofErr w:type="spellEnd"/>
+      <w:r>
+        <w:rPr>
+          <w:rFonts w:ascii="Times New Roman" w:eastAsia="Times New Roman" w:hAnsi="Times New Roman" w:cs="Times New Roman"/>
+          <w:b/>
+          <w:bCs/>
+          <w:i/>
+          <w:iCs/>
+          <w:sz w:val="24"/>
+          <w:szCs w:val="24"/>
+        </w:rPr>
+        <w:t xml:space="preserve"> y Modelos</w:t>
+      </w:r>
+    </w:p>
+    <w:p>
+      <w:pPr>
+        <w:rPr>
+          <w:rFonts w:ascii="Times New Roman" w:eastAsia="Times New Roman" w:hAnsi="Times New Roman" w:cs="Times New Roman"/>
+          <w:sz w:val="24"/>
+          <w:szCs w:val="24"/>
+        </w:rPr>
+      </w:pPr>
+      <w:r>
+        <w:rPr>
+          <w:rFonts w:ascii="Times New Roman" w:eastAsia="Times New Roman" w:hAnsi="Times New Roman" w:cs="Times New Roman"/>
+          <w:sz w:val="24"/>
+          <w:szCs w:val="24"/>
+        </w:rPr>
+        <w:t xml:space="preserve">La trazabilidad en el modelado con IA se logra mediante la integración de los </w:t>
+      </w:r>
+      <w:proofErr w:type="spellStart"/>
+      <w:r>
+        <w:rPr>
+          <w:rFonts w:ascii="Times New Roman" w:eastAsia="Times New Roman" w:hAnsi="Times New Roman" w:cs="Times New Roman"/>
+          <w:sz w:val="24"/>
+          <w:szCs w:val="24"/>
+        </w:rPr>
+        <w:t>prompts</w:t>
+      </w:r>
+      <w:proofErr w:type="spellEnd"/>
+      <w:r>
+        <w:rPr>
+          <w:rFonts w:ascii="Times New Roman" w:eastAsia="Times New Roman" w:hAnsi="Times New Roman" w:cs="Times New Roman"/>
+          <w:sz w:val="24"/>
+          <w:szCs w:val="24"/>
+        </w:rPr>
+        <w:t xml:space="preserve"> de ingeniería con los artefactos generados (Arlow &amp; Neustadt, 2024).</w:t>
       </w:r>
     </w:p>
     <w:p>
@@ -2064,7 +2428,25 @@
           <w:sz w:val="24"/>
           <w:szCs w:val="24"/>
         </w:rPr>
-        <w:t xml:space="preserve"> capturar el prompt que generó el diagrama como metadatos o notas al final del documento para mantener un vínculo claro entre el requisito original y el modelo visual (Arlow &amp; Neustadt, 2024).</w:t>
+        <w:t xml:space="preserve"> capturar el </w:t>
+      </w:r>
+      <w:proofErr w:type="spellStart"/>
+      <w:r>
+        <w:rPr>
+          <w:rFonts w:ascii="Times New Roman" w:eastAsia="Times New Roman" w:hAnsi="Times New Roman" w:cs="Times New Roman"/>
+          <w:sz w:val="24"/>
+          <w:szCs w:val="24"/>
+        </w:rPr>
+        <w:t>prompt</w:t>
+      </w:r>
+      <w:proofErr w:type="spellEnd"/>
+      <w:r>
+        <w:rPr>
+          <w:rFonts w:ascii="Times New Roman" w:eastAsia="Times New Roman" w:hAnsi="Times New Roman" w:cs="Times New Roman"/>
+          <w:sz w:val="24"/>
+          <w:szCs w:val="24"/>
+        </w:rPr>
+        <w:t xml:space="preserve"> que generó el diagrama como metadatos o notas al final del documento para mantener un vínculo claro entre el requisito original y el modelo visual (Arlow &amp; Neustadt, 2024).</w:t>
       </w:r>
     </w:p>
     <w:p>
@@ -2095,7 +2477,25 @@
           <w:sz w:val="24"/>
           <w:szCs w:val="24"/>
         </w:rPr>
-        <w:t>El uso de IA permite que la narrativa y el diagrama de secuencia (o clase) se mantengan en completa sincronización, asegurando que cada paso lógico en el texto tenga su representación en el código PlantUML (Arlow &amp; Neustadt, 2024).</w:t>
+        <w:t xml:space="preserve">El uso de IA permite que la narrativa y el diagrama de secuencia (o clase) se mantengan en completa sincronización, asegurando que cada paso lógico en el texto tenga su representación en el código </w:t>
+      </w:r>
+      <w:proofErr w:type="spellStart"/>
+      <w:r>
+        <w:rPr>
+          <w:rFonts w:ascii="Times New Roman" w:eastAsia="Times New Roman" w:hAnsi="Times New Roman" w:cs="Times New Roman"/>
+          <w:sz w:val="24"/>
+          <w:szCs w:val="24"/>
+        </w:rPr>
+        <w:t>PlantUML</w:t>
+      </w:r>
+      <w:proofErr w:type="spellEnd"/>
+      <w:r>
+        <w:rPr>
+          <w:rFonts w:ascii="Times New Roman" w:eastAsia="Times New Roman" w:hAnsi="Times New Roman" w:cs="Times New Roman"/>
+          <w:sz w:val="24"/>
+          <w:szCs w:val="24"/>
+        </w:rPr>
+        <w:t xml:space="preserve"> (Arlow &amp; Neustadt, 2024).</w:t>
       </w:r>
     </w:p>
     <w:p>
@@ -2160,7 +2560,25 @@
           <w:sz w:val="24"/>
           <w:szCs w:val="24"/>
         </w:rPr>
-        <w:t>La IA Generativa es particularmente hábil generando código PlantUML a partir de requisitos estructurados, superando las limitaciones de otros formatos de intercambio como XMI (Arlow &amp; Neustadt, 2024).</w:t>
+        <w:t xml:space="preserve">La IA Generativa es particularmente hábil generando código </w:t>
+      </w:r>
+      <w:proofErr w:type="spellStart"/>
+      <w:r>
+        <w:rPr>
+          <w:rFonts w:ascii="Times New Roman" w:eastAsia="Times New Roman" w:hAnsi="Times New Roman" w:cs="Times New Roman"/>
+          <w:sz w:val="24"/>
+          <w:szCs w:val="24"/>
+        </w:rPr>
+        <w:t>PlantUML</w:t>
+      </w:r>
+      <w:proofErr w:type="spellEnd"/>
+      <w:r>
+        <w:rPr>
+          <w:rFonts w:ascii="Times New Roman" w:eastAsia="Times New Roman" w:hAnsi="Times New Roman" w:cs="Times New Roman"/>
+          <w:sz w:val="24"/>
+          <w:szCs w:val="24"/>
+        </w:rPr>
+        <w:t xml:space="preserve"> a partir de requisitos estructurados, superando las limitaciones de otros formatos de intercambio como XMI (Arlow &amp; Neustadt, 2024).</w:t>
       </w:r>
     </w:p>
     <w:p>
@@ -2223,7 +2641,25 @@
           <w:sz w:val="24"/>
           <w:szCs w:val="24"/>
         </w:rPr>
-        <w:t>Existen marcos de trabajo que utilizan modelos de visión-lenguaje para validar que el diagrama de PlantUML renderizado sea semánticamente coherente con el texto que le dio origen (Nguyen, V.-V., et al., 2026).</w:t>
+        <w:t xml:space="preserve">Existen marcos de trabajo que utilizan modelos de visión-lenguaje para validar que el diagrama de </w:t>
+      </w:r>
+      <w:proofErr w:type="spellStart"/>
+      <w:r>
+        <w:rPr>
+          <w:rFonts w:ascii="Times New Roman" w:eastAsia="Times New Roman" w:hAnsi="Times New Roman" w:cs="Times New Roman"/>
+          <w:sz w:val="24"/>
+          <w:szCs w:val="24"/>
+        </w:rPr>
+        <w:t>PlantUML</w:t>
+      </w:r>
+      <w:proofErr w:type="spellEnd"/>
+      <w:r>
+        <w:rPr>
+          <w:rFonts w:ascii="Times New Roman" w:eastAsia="Times New Roman" w:hAnsi="Times New Roman" w:cs="Times New Roman"/>
+          <w:sz w:val="24"/>
+          <w:szCs w:val="24"/>
+        </w:rPr>
+        <w:t xml:space="preserve"> renderizado sea semánticamente coherente con el texto que le dio origen (Nguyen, V.-V., et al., 2026).</w:t>
       </w:r>
     </w:p>
     <w:p>
@@ -2247,7 +2683,25 @@
           <w:sz w:val="24"/>
           <w:szCs w:val="24"/>
         </w:rPr>
-        <w:t>Figura 4. PlantUML en el Análisis de Sistemas</w:t>
+        <w:t xml:space="preserve">Figura 4. </w:t>
+      </w:r>
+      <w:proofErr w:type="spellStart"/>
+      <w:r>
+        <w:rPr>
+          <w:rFonts w:ascii="Times New Roman" w:eastAsia="Arial" w:hAnsi="Times New Roman" w:cs="Times New Roman"/>
+          <w:sz w:val="24"/>
+          <w:szCs w:val="24"/>
+        </w:rPr>
+        <w:t>PlantUML</w:t>
+      </w:r>
+      <w:proofErr w:type="spellEnd"/>
+      <w:r>
+        <w:rPr>
+          <w:rFonts w:ascii="Times New Roman" w:eastAsia="Arial" w:hAnsi="Times New Roman" w:cs="Times New Roman"/>
+          <w:sz w:val="24"/>
+          <w:szCs w:val="24"/>
+        </w:rPr>
+        <w:t xml:space="preserve"> en el Análisis de Sistemas</w:t>
       </w:r>
     </w:p>
     <w:p>
@@ -2268,7 +2722,7 @@
           <w:szCs w:val="24"/>
         </w:rPr>
         <w:drawing>
-          <wp:inline distT="0" distB="0" distL="0" distR="0" wp14:anchorId="5E875103" wp14:editId="735387DA">
+          <wp:inline distT="0" distB="0" distL="0" distR="0" wp14:anchorId="5E875103" wp14:editId="65B28706">
             <wp:extent cx="3241209" cy="2880000"/>
             <wp:effectExtent l="0" t="0" r="0" b="0"/>
             <wp:docPr id="2" name="Imagen 2" descr="C:\Users\DELL\AppData\Local\Microsoft\Windows\INetCache\Content.MSO\6A5E06B4.tmp"/>
@@ -2352,7 +2806,25 @@
           <w:sz w:val="24"/>
           <w:szCs w:val="24"/>
         </w:rPr>
-        <w:t>Nota. Diagrama conceptual que representa a PlantUML como un lente transformador. A la izquierda se detallan sus cuatro pilares funcionales. A la derecha, se muestra el resultado unificado de este proceso.</w:t>
+        <w:t xml:space="preserve">Nota. Diagrama conceptual que representa a </w:t>
+      </w:r>
+      <w:proofErr w:type="spellStart"/>
+      <w:r>
+        <w:rPr>
+          <w:rFonts w:ascii="Times New Roman" w:eastAsia="Arial" w:hAnsi="Times New Roman" w:cs="Times New Roman"/>
+          <w:sz w:val="24"/>
+          <w:szCs w:val="24"/>
+        </w:rPr>
+        <w:t>PlantUML</w:t>
+      </w:r>
+      <w:proofErr w:type="spellEnd"/>
+      <w:r>
+        <w:rPr>
+          <w:rFonts w:ascii="Times New Roman" w:eastAsia="Arial" w:hAnsi="Times New Roman" w:cs="Times New Roman"/>
+          <w:sz w:val="24"/>
+          <w:szCs w:val="24"/>
+        </w:rPr>
+        <w:t xml:space="preserve"> como un lente transformador. A la izquierda se detallan sus cuatro pilares funcionales. A la derecha, se muestra el resultado unificado de este proceso.</w:t>
       </w:r>
     </w:p>
     <w:p>
@@ -2527,7 +2999,29 @@
           <w:szCs w:val="24"/>
         </w:rPr>
         <w:lastRenderedPageBreak/>
-        <w:t xml:space="preserve">Consistencia Horizontal (Intra-modelo): </w:t>
+        <w:t>Consistencia Horizontal (</w:t>
+      </w:r>
+      <w:proofErr w:type="spellStart"/>
+      <w:r>
+        <w:rPr>
+          <w:rFonts w:ascii="Times New Roman" w:eastAsia="Times New Roman" w:hAnsi="Times New Roman" w:cs="Times New Roman"/>
+          <w:b/>
+          <w:bCs/>
+          <w:sz w:val="24"/>
+          <w:szCs w:val="24"/>
+        </w:rPr>
+        <w:t>Intra-modelo</w:t>
+      </w:r>
+      <w:proofErr w:type="spellEnd"/>
+      <w:r>
+        <w:rPr>
+          <w:rFonts w:ascii="Times New Roman" w:eastAsia="Times New Roman" w:hAnsi="Times New Roman" w:cs="Times New Roman"/>
+          <w:b/>
+          <w:bCs/>
+          <w:sz w:val="24"/>
+          <w:szCs w:val="24"/>
+        </w:rPr>
+        <w:t xml:space="preserve">): </w:t>
       </w:r>
       <w:r>
         <w:rPr>
@@ -2577,7 +3071,29 @@
           <w:sz w:val="24"/>
           <w:szCs w:val="24"/>
         </w:rPr>
-        <w:t xml:space="preserve">Consistencia Vertical (Inter-modelo): </w:t>
+        <w:t>Consistencia Vertical (</w:t>
+      </w:r>
+      <w:proofErr w:type="spellStart"/>
+      <w:r>
+        <w:rPr>
+          <w:rFonts w:ascii="Times New Roman" w:eastAsia="Times New Roman" w:hAnsi="Times New Roman" w:cs="Times New Roman"/>
+          <w:b/>
+          <w:bCs/>
+          <w:sz w:val="24"/>
+          <w:szCs w:val="24"/>
+        </w:rPr>
+        <w:t>Inter-modelo</w:t>
+      </w:r>
+      <w:proofErr w:type="spellEnd"/>
+      <w:r>
+        <w:rPr>
+          <w:rFonts w:ascii="Times New Roman" w:eastAsia="Times New Roman" w:hAnsi="Times New Roman" w:cs="Times New Roman"/>
+          <w:b/>
+          <w:bCs/>
+          <w:sz w:val="24"/>
+          <w:szCs w:val="24"/>
+        </w:rPr>
+        <w:t xml:space="preserve">): </w:t>
       </w:r>
       <w:r>
         <w:rPr>
@@ -2817,7 +3333,25 @@
           <w:sz w:val="24"/>
           <w:szCs w:val="24"/>
         </w:rPr>
-        <w:t>En el enfoque de Arquitectura como Código (AaC), la consistencia se gestiona mediante la integración del diseño con la implementación.</w:t>
+        <w:t>En el enfoque de Arquitectura como Código (</w:t>
+      </w:r>
+      <w:proofErr w:type="spellStart"/>
+      <w:r>
+        <w:rPr>
+          <w:rFonts w:ascii="Times New Roman" w:eastAsia="Times New Roman" w:hAnsi="Times New Roman" w:cs="Times New Roman"/>
+          <w:sz w:val="24"/>
+          <w:szCs w:val="24"/>
+        </w:rPr>
+        <w:t>AaC</w:t>
+      </w:r>
+      <w:proofErr w:type="spellEnd"/>
+      <w:r>
+        <w:rPr>
+          <w:rFonts w:ascii="Times New Roman" w:eastAsia="Times New Roman" w:hAnsi="Times New Roman" w:cs="Times New Roman"/>
+          <w:sz w:val="24"/>
+          <w:szCs w:val="24"/>
+        </w:rPr>
+        <w:t>), la consistencia se gestiona mediante la integración del diseño con la implementación.</w:t>
       </w:r>
     </w:p>
     <w:p>
@@ -2848,15 +3382,51 @@
           <w:sz w:val="24"/>
           <w:szCs w:val="24"/>
         </w:rPr>
-        <w:t xml:space="preserve">Es la relación, a menudo compleja por restricciones tecnológicas, entre la arquitectura lógica (diseño teórico) y la física (hardware y código real). Dado que la infraestructura física posee muchos más detalles, enfoques como la Arquitectura como Código (AaC) buscan cerrar esta brecha integrando el diseño directamente con su implementación. </w:t>
-      </w:r>
-      <w:r>
-        <w:rPr>
-          <w:rFonts w:ascii="Times New Roman" w:eastAsia="Times New Roman" w:hAnsi="Times New Roman" w:cs="Times New Roman"/>
-          <w:sz w:val="24"/>
-          <w:szCs w:val="24"/>
-        </w:rPr>
-        <w:t>(Bucaioni et al., 2025).</w:t>
+        <w:t>Es la relación, a menudo compleja por restricciones tecnológicas, entre la arquitectura lógica (diseño teórico) y la física (hardware y código real). Dado que la infraestructura física posee muchos más detalles, enfoques como la Arquitectura como Código (</w:t>
+      </w:r>
+      <w:proofErr w:type="spellStart"/>
+      <w:r>
+        <w:rPr>
+          <w:rFonts w:ascii="Times New Roman" w:eastAsia="Times New Roman" w:hAnsi="Times New Roman" w:cs="Times New Roman"/>
+          <w:sz w:val="24"/>
+          <w:szCs w:val="24"/>
+        </w:rPr>
+        <w:t>AaC</w:t>
+      </w:r>
+      <w:proofErr w:type="spellEnd"/>
+      <w:r>
+        <w:rPr>
+          <w:rFonts w:ascii="Times New Roman" w:eastAsia="Times New Roman" w:hAnsi="Times New Roman" w:cs="Times New Roman"/>
+          <w:sz w:val="24"/>
+          <w:szCs w:val="24"/>
+        </w:rPr>
+        <w:t xml:space="preserve">) buscan cerrar esta brecha integrando el diseño directamente con su implementación. </w:t>
+      </w:r>
+      <w:r>
+        <w:rPr>
+          <w:rFonts w:ascii="Times New Roman" w:eastAsia="Times New Roman" w:hAnsi="Times New Roman" w:cs="Times New Roman"/>
+          <w:sz w:val="24"/>
+          <w:szCs w:val="24"/>
+        </w:rPr>
+        <w:t>(</w:t>
+      </w:r>
+      <w:proofErr w:type="spellStart"/>
+      <w:r>
+        <w:rPr>
+          <w:rFonts w:ascii="Times New Roman" w:eastAsia="Times New Roman" w:hAnsi="Times New Roman" w:cs="Times New Roman"/>
+          <w:sz w:val="24"/>
+          <w:szCs w:val="24"/>
+        </w:rPr>
+        <w:t>Bucaioni</w:t>
+      </w:r>
+      <w:proofErr w:type="spellEnd"/>
+      <w:r>
+        <w:rPr>
+          <w:rFonts w:ascii="Times New Roman" w:eastAsia="Times New Roman" w:hAnsi="Times New Roman" w:cs="Times New Roman"/>
+          <w:sz w:val="24"/>
+          <w:szCs w:val="24"/>
+        </w:rPr>
+        <w:t xml:space="preserve"> et al., 2025).</w:t>
       </w:r>
     </w:p>
     <w:p>
@@ -2904,7 +3474,25 @@
           <w:sz w:val="24"/>
           <w:szCs w:val="24"/>
         </w:rPr>
-        <w:t>(Bucaioni et al., 2025).</w:t>
+        <w:t>(</w:t>
+      </w:r>
+      <w:proofErr w:type="spellStart"/>
+      <w:r>
+        <w:rPr>
+          <w:rFonts w:ascii="Times New Roman" w:eastAsia="Times New Roman" w:hAnsi="Times New Roman" w:cs="Times New Roman"/>
+          <w:sz w:val="24"/>
+          <w:szCs w:val="24"/>
+        </w:rPr>
+        <w:t>Bucaioni</w:t>
+      </w:r>
+      <w:proofErr w:type="spellEnd"/>
+      <w:r>
+        <w:rPr>
+          <w:rFonts w:ascii="Times New Roman" w:eastAsia="Times New Roman" w:hAnsi="Times New Roman" w:cs="Times New Roman"/>
+          <w:sz w:val="24"/>
+          <w:szCs w:val="24"/>
+        </w:rPr>
+        <w:t xml:space="preserve"> et al., 2025).</w:t>
       </w:r>
     </w:p>
     <w:p>
@@ -3274,7 +3862,79 @@
           <w:szCs w:val="24"/>
         </w:rPr>
         <w:lastRenderedPageBreak/>
-        <w:t>El análisis y modelado de sistemas asistido por Inteligencia Artificial Generativa (IAGEN) es un proceso de abstracción que transforma información no estructurada en artefactos precisos mediante la organización de actores, escenarios y objetivos. El modelado UML se clasifica por su propósito específico: capturar requisitos funcionales a través de casos de uso, definir la ontología estática del dominio mediante diagramas estructurales, y representar la interacción dinámica de los objetos con diagramas de comportamiento. Para materializar y gestionar estos modelos, PlantUML emerge como la herramienta ideal, permitiendo documentar la narrativa como “fuente de verdad”, versionar los diagramas bajo el enfoque de “código”, y asegurar la trazabilidad mediante la vinculación directa de prompts y modelos. Finalmente, es indispensable someter todos estos artefactos a procesos de revisión de consistencia horizontal (intra-modelo) y vertical (inter-modelo) para garantizar la coherencia lógica y mitigar las alucinaciones inherentes de los LLM.</w:t>
+        <w:t xml:space="preserve">El análisis y modelado de sistemas asistido por Inteligencia Artificial Generativa (IAGEN) es un proceso de abstracción que transforma información no estructurada en artefactos precisos mediante la organización de actores, escenarios y objetivos. El modelado UML se clasifica por su propósito específico: capturar requisitos funcionales a través de casos de uso, definir la ontología estática del dominio mediante diagramas estructurales, y representar la interacción dinámica de los objetos con diagramas de comportamiento. Para materializar y gestionar estos modelos, </w:t>
+      </w:r>
+      <w:proofErr w:type="spellStart"/>
+      <w:r>
+        <w:rPr>
+          <w:rFonts w:ascii="Times New Roman" w:eastAsia="Times New Roman" w:hAnsi="Times New Roman" w:cs="Times New Roman"/>
+          <w:sz w:val="24"/>
+          <w:szCs w:val="24"/>
+        </w:rPr>
+        <w:t>PlantUML</w:t>
+      </w:r>
+      <w:proofErr w:type="spellEnd"/>
+      <w:r>
+        <w:rPr>
+          <w:rFonts w:ascii="Times New Roman" w:eastAsia="Times New Roman" w:hAnsi="Times New Roman" w:cs="Times New Roman"/>
+          <w:sz w:val="24"/>
+          <w:szCs w:val="24"/>
+        </w:rPr>
+        <w:t xml:space="preserve"> emerge como la herramienta ideal, permitiendo documentar la narrativa como “fuente de verdad”, versionar los diagramas bajo el enfoque de “código”, y asegurar la trazabilidad mediante la vinculación directa de </w:t>
+      </w:r>
+      <w:proofErr w:type="spellStart"/>
+      <w:r>
+        <w:rPr>
+          <w:rFonts w:ascii="Times New Roman" w:eastAsia="Times New Roman" w:hAnsi="Times New Roman" w:cs="Times New Roman"/>
+          <w:sz w:val="24"/>
+          <w:szCs w:val="24"/>
+        </w:rPr>
+        <w:t>prompts</w:t>
+      </w:r>
+      <w:proofErr w:type="spellEnd"/>
+      <w:r>
+        <w:rPr>
+          <w:rFonts w:ascii="Times New Roman" w:eastAsia="Times New Roman" w:hAnsi="Times New Roman" w:cs="Times New Roman"/>
+          <w:sz w:val="24"/>
+          <w:szCs w:val="24"/>
+        </w:rPr>
+        <w:t xml:space="preserve"> y modelos. Finalmente, es indispensable someter todos estos artefactos a procesos de revisión de consistencia horizontal (</w:t>
+      </w:r>
+      <w:proofErr w:type="spellStart"/>
+      <w:r>
+        <w:rPr>
+          <w:rFonts w:ascii="Times New Roman" w:eastAsia="Times New Roman" w:hAnsi="Times New Roman" w:cs="Times New Roman"/>
+          <w:sz w:val="24"/>
+          <w:szCs w:val="24"/>
+        </w:rPr>
+        <w:t>intra-modelo</w:t>
+      </w:r>
+      <w:proofErr w:type="spellEnd"/>
+      <w:r>
+        <w:rPr>
+          <w:rFonts w:ascii="Times New Roman" w:eastAsia="Times New Roman" w:hAnsi="Times New Roman" w:cs="Times New Roman"/>
+          <w:sz w:val="24"/>
+          <w:szCs w:val="24"/>
+        </w:rPr>
+        <w:t>) y vertical (</w:t>
+      </w:r>
+      <w:proofErr w:type="spellStart"/>
+      <w:r>
+        <w:rPr>
+          <w:rFonts w:ascii="Times New Roman" w:eastAsia="Times New Roman" w:hAnsi="Times New Roman" w:cs="Times New Roman"/>
+          <w:sz w:val="24"/>
+          <w:szCs w:val="24"/>
+        </w:rPr>
+        <w:t>inter-modelo</w:t>
+      </w:r>
+      <w:proofErr w:type="spellEnd"/>
+      <w:r>
+        <w:rPr>
+          <w:rFonts w:ascii="Times New Roman" w:eastAsia="Times New Roman" w:hAnsi="Times New Roman" w:cs="Times New Roman"/>
+          <w:sz w:val="24"/>
+          <w:szCs w:val="24"/>
+        </w:rPr>
+        <w:t>) para garantizar la coherencia lógica y mitigar las alucinaciones inherentes de los LLM.</w:t>
       </w:r>
     </w:p>
     <w:p>
@@ -3473,7 +4133,25 @@
           <w:sz w:val="24"/>
           <w:szCs w:val="24"/>
         </w:rPr>
-        <w:t>¿De qué manera el enfoque de “Diagramas como Código” de PlantUML facilita el control de versiones y la resolución de conflictos (fusiones automáticas) en comparación con formatos tradicionales de intercambio visual?</w:t>
+        <w:t xml:space="preserve">¿De qué manera el enfoque de “Diagramas como Código” de </w:t>
+      </w:r>
+      <w:proofErr w:type="spellStart"/>
+      <w:r>
+        <w:rPr>
+          <w:rFonts w:ascii="Times New Roman" w:eastAsia="Times New Roman" w:hAnsi="Times New Roman" w:cs="Times New Roman"/>
+          <w:sz w:val="24"/>
+          <w:szCs w:val="24"/>
+        </w:rPr>
+        <w:t>PlantUML</w:t>
+      </w:r>
+      <w:proofErr w:type="spellEnd"/>
+      <w:r>
+        <w:rPr>
+          <w:rFonts w:ascii="Times New Roman" w:eastAsia="Times New Roman" w:hAnsi="Times New Roman" w:cs="Times New Roman"/>
+          <w:sz w:val="24"/>
+          <w:szCs w:val="24"/>
+        </w:rPr>
+        <w:t xml:space="preserve"> facilita el control de versiones y la resolución de conflictos (fusiones automáticas) en comparación con formatos tradicionales de intercambio visual?</w:t>
       </w:r>
     </w:p>
     <w:p>
@@ -3494,7 +4172,25 @@
           <w:sz w:val="24"/>
           <w:szCs w:val="24"/>
         </w:rPr>
-        <w:t>Al utilizar herramientas de IA para la metodología Generative Analysis, ¿por qué sigue siendo crucial la supervisión humana en la identificación de actores o en la generación de diagramas de estado complejos?</w:t>
+        <w:t xml:space="preserve">Al utilizar herramientas de IA para la metodología Generative </w:t>
+      </w:r>
+      <w:proofErr w:type="spellStart"/>
+      <w:r>
+        <w:rPr>
+          <w:rFonts w:ascii="Times New Roman" w:eastAsia="Times New Roman" w:hAnsi="Times New Roman" w:cs="Times New Roman"/>
+          <w:sz w:val="24"/>
+          <w:szCs w:val="24"/>
+        </w:rPr>
+        <w:t>Analysis</w:t>
+      </w:r>
+      <w:proofErr w:type="spellEnd"/>
+      <w:r>
+        <w:rPr>
+          <w:rFonts w:ascii="Times New Roman" w:eastAsia="Times New Roman" w:hAnsi="Times New Roman" w:cs="Times New Roman"/>
+          <w:sz w:val="24"/>
+          <w:szCs w:val="24"/>
+        </w:rPr>
+        <w:t>, ¿por qué sigue siendo crucial la supervisión humana en la identificación de actores o en la generación de diagramas de estado complejos?</w:t>
       </w:r>
     </w:p>
     <w:p>
@@ -3516,7 +4212,43 @@
           <w:szCs w:val="24"/>
         </w:rPr>
         <w:lastRenderedPageBreak/>
-        <w:t>En el contexto de la revisión de consistencia inter-modelo y la Arquitectura como Código (AaC), ¿por qué el mapeo entre un componente lógico y la arquitectura física de despliegue no siempre resulta ser directo?</w:t>
+        <w:t xml:space="preserve">En el contexto de la revisión de consistencia </w:t>
+      </w:r>
+      <w:proofErr w:type="spellStart"/>
+      <w:r>
+        <w:rPr>
+          <w:rFonts w:ascii="Times New Roman" w:eastAsia="Times New Roman" w:hAnsi="Times New Roman" w:cs="Times New Roman"/>
+          <w:sz w:val="24"/>
+          <w:szCs w:val="24"/>
+        </w:rPr>
+        <w:t>inter-modelo</w:t>
+      </w:r>
+      <w:proofErr w:type="spellEnd"/>
+      <w:r>
+        <w:rPr>
+          <w:rFonts w:ascii="Times New Roman" w:eastAsia="Times New Roman" w:hAnsi="Times New Roman" w:cs="Times New Roman"/>
+          <w:sz w:val="24"/>
+          <w:szCs w:val="24"/>
+        </w:rPr>
+        <w:t xml:space="preserve"> y la Arquitectura como Código (</w:t>
+      </w:r>
+      <w:proofErr w:type="spellStart"/>
+      <w:r>
+        <w:rPr>
+          <w:rFonts w:ascii="Times New Roman" w:eastAsia="Times New Roman" w:hAnsi="Times New Roman" w:cs="Times New Roman"/>
+          <w:sz w:val="24"/>
+          <w:szCs w:val="24"/>
+        </w:rPr>
+        <w:t>AaC</w:t>
+      </w:r>
+      <w:proofErr w:type="spellEnd"/>
+      <w:r>
+        <w:rPr>
+          <w:rFonts w:ascii="Times New Roman" w:eastAsia="Times New Roman" w:hAnsi="Times New Roman" w:cs="Times New Roman"/>
+          <w:sz w:val="24"/>
+          <w:szCs w:val="24"/>
+        </w:rPr>
+        <w:t>), ¿por qué el mapeo entre un componente lógico y la arquitectura física de despliegue no siempre resulta ser directo?</w:t>
       </w:r>
     </w:p>
     <w:p>
@@ -3602,7 +4334,25 @@
           <w:sz w:val="24"/>
           <w:szCs w:val="24"/>
         </w:rPr>
-        <w:t>Aplicar trazabilidad y versionamiento en el modelado de requisitos.</w:t>
+        <w:t xml:space="preserve">Aplicar trazabilidad y </w:t>
+      </w:r>
+      <w:proofErr w:type="spellStart"/>
+      <w:r>
+        <w:rPr>
+          <w:rFonts w:ascii="Times New Roman" w:eastAsia="Times New Roman" w:hAnsi="Times New Roman" w:cs="Times New Roman"/>
+          <w:sz w:val="24"/>
+          <w:szCs w:val="24"/>
+        </w:rPr>
+        <w:t>versionamiento</w:t>
+      </w:r>
+      <w:proofErr w:type="spellEnd"/>
+      <w:r>
+        <w:rPr>
+          <w:rFonts w:ascii="Times New Roman" w:eastAsia="Times New Roman" w:hAnsi="Times New Roman" w:cs="Times New Roman"/>
+          <w:sz w:val="24"/>
+          <w:szCs w:val="24"/>
+        </w:rPr>
+        <w:t xml:space="preserve"> en el modelado de requisitos.</w:t>
       </w:r>
     </w:p>
     <w:p>
@@ -3641,7 +4391,25 @@
           <w:sz w:val="24"/>
           <w:szCs w:val="24"/>
         </w:rPr>
-        <w:t>Para esta actividad práctica usaremos como referencia el requisito 4 de la matriz de historias de usuario del aplicativo “Los Huertos del JuanK”, que se puede visualizar en el siguiente link:</w:t>
+        <w:t xml:space="preserve">Para esta actividad práctica usaremos como referencia el requisito 4 de la matriz de historias de usuario del aplicativo “Los Huertos del JuanK”, que se puede visualizar en el siguiente </w:t>
+      </w:r>
+      <w:proofErr w:type="gramStart"/>
+      <w:r>
+        <w:rPr>
+          <w:rFonts w:ascii="Times New Roman" w:eastAsia="Times New Roman" w:hAnsi="Times New Roman" w:cs="Times New Roman"/>
+          <w:sz w:val="24"/>
+          <w:szCs w:val="24"/>
+        </w:rPr>
+        <w:t>link</w:t>
+      </w:r>
+      <w:proofErr w:type="gramEnd"/>
+      <w:r>
+        <w:rPr>
+          <w:rFonts w:ascii="Times New Roman" w:eastAsia="Times New Roman" w:hAnsi="Times New Roman" w:cs="Times New Roman"/>
+          <w:sz w:val="24"/>
+          <w:szCs w:val="24"/>
+        </w:rPr>
+        <w:t>:</w:t>
       </w:r>
     </w:p>
     <w:p>
@@ -3900,8 +4668,16 @@
               <w:rPr>
                 <w:rFonts w:ascii="Arial" w:eastAsia="Arial" w:hAnsi="Arial" w:cs="Arial"/>
               </w:rPr>
-              <w:t>Cliente Repository</w:t>
+              <w:t xml:space="preserve">Cliente </w:t>
             </w:r>
+            <w:proofErr w:type="spellStart"/>
+            <w:r>
+              <w:rPr>
+                <w:rFonts w:ascii="Arial" w:eastAsia="Arial" w:hAnsi="Arial" w:cs="Arial"/>
+              </w:rPr>
+              <w:t>Repository</w:t>
+            </w:r>
+            <w:proofErr w:type="spellEnd"/>
           </w:p>
           <w:p>
             <w:pPr>
@@ -3912,12 +4688,26 @@
                 <w:rFonts w:ascii="Arial" w:eastAsia="Arial" w:hAnsi="Arial" w:cs="Arial"/>
               </w:rPr>
             </w:pPr>
+            <w:proofErr w:type="spellStart"/>
             <w:r>
               <w:rPr>
                 <w:rFonts w:ascii="Arial" w:eastAsia="Arial" w:hAnsi="Arial" w:cs="Arial"/>
               </w:rPr>
-              <w:t>ValidadCliente</w:t>
+              <w:t>Valida</w:t>
             </w:r>
+            <w:r>
+              <w:rPr>
+                <w:rFonts w:ascii="Arial" w:eastAsia="Arial" w:hAnsi="Arial" w:cs="Arial"/>
+              </w:rPr>
+              <w:t>r</w:t>
+            </w:r>
+            <w:r>
+              <w:rPr>
+                <w:rFonts w:ascii="Arial" w:eastAsia="Arial" w:hAnsi="Arial" w:cs="Arial"/>
+              </w:rPr>
+              <w:t>Cliente</w:t>
+            </w:r>
+            <w:proofErr w:type="spellEnd"/>
           </w:p>
         </w:tc>
       </w:tr>
@@ -3950,7 +4740,61 @@
           <w:sz w:val="24"/>
           <w:szCs w:val="24"/>
         </w:rPr>
-        <w:t>Utilice un modelo de lenguaje (ej. ChatGPT o Bing) proporcionando la proposición anterior como prompt de ingeniería para generar el código PlantUML de un Diagrama de Clases que defina la ontología básica de ese requerimiento.</w:t>
+        <w:t xml:space="preserve">Utilice un modelo de lenguaje (ej. </w:t>
+      </w:r>
+      <w:proofErr w:type="spellStart"/>
+      <w:r>
+        <w:rPr>
+          <w:rFonts w:ascii="Times New Roman" w:eastAsia="Times New Roman" w:hAnsi="Times New Roman" w:cs="Times New Roman"/>
+          <w:sz w:val="24"/>
+          <w:szCs w:val="24"/>
+        </w:rPr>
+        <w:t>ChatGPT</w:t>
+      </w:r>
+      <w:proofErr w:type="spellEnd"/>
+      <w:r>
+        <w:rPr>
+          <w:rFonts w:ascii="Times New Roman" w:eastAsia="Times New Roman" w:hAnsi="Times New Roman" w:cs="Times New Roman"/>
+          <w:sz w:val="24"/>
+          <w:szCs w:val="24"/>
+        </w:rPr>
+        <w:t xml:space="preserve"> o Bing) proporcionando la proposición anterior como </w:t>
+      </w:r>
+      <w:proofErr w:type="spellStart"/>
+      <w:r>
+        <w:rPr>
+          <w:rFonts w:ascii="Times New Roman" w:eastAsia="Times New Roman" w:hAnsi="Times New Roman" w:cs="Times New Roman"/>
+          <w:sz w:val="24"/>
+          <w:szCs w:val="24"/>
+        </w:rPr>
+        <w:t>prompt</w:t>
+      </w:r>
+      <w:proofErr w:type="spellEnd"/>
+      <w:r>
+        <w:rPr>
+          <w:rFonts w:ascii="Times New Roman" w:eastAsia="Times New Roman" w:hAnsi="Times New Roman" w:cs="Times New Roman"/>
+          <w:sz w:val="24"/>
+          <w:szCs w:val="24"/>
+        </w:rPr>
+        <w:t xml:space="preserve"> de ingeniería para generar el código </w:t>
+      </w:r>
+      <w:proofErr w:type="spellStart"/>
+      <w:r>
+        <w:rPr>
+          <w:rFonts w:ascii="Times New Roman" w:eastAsia="Times New Roman" w:hAnsi="Times New Roman" w:cs="Times New Roman"/>
+          <w:sz w:val="24"/>
+          <w:szCs w:val="24"/>
+        </w:rPr>
+        <w:t>PlantUML</w:t>
+      </w:r>
+      <w:proofErr w:type="spellEnd"/>
+      <w:r>
+        <w:rPr>
+          <w:rFonts w:ascii="Times New Roman" w:eastAsia="Times New Roman" w:hAnsi="Times New Roman" w:cs="Times New Roman"/>
+          <w:sz w:val="24"/>
+          <w:szCs w:val="24"/>
+        </w:rPr>
+        <w:t xml:space="preserve"> de un Diagrama de Clases que defina la ontología básica de ese requerimiento.</w:t>
       </w:r>
       <w:r>
         <w:rPr>
@@ -4081,7 +4925,43 @@
           <w:sz w:val="24"/>
           <w:szCs w:val="24"/>
         </w:rPr>
-        <w:t>Incorpore el prompt original explícitamente como un comentario de metadatos (utilizando /' '/) dentro del código PlantUML generado.</w:t>
+        <w:t xml:space="preserve">Incorpore el </w:t>
+      </w:r>
+      <w:proofErr w:type="spellStart"/>
+      <w:r>
+        <w:rPr>
+          <w:rFonts w:ascii="Times New Roman" w:eastAsia="Times New Roman" w:hAnsi="Times New Roman" w:cs="Times New Roman"/>
+          <w:sz w:val="24"/>
+          <w:szCs w:val="24"/>
+        </w:rPr>
+        <w:t>prompt</w:t>
+      </w:r>
+      <w:proofErr w:type="spellEnd"/>
+      <w:r>
+        <w:rPr>
+          <w:rFonts w:ascii="Times New Roman" w:eastAsia="Times New Roman" w:hAnsi="Times New Roman" w:cs="Times New Roman"/>
+          <w:sz w:val="24"/>
+          <w:szCs w:val="24"/>
+        </w:rPr>
+        <w:t xml:space="preserve"> original explícitamente como un comentario de metadatos (utilizando /' '/) dentro del código </w:t>
+      </w:r>
+      <w:proofErr w:type="spellStart"/>
+      <w:r>
+        <w:rPr>
+          <w:rFonts w:ascii="Times New Roman" w:eastAsia="Times New Roman" w:hAnsi="Times New Roman" w:cs="Times New Roman"/>
+          <w:sz w:val="24"/>
+          <w:szCs w:val="24"/>
+        </w:rPr>
+        <w:t>PlantUML</w:t>
+      </w:r>
+      <w:proofErr w:type="spellEnd"/>
+      <w:r>
+        <w:rPr>
+          <w:rFonts w:ascii="Times New Roman" w:eastAsia="Times New Roman" w:hAnsi="Times New Roman" w:cs="Times New Roman"/>
+          <w:sz w:val="24"/>
+          <w:szCs w:val="24"/>
+        </w:rPr>
+        <w:t xml:space="preserve"> generado.</w:t>
       </w:r>
     </w:p>
     <w:p>
@@ -4102,8 +4982,18 @@
           <w:sz w:val="24"/>
           <w:szCs w:val="24"/>
         </w:rPr>
-        <w:t>Guarde el archivo con extensión .</w:t>
-      </w:r>
+        <w:t xml:space="preserve">Guarde el archivo con </w:t>
+      </w:r>
+      <w:proofErr w:type="gramStart"/>
+      <w:r>
+        <w:rPr>
+          <w:rFonts w:ascii="Times New Roman" w:eastAsia="Times New Roman" w:hAnsi="Times New Roman" w:cs="Times New Roman"/>
+          <w:sz w:val="24"/>
+          <w:szCs w:val="24"/>
+        </w:rPr>
+        <w:t>extensión .</w:t>
+      </w:r>
+      <w:proofErr w:type="spellStart"/>
       <w:r>
         <w:rPr>
           <w:rFonts w:ascii="Times New Roman" w:eastAsia="Times New Roman" w:hAnsi="Times New Roman" w:cs="Times New Roman"/>
@@ -4113,6 +5003,8 @@
         </w:rPr>
         <w:t>puml</w:t>
       </w:r>
+      <w:proofErr w:type="spellEnd"/>
+      <w:proofErr w:type="gramEnd"/>
       <w:r>
         <w:rPr>
           <w:rFonts w:ascii="Times New Roman" w:eastAsia="Times New Roman" w:hAnsi="Times New Roman" w:cs="Times New Roman"/>
@@ -4434,14 +5326,36 @@
                 <w:rFonts w:ascii="Arial" w:eastAsia="Arial" w:hAnsi="Arial" w:cs="Arial"/>
               </w:rPr>
               <w:lastRenderedPageBreak/>
-              <w:t xml:space="preserve">Herramientas y Marcos: Las herramientas de IA (como ChatGPT o Bing) extraen roles desde declaraciones de visión o entrevistas. Existen marcos de trabajo que transforman las descripciones de características de usuario automáticamente en código </w:t>
+              <w:t xml:space="preserve">Herramientas y Marcos: Las herramientas de IA (como </w:t>
             </w:r>
+            <w:proofErr w:type="spellStart"/>
+            <w:r>
+              <w:rPr>
+                <w:rFonts w:ascii="Arial" w:eastAsia="Arial" w:hAnsi="Arial" w:cs="Arial"/>
+              </w:rPr>
+              <w:t>ChatGPT</w:t>
+            </w:r>
+            <w:proofErr w:type="spellEnd"/>
+            <w:r>
+              <w:rPr>
+                <w:rFonts w:ascii="Arial" w:eastAsia="Arial" w:hAnsi="Arial" w:cs="Arial"/>
+              </w:rPr>
+              <w:t xml:space="preserve"> o Bing) extraen roles desde declaraciones de visión o entrevistas. Existen marcos de trabajo que transforman las descripciones de características de usuario automáticamente en código </w:t>
+            </w:r>
+            <w:proofErr w:type="spellStart"/>
             <w:r>
               <w:rPr>
                 <w:rFonts w:ascii="Arial" w:eastAsia="Arial" w:hAnsi="Arial" w:cs="Arial"/>
               </w:rPr>
               <w:lastRenderedPageBreak/>
-              <w:t>PlantUML. Los objetivos se refinan en requisitos atómicos y sentencias “deberá”.</w:t>
+              <w:t>PlantUML</w:t>
+            </w:r>
+            <w:proofErr w:type="spellEnd"/>
+            <w:r>
+              <w:rPr>
+                <w:rFonts w:ascii="Arial" w:eastAsia="Arial" w:hAnsi="Arial" w:cs="Arial"/>
+              </w:rPr>
+              <w:t>. Los objetivos se refinan en requisitos atómicos y sentencias “deberá”.</w:t>
             </w:r>
           </w:p>
         </w:tc>
@@ -4546,7 +5460,21 @@
               <w:rPr>
                 <w:rFonts w:ascii="Arial" w:eastAsia="Arial" w:hAnsi="Arial" w:cs="Arial"/>
               </w:rPr>
-              <w:t>Precisión Estructural: Los LLM extraen entidades y acciones para generar código PlantUML. La IA es particularmente eficaz generando diagramas de clases a partir de proposiciones de texto precisas, pero actualmente tiene dificultades para proponer estados precisos y complejos.</w:t>
+              <w:t xml:space="preserve">Precisión Estructural: Los LLM extraen entidades y acciones para generar código </w:t>
+            </w:r>
+            <w:proofErr w:type="spellStart"/>
+            <w:r>
+              <w:rPr>
+                <w:rFonts w:ascii="Arial" w:eastAsia="Arial" w:hAnsi="Arial" w:cs="Arial"/>
+              </w:rPr>
+              <w:t>PlantUML</w:t>
+            </w:r>
+            <w:proofErr w:type="spellEnd"/>
+            <w:r>
+              <w:rPr>
+                <w:rFonts w:ascii="Arial" w:eastAsia="Arial" w:hAnsi="Arial" w:cs="Arial"/>
+              </w:rPr>
+              <w:t>. La IA es particularmente eficaz generando diagramas de clases a partir de proposiciones de texto precisas, pero actualmente tiene dificultades para proponer estados precisos y complejos.</w:t>
             </w:r>
           </w:p>
         </w:tc>
@@ -4570,8 +5498,30 @@
               <w:rPr>
                 <w:rFonts w:ascii="Arial" w:eastAsia="Arial" w:hAnsi="Arial" w:cs="Arial"/>
               </w:rPr>
-              <w:t>3.3. Documentación y versionamiento con PlantUML</w:t>
+              <w:t xml:space="preserve">3.3. Documentación y </w:t>
             </w:r>
+            <w:proofErr w:type="spellStart"/>
+            <w:r>
+              <w:rPr>
+                <w:rFonts w:ascii="Arial" w:eastAsia="Arial" w:hAnsi="Arial" w:cs="Arial"/>
+              </w:rPr>
+              <w:t>versionamiento</w:t>
+            </w:r>
+            <w:proofErr w:type="spellEnd"/>
+            <w:r>
+              <w:rPr>
+                <w:rFonts w:ascii="Arial" w:eastAsia="Arial" w:hAnsi="Arial" w:cs="Arial"/>
+              </w:rPr>
+              <w:t xml:space="preserve"> con </w:t>
+            </w:r>
+            <w:proofErr w:type="spellStart"/>
+            <w:r>
+              <w:rPr>
+                <w:rFonts w:ascii="Arial" w:eastAsia="Arial" w:hAnsi="Arial" w:cs="Arial"/>
+              </w:rPr>
+              <w:t>PlantUML</w:t>
+            </w:r>
+            <w:proofErr w:type="spellEnd"/>
           </w:p>
           <w:p>
             <w:pPr>
@@ -4634,7 +5584,63 @@
               <w:rPr>
                 <w:rFonts w:ascii="Arial" w:eastAsia="Arial" w:hAnsi="Arial" w:cs="Arial"/>
               </w:rPr>
-              <w:t>Diagramas como Código: Este enfoque permite la integración directa con Git, utilizando git diff para resaltar diferencias y realizar fusiones (merges) automáticas. La trazabilidad se vincula capturando el prompt generador como metadatos, y se valida multimodalmente la coherencia semántica.</w:t>
+              <w:t xml:space="preserve">Diagramas como Código: Este enfoque permite la integración directa con Git, utilizando </w:t>
+            </w:r>
+            <w:proofErr w:type="spellStart"/>
+            <w:r>
+              <w:rPr>
+                <w:rFonts w:ascii="Arial" w:eastAsia="Arial" w:hAnsi="Arial" w:cs="Arial"/>
+              </w:rPr>
+              <w:t>git</w:t>
+            </w:r>
+            <w:proofErr w:type="spellEnd"/>
+            <w:r>
+              <w:rPr>
+                <w:rFonts w:ascii="Arial" w:eastAsia="Arial" w:hAnsi="Arial" w:cs="Arial"/>
+              </w:rPr>
+              <w:t xml:space="preserve"> </w:t>
+            </w:r>
+            <w:proofErr w:type="spellStart"/>
+            <w:r>
+              <w:rPr>
+                <w:rFonts w:ascii="Arial" w:eastAsia="Arial" w:hAnsi="Arial" w:cs="Arial"/>
+              </w:rPr>
+              <w:t>diff</w:t>
+            </w:r>
+            <w:proofErr w:type="spellEnd"/>
+            <w:r>
+              <w:rPr>
+                <w:rFonts w:ascii="Arial" w:eastAsia="Arial" w:hAnsi="Arial" w:cs="Arial"/>
+              </w:rPr>
+              <w:t xml:space="preserve"> para resaltar diferencias y realizar fusiones (</w:t>
+            </w:r>
+            <w:proofErr w:type="spellStart"/>
+            <w:r>
+              <w:rPr>
+                <w:rFonts w:ascii="Arial" w:eastAsia="Arial" w:hAnsi="Arial" w:cs="Arial"/>
+              </w:rPr>
+              <w:t>merges</w:t>
+            </w:r>
+            <w:proofErr w:type="spellEnd"/>
+            <w:r>
+              <w:rPr>
+                <w:rFonts w:ascii="Arial" w:eastAsia="Arial" w:hAnsi="Arial" w:cs="Arial"/>
+              </w:rPr>
+              <w:t xml:space="preserve">) automáticas. La trazabilidad se vincula capturando el </w:t>
+            </w:r>
+            <w:proofErr w:type="spellStart"/>
+            <w:r>
+              <w:rPr>
+                <w:rFonts w:ascii="Arial" w:eastAsia="Arial" w:hAnsi="Arial" w:cs="Arial"/>
+              </w:rPr>
+              <w:t>prompt</w:t>
+            </w:r>
+            <w:proofErr w:type="spellEnd"/>
+            <w:r>
+              <w:rPr>
+                <w:rFonts w:ascii="Arial" w:eastAsia="Arial" w:hAnsi="Arial" w:cs="Arial"/>
+              </w:rPr>
+              <w:t xml:space="preserve"> generador como metadatos, y se valida multimodalmente la coherencia semántica.</w:t>
             </w:r>
           </w:p>
         </w:tc>
@@ -4678,7 +5684,35 @@
               <w:rPr>
                 <w:rFonts w:ascii="Arial" w:eastAsia="Arial" w:hAnsi="Arial" w:cs="Arial"/>
               </w:rPr>
-              <w:t>Tarea: Garantizar la coherencia horizontal (intra-modelo) e inter-modelo (vertical) frente a la naturaleza estocástica de los LLM.</w:t>
+              <w:t>Tarea: Garantizar la coherencia horizontal (</w:t>
+            </w:r>
+            <w:proofErr w:type="spellStart"/>
+            <w:r>
+              <w:rPr>
+                <w:rFonts w:ascii="Arial" w:eastAsia="Arial" w:hAnsi="Arial" w:cs="Arial"/>
+              </w:rPr>
+              <w:t>intra-modelo</w:t>
+            </w:r>
+            <w:proofErr w:type="spellEnd"/>
+            <w:r>
+              <w:rPr>
+                <w:rFonts w:ascii="Arial" w:eastAsia="Arial" w:hAnsi="Arial" w:cs="Arial"/>
+              </w:rPr>
+              <w:t xml:space="preserve">) e </w:t>
+            </w:r>
+            <w:proofErr w:type="spellStart"/>
+            <w:r>
+              <w:rPr>
+                <w:rFonts w:ascii="Arial" w:eastAsia="Arial" w:hAnsi="Arial" w:cs="Arial"/>
+              </w:rPr>
+              <w:t>inter-modelo</w:t>
+            </w:r>
+            <w:proofErr w:type="spellEnd"/>
+            <w:r>
+              <w:rPr>
+                <w:rFonts w:ascii="Arial" w:eastAsia="Arial" w:hAnsi="Arial" w:cs="Arial"/>
+              </w:rPr>
+              <w:t xml:space="preserve"> (vertical) frente a la naturaleza estocástica de los LLM.</w:t>
             </w:r>
           </w:p>
         </w:tc>
@@ -4700,7 +5734,21 @@
               <w:rPr>
                 <w:rFonts w:ascii="Arial" w:eastAsia="Arial" w:hAnsi="Arial" w:cs="Arial"/>
               </w:rPr>
-              <w:t>Detección Automática de Desviaciones: Mitigación de errores lógicos y de alucinación mediante la validación del comportamiento estructural y el monitoreo de desviaciones (drift) entre arquitecturas diseñadas y estados reales desplegados.</w:t>
+              <w:t>Detección Automática de Desviaciones: Mitigación de errores lógicos y de alucinación mediante la validación del comportamiento estructural y el monitoreo de desviaciones (</w:t>
+            </w:r>
+            <w:proofErr w:type="spellStart"/>
+            <w:r>
+              <w:rPr>
+                <w:rFonts w:ascii="Arial" w:eastAsia="Arial" w:hAnsi="Arial" w:cs="Arial"/>
+              </w:rPr>
+              <w:t>drift</w:t>
+            </w:r>
+            <w:proofErr w:type="spellEnd"/>
+            <w:r>
+              <w:rPr>
+                <w:rFonts w:ascii="Arial" w:eastAsia="Arial" w:hAnsi="Arial" w:cs="Arial"/>
+              </w:rPr>
+              <w:t>) entre arquitecturas diseñadas y estados reales desplegados.</w:t>
             </w:r>
           </w:p>
         </w:tc>
@@ -4835,7 +5883,161 @@
           <w:sz w:val="24"/>
           <w:szCs w:val="24"/>
         </w:rPr>
-        <w:t xml:space="preserve">Generative analysis: The power of generative AI for object-oriented software engineering with UML. </w:t>
+        <w:t xml:space="preserve">Generative </w:t>
+      </w:r>
+      <w:proofErr w:type="spellStart"/>
+      <w:r>
+        <w:rPr>
+          <w:rFonts w:ascii="Times New Roman" w:eastAsia="Times New Roman" w:hAnsi="Times New Roman" w:cs="Times New Roman"/>
+          <w:i/>
+          <w:iCs/>
+          <w:sz w:val="24"/>
+          <w:szCs w:val="24"/>
+        </w:rPr>
+        <w:t>analysis</w:t>
+      </w:r>
+      <w:proofErr w:type="spellEnd"/>
+      <w:r>
+        <w:rPr>
+          <w:rFonts w:ascii="Times New Roman" w:eastAsia="Times New Roman" w:hAnsi="Times New Roman" w:cs="Times New Roman"/>
+          <w:i/>
+          <w:iCs/>
+          <w:sz w:val="24"/>
+          <w:szCs w:val="24"/>
+        </w:rPr>
+        <w:t xml:space="preserve">: The </w:t>
+      </w:r>
+      <w:proofErr w:type="spellStart"/>
+      <w:r>
+        <w:rPr>
+          <w:rFonts w:ascii="Times New Roman" w:eastAsia="Times New Roman" w:hAnsi="Times New Roman" w:cs="Times New Roman"/>
+          <w:i/>
+          <w:iCs/>
+          <w:sz w:val="24"/>
+          <w:szCs w:val="24"/>
+        </w:rPr>
+        <w:t>power</w:t>
+      </w:r>
+      <w:proofErr w:type="spellEnd"/>
+      <w:r>
+        <w:rPr>
+          <w:rFonts w:ascii="Times New Roman" w:eastAsia="Times New Roman" w:hAnsi="Times New Roman" w:cs="Times New Roman"/>
+          <w:i/>
+          <w:iCs/>
+          <w:sz w:val="24"/>
+          <w:szCs w:val="24"/>
+        </w:rPr>
+        <w:t xml:space="preserve"> </w:t>
+      </w:r>
+      <w:proofErr w:type="spellStart"/>
+      <w:r>
+        <w:rPr>
+          <w:rFonts w:ascii="Times New Roman" w:eastAsia="Times New Roman" w:hAnsi="Times New Roman" w:cs="Times New Roman"/>
+          <w:i/>
+          <w:iCs/>
+          <w:sz w:val="24"/>
+          <w:szCs w:val="24"/>
+        </w:rPr>
+        <w:t>of</w:t>
+      </w:r>
+      <w:proofErr w:type="spellEnd"/>
+      <w:r>
+        <w:rPr>
+          <w:rFonts w:ascii="Times New Roman" w:eastAsia="Times New Roman" w:hAnsi="Times New Roman" w:cs="Times New Roman"/>
+          <w:i/>
+          <w:iCs/>
+          <w:sz w:val="24"/>
+          <w:szCs w:val="24"/>
+        </w:rPr>
+        <w:t xml:space="preserve"> generative AI </w:t>
+      </w:r>
+      <w:proofErr w:type="spellStart"/>
+      <w:r>
+        <w:rPr>
+          <w:rFonts w:ascii="Times New Roman" w:eastAsia="Times New Roman" w:hAnsi="Times New Roman" w:cs="Times New Roman"/>
+          <w:i/>
+          <w:iCs/>
+          <w:sz w:val="24"/>
+          <w:szCs w:val="24"/>
+        </w:rPr>
+        <w:t>for</w:t>
+      </w:r>
+      <w:proofErr w:type="spellEnd"/>
+      <w:r>
+        <w:rPr>
+          <w:rFonts w:ascii="Times New Roman" w:eastAsia="Times New Roman" w:hAnsi="Times New Roman" w:cs="Times New Roman"/>
+          <w:i/>
+          <w:iCs/>
+          <w:sz w:val="24"/>
+          <w:szCs w:val="24"/>
+        </w:rPr>
+        <w:t xml:space="preserve"> </w:t>
+      </w:r>
+      <w:proofErr w:type="spellStart"/>
+      <w:r>
+        <w:rPr>
+          <w:rFonts w:ascii="Times New Roman" w:eastAsia="Times New Roman" w:hAnsi="Times New Roman" w:cs="Times New Roman"/>
+          <w:i/>
+          <w:iCs/>
+          <w:sz w:val="24"/>
+          <w:szCs w:val="24"/>
+        </w:rPr>
+        <w:t>object-oriented</w:t>
+      </w:r>
+      <w:proofErr w:type="spellEnd"/>
+      <w:r>
+        <w:rPr>
+          <w:rFonts w:ascii="Times New Roman" w:eastAsia="Times New Roman" w:hAnsi="Times New Roman" w:cs="Times New Roman"/>
+          <w:i/>
+          <w:iCs/>
+          <w:sz w:val="24"/>
+          <w:szCs w:val="24"/>
+        </w:rPr>
+        <w:t xml:space="preserve"> software </w:t>
+      </w:r>
+      <w:proofErr w:type="spellStart"/>
+      <w:r>
+        <w:rPr>
+          <w:rFonts w:ascii="Times New Roman" w:eastAsia="Times New Roman" w:hAnsi="Times New Roman" w:cs="Times New Roman"/>
+          <w:i/>
+          <w:iCs/>
+          <w:sz w:val="24"/>
+          <w:szCs w:val="24"/>
+        </w:rPr>
+        <w:t>engineering</w:t>
+      </w:r>
+      <w:proofErr w:type="spellEnd"/>
+      <w:r>
+        <w:rPr>
+          <w:rFonts w:ascii="Times New Roman" w:eastAsia="Times New Roman" w:hAnsi="Times New Roman" w:cs="Times New Roman"/>
+          <w:i/>
+          <w:iCs/>
+          <w:sz w:val="24"/>
+          <w:szCs w:val="24"/>
+        </w:rPr>
+        <w:t xml:space="preserve"> </w:t>
+      </w:r>
+      <w:proofErr w:type="spellStart"/>
+      <w:r>
+        <w:rPr>
+          <w:rFonts w:ascii="Times New Roman" w:eastAsia="Times New Roman" w:hAnsi="Times New Roman" w:cs="Times New Roman"/>
+          <w:i/>
+          <w:iCs/>
+          <w:sz w:val="24"/>
+          <w:szCs w:val="24"/>
+        </w:rPr>
+        <w:t>with</w:t>
+      </w:r>
+      <w:proofErr w:type="spellEnd"/>
+      <w:r>
+        <w:rPr>
+          <w:rFonts w:ascii="Times New Roman" w:eastAsia="Times New Roman" w:hAnsi="Times New Roman" w:cs="Times New Roman"/>
+          <w:i/>
+          <w:iCs/>
+          <w:sz w:val="24"/>
+          <w:szCs w:val="24"/>
+        </w:rPr>
+        <w:t xml:space="preserve"> UML. </w:t>
       </w:r>
       <w:r>
         <w:rPr>
@@ -4862,17 +6064,323 @@
           <w:sz w:val="24"/>
           <w:szCs w:val="24"/>
         </w:rPr>
-        <w:t xml:space="preserve">Aslan Oğuz, E., Küster, J. M., &amp; Schildmann, F. L. (2026). Generating class diagrams from structured use case descriptions with LLMs. En </w:t>
-      </w:r>
-      <w:r>
-        <w:rPr>
-          <w:rFonts w:ascii="Times New Roman" w:eastAsia="Times New Roman" w:hAnsi="Times New Roman" w:cs="Times New Roman"/>
-          <w:i/>
-          <w:iCs/>
-          <w:sz w:val="24"/>
-          <w:szCs w:val="24"/>
-        </w:rPr>
-        <w:t xml:space="preserve">Proceedings of the 14th International Conference on Model-Based Software and Systems Engineering (MODELSWARD 2026) </w:t>
+        <w:t xml:space="preserve">Aslan Oğuz, E., </w:t>
+      </w:r>
+      <w:proofErr w:type="spellStart"/>
+      <w:r>
+        <w:rPr>
+          <w:rFonts w:ascii="Times New Roman" w:eastAsia="Times New Roman" w:hAnsi="Times New Roman" w:cs="Times New Roman"/>
+          <w:sz w:val="24"/>
+          <w:szCs w:val="24"/>
+        </w:rPr>
+        <w:t>Küster</w:t>
+      </w:r>
+      <w:proofErr w:type="spellEnd"/>
+      <w:r>
+        <w:rPr>
+          <w:rFonts w:ascii="Times New Roman" w:eastAsia="Times New Roman" w:hAnsi="Times New Roman" w:cs="Times New Roman"/>
+          <w:sz w:val="24"/>
+          <w:szCs w:val="24"/>
+        </w:rPr>
+        <w:t xml:space="preserve">, J. M., &amp; Schildmann, F. L. (2026). </w:t>
+      </w:r>
+      <w:proofErr w:type="spellStart"/>
+      <w:r>
+        <w:rPr>
+          <w:rFonts w:ascii="Times New Roman" w:eastAsia="Times New Roman" w:hAnsi="Times New Roman" w:cs="Times New Roman"/>
+          <w:sz w:val="24"/>
+          <w:szCs w:val="24"/>
+        </w:rPr>
+        <w:t>Generating</w:t>
+      </w:r>
+      <w:proofErr w:type="spellEnd"/>
+      <w:r>
+        <w:rPr>
+          <w:rFonts w:ascii="Times New Roman" w:eastAsia="Times New Roman" w:hAnsi="Times New Roman" w:cs="Times New Roman"/>
+          <w:sz w:val="24"/>
+          <w:szCs w:val="24"/>
+        </w:rPr>
+        <w:t xml:space="preserve"> </w:t>
+      </w:r>
+      <w:proofErr w:type="spellStart"/>
+      <w:r>
+        <w:rPr>
+          <w:rFonts w:ascii="Times New Roman" w:eastAsia="Times New Roman" w:hAnsi="Times New Roman" w:cs="Times New Roman"/>
+          <w:sz w:val="24"/>
+          <w:szCs w:val="24"/>
+        </w:rPr>
+        <w:t>class</w:t>
+      </w:r>
+      <w:proofErr w:type="spellEnd"/>
+      <w:r>
+        <w:rPr>
+          <w:rFonts w:ascii="Times New Roman" w:eastAsia="Times New Roman" w:hAnsi="Times New Roman" w:cs="Times New Roman"/>
+          <w:sz w:val="24"/>
+          <w:szCs w:val="24"/>
+        </w:rPr>
+        <w:t xml:space="preserve"> </w:t>
+      </w:r>
+      <w:proofErr w:type="spellStart"/>
+      <w:r>
+        <w:rPr>
+          <w:rFonts w:ascii="Times New Roman" w:eastAsia="Times New Roman" w:hAnsi="Times New Roman" w:cs="Times New Roman"/>
+          <w:sz w:val="24"/>
+          <w:szCs w:val="24"/>
+        </w:rPr>
+        <w:t>diagrams</w:t>
+      </w:r>
+      <w:proofErr w:type="spellEnd"/>
+      <w:r>
+        <w:rPr>
+          <w:rFonts w:ascii="Times New Roman" w:eastAsia="Times New Roman" w:hAnsi="Times New Roman" w:cs="Times New Roman"/>
+          <w:sz w:val="24"/>
+          <w:szCs w:val="24"/>
+        </w:rPr>
+        <w:t xml:space="preserve"> </w:t>
+      </w:r>
+      <w:proofErr w:type="spellStart"/>
+      <w:r>
+        <w:rPr>
+          <w:rFonts w:ascii="Times New Roman" w:eastAsia="Times New Roman" w:hAnsi="Times New Roman" w:cs="Times New Roman"/>
+          <w:sz w:val="24"/>
+          <w:szCs w:val="24"/>
+        </w:rPr>
+        <w:t>from</w:t>
+      </w:r>
+      <w:proofErr w:type="spellEnd"/>
+      <w:r>
+        <w:rPr>
+          <w:rFonts w:ascii="Times New Roman" w:eastAsia="Times New Roman" w:hAnsi="Times New Roman" w:cs="Times New Roman"/>
+          <w:sz w:val="24"/>
+          <w:szCs w:val="24"/>
+        </w:rPr>
+        <w:t xml:space="preserve"> </w:t>
+      </w:r>
+      <w:proofErr w:type="spellStart"/>
+      <w:r>
+        <w:rPr>
+          <w:rFonts w:ascii="Times New Roman" w:eastAsia="Times New Roman" w:hAnsi="Times New Roman" w:cs="Times New Roman"/>
+          <w:sz w:val="24"/>
+          <w:szCs w:val="24"/>
+        </w:rPr>
+        <w:t>structured</w:t>
+      </w:r>
+      <w:proofErr w:type="spellEnd"/>
+      <w:r>
+        <w:rPr>
+          <w:rFonts w:ascii="Times New Roman" w:eastAsia="Times New Roman" w:hAnsi="Times New Roman" w:cs="Times New Roman"/>
+          <w:sz w:val="24"/>
+          <w:szCs w:val="24"/>
+        </w:rPr>
+        <w:t xml:space="preserve"> use case </w:t>
+      </w:r>
+      <w:proofErr w:type="spellStart"/>
+      <w:r>
+        <w:rPr>
+          <w:rFonts w:ascii="Times New Roman" w:eastAsia="Times New Roman" w:hAnsi="Times New Roman" w:cs="Times New Roman"/>
+          <w:sz w:val="24"/>
+          <w:szCs w:val="24"/>
+        </w:rPr>
+        <w:t>descriptions</w:t>
+      </w:r>
+      <w:proofErr w:type="spellEnd"/>
+      <w:r>
+        <w:rPr>
+          <w:rFonts w:ascii="Times New Roman" w:eastAsia="Times New Roman" w:hAnsi="Times New Roman" w:cs="Times New Roman"/>
+          <w:sz w:val="24"/>
+          <w:szCs w:val="24"/>
+        </w:rPr>
+        <w:t xml:space="preserve"> </w:t>
+      </w:r>
+      <w:proofErr w:type="spellStart"/>
+      <w:r>
+        <w:rPr>
+          <w:rFonts w:ascii="Times New Roman" w:eastAsia="Times New Roman" w:hAnsi="Times New Roman" w:cs="Times New Roman"/>
+          <w:sz w:val="24"/>
+          <w:szCs w:val="24"/>
+        </w:rPr>
+        <w:t>with</w:t>
+      </w:r>
+      <w:proofErr w:type="spellEnd"/>
+      <w:r>
+        <w:rPr>
+          <w:rFonts w:ascii="Times New Roman" w:eastAsia="Times New Roman" w:hAnsi="Times New Roman" w:cs="Times New Roman"/>
+          <w:sz w:val="24"/>
+          <w:szCs w:val="24"/>
+        </w:rPr>
+        <w:t xml:space="preserve"> </w:t>
+      </w:r>
+      <w:proofErr w:type="spellStart"/>
+      <w:r>
+        <w:rPr>
+          <w:rFonts w:ascii="Times New Roman" w:eastAsia="Times New Roman" w:hAnsi="Times New Roman" w:cs="Times New Roman"/>
+          <w:sz w:val="24"/>
+          <w:szCs w:val="24"/>
+        </w:rPr>
+        <w:t>LLMs</w:t>
+      </w:r>
+      <w:proofErr w:type="spellEnd"/>
+      <w:r>
+        <w:rPr>
+          <w:rFonts w:ascii="Times New Roman" w:eastAsia="Times New Roman" w:hAnsi="Times New Roman" w:cs="Times New Roman"/>
+          <w:sz w:val="24"/>
+          <w:szCs w:val="24"/>
+        </w:rPr>
+        <w:t xml:space="preserve">. En </w:t>
+      </w:r>
+      <w:proofErr w:type="spellStart"/>
+      <w:r>
+        <w:rPr>
+          <w:rFonts w:ascii="Times New Roman" w:eastAsia="Times New Roman" w:hAnsi="Times New Roman" w:cs="Times New Roman"/>
+          <w:i/>
+          <w:iCs/>
+          <w:sz w:val="24"/>
+          <w:szCs w:val="24"/>
+        </w:rPr>
+        <w:t>Proceedings</w:t>
+      </w:r>
+      <w:proofErr w:type="spellEnd"/>
+      <w:r>
+        <w:rPr>
+          <w:rFonts w:ascii="Times New Roman" w:eastAsia="Times New Roman" w:hAnsi="Times New Roman" w:cs="Times New Roman"/>
+          <w:i/>
+          <w:iCs/>
+          <w:sz w:val="24"/>
+          <w:szCs w:val="24"/>
+        </w:rPr>
+        <w:t xml:space="preserve"> </w:t>
+      </w:r>
+      <w:proofErr w:type="spellStart"/>
+      <w:r>
+        <w:rPr>
+          <w:rFonts w:ascii="Times New Roman" w:eastAsia="Times New Roman" w:hAnsi="Times New Roman" w:cs="Times New Roman"/>
+          <w:i/>
+          <w:iCs/>
+          <w:sz w:val="24"/>
+          <w:szCs w:val="24"/>
+        </w:rPr>
+        <w:t>of</w:t>
+      </w:r>
+      <w:proofErr w:type="spellEnd"/>
+      <w:r>
+        <w:rPr>
+          <w:rFonts w:ascii="Times New Roman" w:eastAsia="Times New Roman" w:hAnsi="Times New Roman" w:cs="Times New Roman"/>
+          <w:i/>
+          <w:iCs/>
+          <w:sz w:val="24"/>
+          <w:szCs w:val="24"/>
+        </w:rPr>
+        <w:t xml:space="preserve"> </w:t>
+      </w:r>
+      <w:proofErr w:type="spellStart"/>
+      <w:r>
+        <w:rPr>
+          <w:rFonts w:ascii="Times New Roman" w:eastAsia="Times New Roman" w:hAnsi="Times New Roman" w:cs="Times New Roman"/>
+          <w:i/>
+          <w:iCs/>
+          <w:sz w:val="24"/>
+          <w:szCs w:val="24"/>
+        </w:rPr>
+        <w:t>the</w:t>
+      </w:r>
+      <w:proofErr w:type="spellEnd"/>
+      <w:r>
+        <w:rPr>
+          <w:rFonts w:ascii="Times New Roman" w:eastAsia="Times New Roman" w:hAnsi="Times New Roman" w:cs="Times New Roman"/>
+          <w:i/>
+          <w:iCs/>
+          <w:sz w:val="24"/>
+          <w:szCs w:val="24"/>
+        </w:rPr>
+        <w:t xml:space="preserve"> 14th International </w:t>
+      </w:r>
+      <w:proofErr w:type="spellStart"/>
+      <w:r>
+        <w:rPr>
+          <w:rFonts w:ascii="Times New Roman" w:eastAsia="Times New Roman" w:hAnsi="Times New Roman" w:cs="Times New Roman"/>
+          <w:i/>
+          <w:iCs/>
+          <w:sz w:val="24"/>
+          <w:szCs w:val="24"/>
+        </w:rPr>
+        <w:t>Conference</w:t>
+      </w:r>
+      <w:proofErr w:type="spellEnd"/>
+      <w:r>
+        <w:rPr>
+          <w:rFonts w:ascii="Times New Roman" w:eastAsia="Times New Roman" w:hAnsi="Times New Roman" w:cs="Times New Roman"/>
+          <w:i/>
+          <w:iCs/>
+          <w:sz w:val="24"/>
+          <w:szCs w:val="24"/>
+        </w:rPr>
+        <w:t xml:space="preserve"> </w:t>
+      </w:r>
+      <w:proofErr w:type="spellStart"/>
+      <w:r>
+        <w:rPr>
+          <w:rFonts w:ascii="Times New Roman" w:eastAsia="Times New Roman" w:hAnsi="Times New Roman" w:cs="Times New Roman"/>
+          <w:i/>
+          <w:iCs/>
+          <w:sz w:val="24"/>
+          <w:szCs w:val="24"/>
+        </w:rPr>
+        <w:t>on</w:t>
+      </w:r>
+      <w:proofErr w:type="spellEnd"/>
+      <w:r>
+        <w:rPr>
+          <w:rFonts w:ascii="Times New Roman" w:eastAsia="Times New Roman" w:hAnsi="Times New Roman" w:cs="Times New Roman"/>
+          <w:i/>
+          <w:iCs/>
+          <w:sz w:val="24"/>
+          <w:szCs w:val="24"/>
+        </w:rPr>
+        <w:t xml:space="preserve"> Model-Based Software and </w:t>
+      </w:r>
+      <w:proofErr w:type="spellStart"/>
+      <w:r>
+        <w:rPr>
+          <w:rFonts w:ascii="Times New Roman" w:eastAsia="Times New Roman" w:hAnsi="Times New Roman" w:cs="Times New Roman"/>
+          <w:i/>
+          <w:iCs/>
+          <w:sz w:val="24"/>
+          <w:szCs w:val="24"/>
+        </w:rPr>
+        <w:t>Systems</w:t>
+      </w:r>
+      <w:proofErr w:type="spellEnd"/>
+      <w:r>
+        <w:rPr>
+          <w:rFonts w:ascii="Times New Roman" w:eastAsia="Times New Roman" w:hAnsi="Times New Roman" w:cs="Times New Roman"/>
+          <w:i/>
+          <w:iCs/>
+          <w:sz w:val="24"/>
+          <w:szCs w:val="24"/>
+        </w:rPr>
+        <w:t xml:space="preserve"> </w:t>
+      </w:r>
+      <w:proofErr w:type="spellStart"/>
+      <w:r>
+        <w:rPr>
+          <w:rFonts w:ascii="Times New Roman" w:eastAsia="Times New Roman" w:hAnsi="Times New Roman" w:cs="Times New Roman"/>
+          <w:i/>
+          <w:iCs/>
+          <w:sz w:val="24"/>
+          <w:szCs w:val="24"/>
+        </w:rPr>
+        <w:t>Engineering</w:t>
+      </w:r>
+      <w:proofErr w:type="spellEnd"/>
+      <w:r>
+        <w:rPr>
+          <w:rFonts w:ascii="Times New Roman" w:eastAsia="Times New Roman" w:hAnsi="Times New Roman" w:cs="Times New Roman"/>
+          <w:i/>
+          <w:iCs/>
+          <w:sz w:val="24"/>
+          <w:szCs w:val="24"/>
+        </w:rPr>
+        <w:t xml:space="preserve"> (MODELSWARD 2026) </w:t>
       </w:r>
       <w:r>
         <w:rPr>
@@ -4899,25 +6407,325 @@
           <w:sz w:val="24"/>
           <w:szCs w:val="24"/>
         </w:rPr>
-        <w:t xml:space="preserve">Bates, A., Vavricka, R., Carleton, S., Shao, R., &amp; Pan, C. (2025). Unified modeling language code generation from diagram images using multimodal large language models. </w:t>
-      </w:r>
-      <w:r>
-        <w:rPr>
-          <w:rFonts w:ascii="Times New Roman" w:eastAsia="Times New Roman" w:hAnsi="Times New Roman" w:cs="Times New Roman"/>
-          <w:i/>
-          <w:iCs/>
-          <w:sz w:val="24"/>
-          <w:szCs w:val="24"/>
-        </w:rPr>
-        <w:t xml:space="preserve">Machine Learning with Applications, </w:t>
-      </w:r>
-      <w:r>
-        <w:rPr>
-          <w:rFonts w:ascii="Times New Roman" w:eastAsia="Times New Roman" w:hAnsi="Times New Roman" w:cs="Times New Roman"/>
-          <w:sz w:val="24"/>
-          <w:szCs w:val="24"/>
-        </w:rPr>
-        <w:t>20, Article 100660. https://doi.org/10.1016/j.mlwa.2025.100660</w:t>
+        <w:t xml:space="preserve">Bates, A., Vavricka, R., Carleton, S., Shao, R., &amp; Pan, C. (2025). </w:t>
+      </w:r>
+      <w:proofErr w:type="spellStart"/>
+      <w:r>
+        <w:rPr>
+          <w:rFonts w:ascii="Times New Roman" w:eastAsia="Times New Roman" w:hAnsi="Times New Roman" w:cs="Times New Roman"/>
+          <w:sz w:val="24"/>
+          <w:szCs w:val="24"/>
+        </w:rPr>
+        <w:t>Unified</w:t>
+      </w:r>
+      <w:proofErr w:type="spellEnd"/>
+      <w:r>
+        <w:rPr>
+          <w:rFonts w:ascii="Times New Roman" w:eastAsia="Times New Roman" w:hAnsi="Times New Roman" w:cs="Times New Roman"/>
+          <w:sz w:val="24"/>
+          <w:szCs w:val="24"/>
+        </w:rPr>
+        <w:t xml:space="preserve"> </w:t>
+      </w:r>
+      <w:proofErr w:type="spellStart"/>
+      <w:r>
+        <w:rPr>
+          <w:rFonts w:ascii="Times New Roman" w:eastAsia="Times New Roman" w:hAnsi="Times New Roman" w:cs="Times New Roman"/>
+          <w:sz w:val="24"/>
+          <w:szCs w:val="24"/>
+        </w:rPr>
+        <w:t>modeling</w:t>
+      </w:r>
+      <w:proofErr w:type="spellEnd"/>
+      <w:r>
+        <w:rPr>
+          <w:rFonts w:ascii="Times New Roman" w:eastAsia="Times New Roman" w:hAnsi="Times New Roman" w:cs="Times New Roman"/>
+          <w:sz w:val="24"/>
+          <w:szCs w:val="24"/>
+        </w:rPr>
+        <w:t xml:space="preserve"> </w:t>
+      </w:r>
+      <w:proofErr w:type="spellStart"/>
+      <w:r>
+        <w:rPr>
+          <w:rFonts w:ascii="Times New Roman" w:eastAsia="Times New Roman" w:hAnsi="Times New Roman" w:cs="Times New Roman"/>
+          <w:sz w:val="24"/>
+          <w:szCs w:val="24"/>
+        </w:rPr>
+        <w:t>language</w:t>
+      </w:r>
+      <w:proofErr w:type="spellEnd"/>
+      <w:r>
+        <w:rPr>
+          <w:rFonts w:ascii="Times New Roman" w:eastAsia="Times New Roman" w:hAnsi="Times New Roman" w:cs="Times New Roman"/>
+          <w:sz w:val="24"/>
+          <w:szCs w:val="24"/>
+        </w:rPr>
+        <w:t xml:space="preserve"> </w:t>
+      </w:r>
+      <w:proofErr w:type="spellStart"/>
+      <w:r>
+        <w:rPr>
+          <w:rFonts w:ascii="Times New Roman" w:eastAsia="Times New Roman" w:hAnsi="Times New Roman" w:cs="Times New Roman"/>
+          <w:sz w:val="24"/>
+          <w:szCs w:val="24"/>
+        </w:rPr>
+        <w:t>code</w:t>
+      </w:r>
+      <w:proofErr w:type="spellEnd"/>
+      <w:r>
+        <w:rPr>
+          <w:rFonts w:ascii="Times New Roman" w:eastAsia="Times New Roman" w:hAnsi="Times New Roman" w:cs="Times New Roman"/>
+          <w:sz w:val="24"/>
+          <w:szCs w:val="24"/>
+        </w:rPr>
+        <w:t xml:space="preserve"> </w:t>
+      </w:r>
+      <w:proofErr w:type="spellStart"/>
+      <w:r>
+        <w:rPr>
+          <w:rFonts w:ascii="Times New Roman" w:eastAsia="Times New Roman" w:hAnsi="Times New Roman" w:cs="Times New Roman"/>
+          <w:sz w:val="24"/>
+          <w:szCs w:val="24"/>
+        </w:rPr>
+        <w:t>generation</w:t>
+      </w:r>
+      <w:proofErr w:type="spellEnd"/>
+      <w:r>
+        <w:rPr>
+          <w:rFonts w:ascii="Times New Roman" w:eastAsia="Times New Roman" w:hAnsi="Times New Roman" w:cs="Times New Roman"/>
+          <w:sz w:val="24"/>
+          <w:szCs w:val="24"/>
+        </w:rPr>
+        <w:t xml:space="preserve"> </w:t>
+      </w:r>
+      <w:proofErr w:type="spellStart"/>
+      <w:r>
+        <w:rPr>
+          <w:rFonts w:ascii="Times New Roman" w:eastAsia="Times New Roman" w:hAnsi="Times New Roman" w:cs="Times New Roman"/>
+          <w:sz w:val="24"/>
+          <w:szCs w:val="24"/>
+        </w:rPr>
+        <w:t>from</w:t>
+      </w:r>
+      <w:proofErr w:type="spellEnd"/>
+      <w:r>
+        <w:rPr>
+          <w:rFonts w:ascii="Times New Roman" w:eastAsia="Times New Roman" w:hAnsi="Times New Roman" w:cs="Times New Roman"/>
+          <w:sz w:val="24"/>
+          <w:szCs w:val="24"/>
+        </w:rPr>
+        <w:t xml:space="preserve"> </w:t>
+      </w:r>
+      <w:proofErr w:type="spellStart"/>
+      <w:r>
+        <w:rPr>
+          <w:rFonts w:ascii="Times New Roman" w:eastAsia="Times New Roman" w:hAnsi="Times New Roman" w:cs="Times New Roman"/>
+          <w:sz w:val="24"/>
+          <w:szCs w:val="24"/>
+        </w:rPr>
+        <w:t>diagram</w:t>
+      </w:r>
+      <w:proofErr w:type="spellEnd"/>
+      <w:r>
+        <w:rPr>
+          <w:rFonts w:ascii="Times New Roman" w:eastAsia="Times New Roman" w:hAnsi="Times New Roman" w:cs="Times New Roman"/>
+          <w:sz w:val="24"/>
+          <w:szCs w:val="24"/>
+        </w:rPr>
+        <w:t xml:space="preserve"> </w:t>
+      </w:r>
+      <w:proofErr w:type="spellStart"/>
+      <w:r>
+        <w:rPr>
+          <w:rFonts w:ascii="Times New Roman" w:eastAsia="Times New Roman" w:hAnsi="Times New Roman" w:cs="Times New Roman"/>
+          <w:sz w:val="24"/>
+          <w:szCs w:val="24"/>
+        </w:rPr>
+        <w:t>images</w:t>
+      </w:r>
+      <w:proofErr w:type="spellEnd"/>
+      <w:r>
+        <w:rPr>
+          <w:rFonts w:ascii="Times New Roman" w:eastAsia="Times New Roman" w:hAnsi="Times New Roman" w:cs="Times New Roman"/>
+          <w:sz w:val="24"/>
+          <w:szCs w:val="24"/>
+        </w:rPr>
+        <w:t xml:space="preserve"> </w:t>
+      </w:r>
+      <w:proofErr w:type="spellStart"/>
+      <w:r>
+        <w:rPr>
+          <w:rFonts w:ascii="Times New Roman" w:eastAsia="Times New Roman" w:hAnsi="Times New Roman" w:cs="Times New Roman"/>
+          <w:sz w:val="24"/>
+          <w:szCs w:val="24"/>
+        </w:rPr>
+        <w:t>using</w:t>
+      </w:r>
+      <w:proofErr w:type="spellEnd"/>
+      <w:r>
+        <w:rPr>
+          <w:rFonts w:ascii="Times New Roman" w:eastAsia="Times New Roman" w:hAnsi="Times New Roman" w:cs="Times New Roman"/>
+          <w:sz w:val="24"/>
+          <w:szCs w:val="24"/>
+        </w:rPr>
+        <w:t xml:space="preserve"> multimodal </w:t>
+      </w:r>
+      <w:proofErr w:type="spellStart"/>
+      <w:r>
+        <w:rPr>
+          <w:rFonts w:ascii="Times New Roman" w:eastAsia="Times New Roman" w:hAnsi="Times New Roman" w:cs="Times New Roman"/>
+          <w:sz w:val="24"/>
+          <w:szCs w:val="24"/>
+        </w:rPr>
+        <w:t>large</w:t>
+      </w:r>
+      <w:proofErr w:type="spellEnd"/>
+      <w:r>
+        <w:rPr>
+          <w:rFonts w:ascii="Times New Roman" w:eastAsia="Times New Roman" w:hAnsi="Times New Roman" w:cs="Times New Roman"/>
+          <w:sz w:val="24"/>
+          <w:szCs w:val="24"/>
+        </w:rPr>
+        <w:t xml:space="preserve"> </w:t>
+      </w:r>
+      <w:proofErr w:type="spellStart"/>
+      <w:r>
+        <w:rPr>
+          <w:rFonts w:ascii="Times New Roman" w:eastAsia="Times New Roman" w:hAnsi="Times New Roman" w:cs="Times New Roman"/>
+          <w:sz w:val="24"/>
+          <w:szCs w:val="24"/>
+        </w:rPr>
+        <w:t>language</w:t>
+      </w:r>
+      <w:proofErr w:type="spellEnd"/>
+      <w:r>
+        <w:rPr>
+          <w:rFonts w:ascii="Times New Roman" w:eastAsia="Times New Roman" w:hAnsi="Times New Roman" w:cs="Times New Roman"/>
+          <w:sz w:val="24"/>
+          <w:szCs w:val="24"/>
+        </w:rPr>
+        <w:t xml:space="preserve"> </w:t>
+      </w:r>
+      <w:proofErr w:type="spellStart"/>
+      <w:r>
+        <w:rPr>
+          <w:rFonts w:ascii="Times New Roman" w:eastAsia="Times New Roman" w:hAnsi="Times New Roman" w:cs="Times New Roman"/>
+          <w:sz w:val="24"/>
+          <w:szCs w:val="24"/>
+        </w:rPr>
+        <w:t>models</w:t>
+      </w:r>
+      <w:proofErr w:type="spellEnd"/>
+      <w:r>
+        <w:rPr>
+          <w:rFonts w:ascii="Times New Roman" w:eastAsia="Times New Roman" w:hAnsi="Times New Roman" w:cs="Times New Roman"/>
+          <w:sz w:val="24"/>
+          <w:szCs w:val="24"/>
+        </w:rPr>
+        <w:t xml:space="preserve">. </w:t>
+      </w:r>
+      <w:r>
+        <w:rPr>
+          <w:rFonts w:ascii="Times New Roman" w:eastAsia="Times New Roman" w:hAnsi="Times New Roman" w:cs="Times New Roman"/>
+          <w:i/>
+          <w:iCs/>
+          <w:sz w:val="24"/>
+          <w:szCs w:val="24"/>
+        </w:rPr>
+        <w:t xml:space="preserve">Machine </w:t>
+      </w:r>
+      <w:proofErr w:type="spellStart"/>
+      <w:r>
+        <w:rPr>
+          <w:rFonts w:ascii="Times New Roman" w:eastAsia="Times New Roman" w:hAnsi="Times New Roman" w:cs="Times New Roman"/>
+          <w:i/>
+          <w:iCs/>
+          <w:sz w:val="24"/>
+          <w:szCs w:val="24"/>
+        </w:rPr>
+        <w:t>Learning</w:t>
+      </w:r>
+      <w:proofErr w:type="spellEnd"/>
+      <w:r>
+        <w:rPr>
+          <w:rFonts w:ascii="Times New Roman" w:eastAsia="Times New Roman" w:hAnsi="Times New Roman" w:cs="Times New Roman"/>
+          <w:i/>
+          <w:iCs/>
+          <w:sz w:val="24"/>
+          <w:szCs w:val="24"/>
+        </w:rPr>
+        <w:t xml:space="preserve"> </w:t>
+      </w:r>
+      <w:proofErr w:type="spellStart"/>
+      <w:r>
+        <w:rPr>
+          <w:rFonts w:ascii="Times New Roman" w:eastAsia="Times New Roman" w:hAnsi="Times New Roman" w:cs="Times New Roman"/>
+          <w:i/>
+          <w:iCs/>
+          <w:sz w:val="24"/>
+          <w:szCs w:val="24"/>
+        </w:rPr>
+        <w:t>with</w:t>
+      </w:r>
+      <w:proofErr w:type="spellEnd"/>
+      <w:r>
+        <w:rPr>
+          <w:rFonts w:ascii="Times New Roman" w:eastAsia="Times New Roman" w:hAnsi="Times New Roman" w:cs="Times New Roman"/>
+          <w:i/>
+          <w:iCs/>
+          <w:sz w:val="24"/>
+          <w:szCs w:val="24"/>
+        </w:rPr>
+        <w:t xml:space="preserve"> </w:t>
+      </w:r>
+      <w:proofErr w:type="spellStart"/>
+      <w:r>
+        <w:rPr>
+          <w:rFonts w:ascii="Times New Roman" w:eastAsia="Times New Roman" w:hAnsi="Times New Roman" w:cs="Times New Roman"/>
+          <w:i/>
+          <w:iCs/>
+          <w:sz w:val="24"/>
+          <w:szCs w:val="24"/>
+        </w:rPr>
+        <w:t>Applications</w:t>
+      </w:r>
+      <w:proofErr w:type="spellEnd"/>
+      <w:r>
+        <w:rPr>
+          <w:rFonts w:ascii="Times New Roman" w:eastAsia="Times New Roman" w:hAnsi="Times New Roman" w:cs="Times New Roman"/>
+          <w:i/>
+          <w:iCs/>
+          <w:sz w:val="24"/>
+          <w:szCs w:val="24"/>
+        </w:rPr>
+        <w:t xml:space="preserve">, </w:t>
+      </w:r>
+      <w:r>
+        <w:rPr>
+          <w:rFonts w:ascii="Times New Roman" w:eastAsia="Times New Roman" w:hAnsi="Times New Roman" w:cs="Times New Roman"/>
+          <w:sz w:val="24"/>
+          <w:szCs w:val="24"/>
+        </w:rPr>
+        <w:t xml:space="preserve">20, </w:t>
+      </w:r>
+      <w:proofErr w:type="spellStart"/>
+      <w:r>
+        <w:rPr>
+          <w:rFonts w:ascii="Times New Roman" w:eastAsia="Times New Roman" w:hAnsi="Times New Roman" w:cs="Times New Roman"/>
+          <w:sz w:val="24"/>
+          <w:szCs w:val="24"/>
+        </w:rPr>
+        <w:t>Article</w:t>
+      </w:r>
+      <w:proofErr w:type="spellEnd"/>
+      <w:r>
+        <w:rPr>
+          <w:rFonts w:ascii="Times New Roman" w:eastAsia="Times New Roman" w:hAnsi="Times New Roman" w:cs="Times New Roman"/>
+          <w:sz w:val="24"/>
+          <w:szCs w:val="24"/>
+        </w:rPr>
+        <w:t xml:space="preserve"> 100660. https://doi.org/10.1016/j.mlwa.2025.100660</w:t>
       </w:r>
     </w:p>
     <w:p>
@@ -4936,17 +6744,175 @@
           <w:sz w:val="24"/>
           <w:szCs w:val="24"/>
         </w:rPr>
-        <w:t xml:space="preserve">Bucaioni, A., Di Salle, A., Iovino, L., Pelliccione, P., &amp; Raimondi, F. (2025). Architecture as code. En </w:t>
-      </w:r>
-      <w:r>
-        <w:rPr>
-          <w:rFonts w:ascii="Times New Roman" w:eastAsia="Times New Roman" w:hAnsi="Times New Roman" w:cs="Times New Roman"/>
-          <w:i/>
-          <w:iCs/>
-          <w:sz w:val="24"/>
-          <w:szCs w:val="24"/>
-        </w:rPr>
-        <w:t xml:space="preserve">Proceedings of the 2025 IEEE 22nd International Conference on Software Architecture (ICSA) </w:t>
+        <w:t xml:space="preserve">Bucaioni, A., Di Salle, A., Iovino, L., Pelliccione, P., &amp; Raimondi, F. (2025). </w:t>
+      </w:r>
+      <w:proofErr w:type="spellStart"/>
+      <w:r>
+        <w:rPr>
+          <w:rFonts w:ascii="Times New Roman" w:eastAsia="Times New Roman" w:hAnsi="Times New Roman" w:cs="Times New Roman"/>
+          <w:sz w:val="24"/>
+          <w:szCs w:val="24"/>
+        </w:rPr>
+        <w:t>Architecture</w:t>
+      </w:r>
+      <w:proofErr w:type="spellEnd"/>
+      <w:r>
+        <w:rPr>
+          <w:rFonts w:ascii="Times New Roman" w:eastAsia="Times New Roman" w:hAnsi="Times New Roman" w:cs="Times New Roman"/>
+          <w:sz w:val="24"/>
+          <w:szCs w:val="24"/>
+        </w:rPr>
+        <w:t xml:space="preserve"> as </w:t>
+      </w:r>
+      <w:proofErr w:type="spellStart"/>
+      <w:r>
+        <w:rPr>
+          <w:rFonts w:ascii="Times New Roman" w:eastAsia="Times New Roman" w:hAnsi="Times New Roman" w:cs="Times New Roman"/>
+          <w:sz w:val="24"/>
+          <w:szCs w:val="24"/>
+        </w:rPr>
+        <w:t>code</w:t>
+      </w:r>
+      <w:proofErr w:type="spellEnd"/>
+      <w:r>
+        <w:rPr>
+          <w:rFonts w:ascii="Times New Roman" w:eastAsia="Times New Roman" w:hAnsi="Times New Roman" w:cs="Times New Roman"/>
+          <w:sz w:val="24"/>
+          <w:szCs w:val="24"/>
+        </w:rPr>
+        <w:t xml:space="preserve">. En </w:t>
+      </w:r>
+      <w:proofErr w:type="spellStart"/>
+      <w:r>
+        <w:rPr>
+          <w:rFonts w:ascii="Times New Roman" w:eastAsia="Times New Roman" w:hAnsi="Times New Roman" w:cs="Times New Roman"/>
+          <w:i/>
+          <w:iCs/>
+          <w:sz w:val="24"/>
+          <w:szCs w:val="24"/>
+        </w:rPr>
+        <w:t>Proceedings</w:t>
+      </w:r>
+      <w:proofErr w:type="spellEnd"/>
+      <w:r>
+        <w:rPr>
+          <w:rFonts w:ascii="Times New Roman" w:eastAsia="Times New Roman" w:hAnsi="Times New Roman" w:cs="Times New Roman"/>
+          <w:i/>
+          <w:iCs/>
+          <w:sz w:val="24"/>
+          <w:szCs w:val="24"/>
+        </w:rPr>
+        <w:t xml:space="preserve"> </w:t>
+      </w:r>
+      <w:proofErr w:type="spellStart"/>
+      <w:r>
+        <w:rPr>
+          <w:rFonts w:ascii="Times New Roman" w:eastAsia="Times New Roman" w:hAnsi="Times New Roman" w:cs="Times New Roman"/>
+          <w:i/>
+          <w:iCs/>
+          <w:sz w:val="24"/>
+          <w:szCs w:val="24"/>
+        </w:rPr>
+        <w:t>of</w:t>
+      </w:r>
+      <w:proofErr w:type="spellEnd"/>
+      <w:r>
+        <w:rPr>
+          <w:rFonts w:ascii="Times New Roman" w:eastAsia="Times New Roman" w:hAnsi="Times New Roman" w:cs="Times New Roman"/>
+          <w:i/>
+          <w:iCs/>
+          <w:sz w:val="24"/>
+          <w:szCs w:val="24"/>
+        </w:rPr>
+        <w:t xml:space="preserve"> </w:t>
+      </w:r>
+      <w:proofErr w:type="spellStart"/>
+      <w:r>
+        <w:rPr>
+          <w:rFonts w:ascii="Times New Roman" w:eastAsia="Times New Roman" w:hAnsi="Times New Roman" w:cs="Times New Roman"/>
+          <w:i/>
+          <w:iCs/>
+          <w:sz w:val="24"/>
+          <w:szCs w:val="24"/>
+        </w:rPr>
+        <w:t>the</w:t>
+      </w:r>
+      <w:proofErr w:type="spellEnd"/>
+      <w:r>
+        <w:rPr>
+          <w:rFonts w:ascii="Times New Roman" w:eastAsia="Times New Roman" w:hAnsi="Times New Roman" w:cs="Times New Roman"/>
+          <w:i/>
+          <w:iCs/>
+          <w:sz w:val="24"/>
+          <w:szCs w:val="24"/>
+        </w:rPr>
+        <w:t xml:space="preserve"> 2025 IEEE 22nd International </w:t>
+      </w:r>
+      <w:proofErr w:type="spellStart"/>
+      <w:r>
+        <w:rPr>
+          <w:rFonts w:ascii="Times New Roman" w:eastAsia="Times New Roman" w:hAnsi="Times New Roman" w:cs="Times New Roman"/>
+          <w:i/>
+          <w:iCs/>
+          <w:sz w:val="24"/>
+          <w:szCs w:val="24"/>
+        </w:rPr>
+        <w:t>Conference</w:t>
+      </w:r>
+      <w:proofErr w:type="spellEnd"/>
+      <w:r>
+        <w:rPr>
+          <w:rFonts w:ascii="Times New Roman" w:eastAsia="Times New Roman" w:hAnsi="Times New Roman" w:cs="Times New Roman"/>
+          <w:i/>
+          <w:iCs/>
+          <w:sz w:val="24"/>
+          <w:szCs w:val="24"/>
+        </w:rPr>
+        <w:t xml:space="preserve"> </w:t>
+      </w:r>
+      <w:proofErr w:type="spellStart"/>
+      <w:r>
+        <w:rPr>
+          <w:rFonts w:ascii="Times New Roman" w:eastAsia="Times New Roman" w:hAnsi="Times New Roman" w:cs="Times New Roman"/>
+          <w:i/>
+          <w:iCs/>
+          <w:sz w:val="24"/>
+          <w:szCs w:val="24"/>
+        </w:rPr>
+        <w:t>on</w:t>
+      </w:r>
+      <w:proofErr w:type="spellEnd"/>
+      <w:r>
+        <w:rPr>
+          <w:rFonts w:ascii="Times New Roman" w:eastAsia="Times New Roman" w:hAnsi="Times New Roman" w:cs="Times New Roman"/>
+          <w:i/>
+          <w:iCs/>
+          <w:sz w:val="24"/>
+          <w:szCs w:val="24"/>
+        </w:rPr>
+        <w:t xml:space="preserve"> Software </w:t>
+      </w:r>
+      <w:proofErr w:type="spellStart"/>
+      <w:r>
+        <w:rPr>
+          <w:rFonts w:ascii="Times New Roman" w:eastAsia="Times New Roman" w:hAnsi="Times New Roman" w:cs="Times New Roman"/>
+          <w:i/>
+          <w:iCs/>
+          <w:sz w:val="24"/>
+          <w:szCs w:val="24"/>
+        </w:rPr>
+        <w:t>Architecture</w:t>
+      </w:r>
+      <w:proofErr w:type="spellEnd"/>
+      <w:r>
+        <w:rPr>
+          <w:rFonts w:ascii="Times New Roman" w:eastAsia="Times New Roman" w:hAnsi="Times New Roman" w:cs="Times New Roman"/>
+          <w:i/>
+          <w:iCs/>
+          <w:sz w:val="24"/>
+          <w:szCs w:val="24"/>
+        </w:rPr>
+        <w:t xml:space="preserve"> (ICSA) </w:t>
       </w:r>
       <w:r>
         <w:rPr>
@@ -4973,17 +6939,259 @@
           <w:sz w:val="24"/>
           <w:szCs w:val="24"/>
         </w:rPr>
-        <w:t xml:space="preserve">Cámara, J., Troya, J., Burgueño, L., &amp; Vallecillo, A. (2023). On the assessment of generative AI in modeling tasks: An experience report with ChatGPT and UML. </w:t>
-      </w:r>
-      <w:r>
-        <w:rPr>
-          <w:rFonts w:ascii="Times New Roman" w:eastAsia="Times New Roman" w:hAnsi="Times New Roman" w:cs="Times New Roman"/>
-          <w:i/>
-          <w:iCs/>
-          <w:sz w:val="24"/>
-          <w:szCs w:val="24"/>
-        </w:rPr>
-        <w:t xml:space="preserve">Software and Systems Modeling, </w:t>
+        <w:t xml:space="preserve">Cámara, J., Troya, J., Burgueño, L., &amp; Vallecillo, A. (2023). </w:t>
+      </w:r>
+      <w:proofErr w:type="spellStart"/>
+      <w:r>
+        <w:rPr>
+          <w:rFonts w:ascii="Times New Roman" w:eastAsia="Times New Roman" w:hAnsi="Times New Roman" w:cs="Times New Roman"/>
+          <w:sz w:val="24"/>
+          <w:szCs w:val="24"/>
+        </w:rPr>
+        <w:t>On</w:t>
+      </w:r>
+      <w:proofErr w:type="spellEnd"/>
+      <w:r>
+        <w:rPr>
+          <w:rFonts w:ascii="Times New Roman" w:eastAsia="Times New Roman" w:hAnsi="Times New Roman" w:cs="Times New Roman"/>
+          <w:sz w:val="24"/>
+          <w:szCs w:val="24"/>
+        </w:rPr>
+        <w:t xml:space="preserve"> </w:t>
+      </w:r>
+      <w:proofErr w:type="spellStart"/>
+      <w:r>
+        <w:rPr>
+          <w:rFonts w:ascii="Times New Roman" w:eastAsia="Times New Roman" w:hAnsi="Times New Roman" w:cs="Times New Roman"/>
+          <w:sz w:val="24"/>
+          <w:szCs w:val="24"/>
+        </w:rPr>
+        <w:t>the</w:t>
+      </w:r>
+      <w:proofErr w:type="spellEnd"/>
+      <w:r>
+        <w:rPr>
+          <w:rFonts w:ascii="Times New Roman" w:eastAsia="Times New Roman" w:hAnsi="Times New Roman" w:cs="Times New Roman"/>
+          <w:sz w:val="24"/>
+          <w:szCs w:val="24"/>
+        </w:rPr>
+        <w:t xml:space="preserve"> </w:t>
+      </w:r>
+      <w:proofErr w:type="spellStart"/>
+      <w:r>
+        <w:rPr>
+          <w:rFonts w:ascii="Times New Roman" w:eastAsia="Times New Roman" w:hAnsi="Times New Roman" w:cs="Times New Roman"/>
+          <w:sz w:val="24"/>
+          <w:szCs w:val="24"/>
+        </w:rPr>
+        <w:t>assessment</w:t>
+      </w:r>
+      <w:proofErr w:type="spellEnd"/>
+      <w:r>
+        <w:rPr>
+          <w:rFonts w:ascii="Times New Roman" w:eastAsia="Times New Roman" w:hAnsi="Times New Roman" w:cs="Times New Roman"/>
+          <w:sz w:val="24"/>
+          <w:szCs w:val="24"/>
+        </w:rPr>
+        <w:t xml:space="preserve"> </w:t>
+      </w:r>
+      <w:proofErr w:type="spellStart"/>
+      <w:r>
+        <w:rPr>
+          <w:rFonts w:ascii="Times New Roman" w:eastAsia="Times New Roman" w:hAnsi="Times New Roman" w:cs="Times New Roman"/>
+          <w:sz w:val="24"/>
+          <w:szCs w:val="24"/>
+        </w:rPr>
+        <w:t>of</w:t>
+      </w:r>
+      <w:proofErr w:type="spellEnd"/>
+      <w:r>
+        <w:rPr>
+          <w:rFonts w:ascii="Times New Roman" w:eastAsia="Times New Roman" w:hAnsi="Times New Roman" w:cs="Times New Roman"/>
+          <w:sz w:val="24"/>
+          <w:szCs w:val="24"/>
+        </w:rPr>
+        <w:t xml:space="preserve"> generative AI in </w:t>
+      </w:r>
+      <w:proofErr w:type="spellStart"/>
+      <w:r>
+        <w:rPr>
+          <w:rFonts w:ascii="Times New Roman" w:eastAsia="Times New Roman" w:hAnsi="Times New Roman" w:cs="Times New Roman"/>
+          <w:sz w:val="24"/>
+          <w:szCs w:val="24"/>
+        </w:rPr>
+        <w:t>modeling</w:t>
+      </w:r>
+      <w:proofErr w:type="spellEnd"/>
+      <w:r>
+        <w:rPr>
+          <w:rFonts w:ascii="Times New Roman" w:eastAsia="Times New Roman" w:hAnsi="Times New Roman" w:cs="Times New Roman"/>
+          <w:sz w:val="24"/>
+          <w:szCs w:val="24"/>
+        </w:rPr>
+        <w:t xml:space="preserve"> </w:t>
+      </w:r>
+      <w:proofErr w:type="spellStart"/>
+      <w:r>
+        <w:rPr>
+          <w:rFonts w:ascii="Times New Roman" w:eastAsia="Times New Roman" w:hAnsi="Times New Roman" w:cs="Times New Roman"/>
+          <w:sz w:val="24"/>
+          <w:szCs w:val="24"/>
+        </w:rPr>
+        <w:t>tasks</w:t>
+      </w:r>
+      <w:proofErr w:type="spellEnd"/>
+      <w:r>
+        <w:rPr>
+          <w:rFonts w:ascii="Times New Roman" w:eastAsia="Times New Roman" w:hAnsi="Times New Roman" w:cs="Times New Roman"/>
+          <w:sz w:val="24"/>
+          <w:szCs w:val="24"/>
+        </w:rPr>
+        <w:t xml:space="preserve">: </w:t>
+      </w:r>
+      <w:proofErr w:type="spellStart"/>
+      <w:r>
+        <w:rPr>
+          <w:rFonts w:ascii="Times New Roman" w:eastAsia="Times New Roman" w:hAnsi="Times New Roman" w:cs="Times New Roman"/>
+          <w:sz w:val="24"/>
+          <w:szCs w:val="24"/>
+        </w:rPr>
+        <w:t>An</w:t>
+      </w:r>
+      <w:proofErr w:type="spellEnd"/>
+      <w:r>
+        <w:rPr>
+          <w:rFonts w:ascii="Times New Roman" w:eastAsia="Times New Roman" w:hAnsi="Times New Roman" w:cs="Times New Roman"/>
+          <w:sz w:val="24"/>
+          <w:szCs w:val="24"/>
+        </w:rPr>
+        <w:t xml:space="preserve"> </w:t>
+      </w:r>
+      <w:proofErr w:type="spellStart"/>
+      <w:r>
+        <w:rPr>
+          <w:rFonts w:ascii="Times New Roman" w:eastAsia="Times New Roman" w:hAnsi="Times New Roman" w:cs="Times New Roman"/>
+          <w:sz w:val="24"/>
+          <w:szCs w:val="24"/>
+        </w:rPr>
+        <w:t>experience</w:t>
+      </w:r>
+      <w:proofErr w:type="spellEnd"/>
+      <w:r>
+        <w:rPr>
+          <w:rFonts w:ascii="Times New Roman" w:eastAsia="Times New Roman" w:hAnsi="Times New Roman" w:cs="Times New Roman"/>
+          <w:sz w:val="24"/>
+          <w:szCs w:val="24"/>
+        </w:rPr>
+        <w:t xml:space="preserve"> </w:t>
+      </w:r>
+      <w:proofErr w:type="spellStart"/>
+      <w:r>
+        <w:rPr>
+          <w:rFonts w:ascii="Times New Roman" w:eastAsia="Times New Roman" w:hAnsi="Times New Roman" w:cs="Times New Roman"/>
+          <w:sz w:val="24"/>
+          <w:szCs w:val="24"/>
+        </w:rPr>
+        <w:t>report</w:t>
+      </w:r>
+      <w:proofErr w:type="spellEnd"/>
+      <w:r>
+        <w:rPr>
+          <w:rFonts w:ascii="Times New Roman" w:eastAsia="Times New Roman" w:hAnsi="Times New Roman" w:cs="Times New Roman"/>
+          <w:sz w:val="24"/>
+          <w:szCs w:val="24"/>
+        </w:rPr>
+        <w:t xml:space="preserve"> </w:t>
+      </w:r>
+      <w:proofErr w:type="spellStart"/>
+      <w:r>
+        <w:rPr>
+          <w:rFonts w:ascii="Times New Roman" w:eastAsia="Times New Roman" w:hAnsi="Times New Roman" w:cs="Times New Roman"/>
+          <w:sz w:val="24"/>
+          <w:szCs w:val="24"/>
+        </w:rPr>
+        <w:t>with</w:t>
+      </w:r>
+      <w:proofErr w:type="spellEnd"/>
+      <w:r>
+        <w:rPr>
+          <w:rFonts w:ascii="Times New Roman" w:eastAsia="Times New Roman" w:hAnsi="Times New Roman" w:cs="Times New Roman"/>
+          <w:sz w:val="24"/>
+          <w:szCs w:val="24"/>
+        </w:rPr>
+        <w:t xml:space="preserve"> </w:t>
+      </w:r>
+      <w:proofErr w:type="spellStart"/>
+      <w:r>
+        <w:rPr>
+          <w:rFonts w:ascii="Times New Roman" w:eastAsia="Times New Roman" w:hAnsi="Times New Roman" w:cs="Times New Roman"/>
+          <w:sz w:val="24"/>
+          <w:szCs w:val="24"/>
+        </w:rPr>
+        <w:t>ChatGPT</w:t>
+      </w:r>
+      <w:proofErr w:type="spellEnd"/>
+      <w:r>
+        <w:rPr>
+          <w:rFonts w:ascii="Times New Roman" w:eastAsia="Times New Roman" w:hAnsi="Times New Roman" w:cs="Times New Roman"/>
+          <w:sz w:val="24"/>
+          <w:szCs w:val="24"/>
+        </w:rPr>
+        <w:t xml:space="preserve"> and UML. </w:t>
+      </w:r>
+      <w:r>
+        <w:rPr>
+          <w:rFonts w:ascii="Times New Roman" w:eastAsia="Times New Roman" w:hAnsi="Times New Roman" w:cs="Times New Roman"/>
+          <w:i/>
+          <w:iCs/>
+          <w:sz w:val="24"/>
+          <w:szCs w:val="24"/>
+        </w:rPr>
+        <w:t xml:space="preserve">Software and </w:t>
+      </w:r>
+      <w:proofErr w:type="spellStart"/>
+      <w:r>
+        <w:rPr>
+          <w:rFonts w:ascii="Times New Roman" w:eastAsia="Times New Roman" w:hAnsi="Times New Roman" w:cs="Times New Roman"/>
+          <w:i/>
+          <w:iCs/>
+          <w:sz w:val="24"/>
+          <w:szCs w:val="24"/>
+        </w:rPr>
+        <w:t>Systems</w:t>
+      </w:r>
+      <w:proofErr w:type="spellEnd"/>
+      <w:r>
+        <w:rPr>
+          <w:rFonts w:ascii="Times New Roman" w:eastAsia="Times New Roman" w:hAnsi="Times New Roman" w:cs="Times New Roman"/>
+          <w:i/>
+          <w:iCs/>
+          <w:sz w:val="24"/>
+          <w:szCs w:val="24"/>
+        </w:rPr>
+        <w:t xml:space="preserve"> </w:t>
+      </w:r>
+      <w:proofErr w:type="spellStart"/>
+      <w:r>
+        <w:rPr>
+          <w:rFonts w:ascii="Times New Roman" w:eastAsia="Times New Roman" w:hAnsi="Times New Roman" w:cs="Times New Roman"/>
+          <w:i/>
+          <w:iCs/>
+          <w:sz w:val="24"/>
+          <w:szCs w:val="24"/>
+        </w:rPr>
+        <w:t>Modeling</w:t>
+      </w:r>
+      <w:proofErr w:type="spellEnd"/>
+      <w:r>
+        <w:rPr>
+          <w:rFonts w:ascii="Times New Roman" w:eastAsia="Times New Roman" w:hAnsi="Times New Roman" w:cs="Times New Roman"/>
+          <w:i/>
+          <w:iCs/>
+          <w:sz w:val="24"/>
+          <w:szCs w:val="24"/>
+        </w:rPr>
+        <w:t xml:space="preserve">, </w:t>
       </w:r>
       <w:r>
         <w:rPr>
@@ -5010,25 +7218,257 @@
           <w:sz w:val="24"/>
           <w:szCs w:val="24"/>
         </w:rPr>
-        <w:t xml:space="preserve">Hou, X., Zhao, Y., Liu, Y., Yang, Z., Wang, K., Li, L., Luo, X., Lo, D., Grundy, J., &amp; Wang, H. (2024). Large language models for software engineering: A systematic literature review. </w:t>
-      </w:r>
-      <w:r>
-        <w:rPr>
-          <w:rFonts w:ascii="Times New Roman" w:eastAsia="Times New Roman" w:hAnsi="Times New Roman" w:cs="Times New Roman"/>
-          <w:i/>
-          <w:iCs/>
-          <w:sz w:val="24"/>
-          <w:szCs w:val="24"/>
-        </w:rPr>
-        <w:t xml:space="preserve">ACM Transactions on Software Engineering and Methodology, </w:t>
-      </w:r>
-      <w:r>
-        <w:rPr>
-          <w:rFonts w:ascii="Times New Roman" w:eastAsia="Times New Roman" w:hAnsi="Times New Roman" w:cs="Times New Roman"/>
-          <w:sz w:val="24"/>
-          <w:szCs w:val="24"/>
-        </w:rPr>
-        <w:t>33(8), Article 220. https://doi.org/10.1145/3695988</w:t>
+        <w:t xml:space="preserve">Hou, X., Zhao, Y., Liu, Y., Yang, Z., Wang, K., Li, L., Luo, X., Lo, D., Grundy, J., &amp; Wang, H. (2024). Large </w:t>
+      </w:r>
+      <w:proofErr w:type="spellStart"/>
+      <w:r>
+        <w:rPr>
+          <w:rFonts w:ascii="Times New Roman" w:eastAsia="Times New Roman" w:hAnsi="Times New Roman" w:cs="Times New Roman"/>
+          <w:sz w:val="24"/>
+          <w:szCs w:val="24"/>
+        </w:rPr>
+        <w:t>language</w:t>
+      </w:r>
+      <w:proofErr w:type="spellEnd"/>
+      <w:r>
+        <w:rPr>
+          <w:rFonts w:ascii="Times New Roman" w:eastAsia="Times New Roman" w:hAnsi="Times New Roman" w:cs="Times New Roman"/>
+          <w:sz w:val="24"/>
+          <w:szCs w:val="24"/>
+        </w:rPr>
+        <w:t xml:space="preserve"> </w:t>
+      </w:r>
+      <w:proofErr w:type="spellStart"/>
+      <w:r>
+        <w:rPr>
+          <w:rFonts w:ascii="Times New Roman" w:eastAsia="Times New Roman" w:hAnsi="Times New Roman" w:cs="Times New Roman"/>
+          <w:sz w:val="24"/>
+          <w:szCs w:val="24"/>
+        </w:rPr>
+        <w:t>models</w:t>
+      </w:r>
+      <w:proofErr w:type="spellEnd"/>
+      <w:r>
+        <w:rPr>
+          <w:rFonts w:ascii="Times New Roman" w:eastAsia="Times New Roman" w:hAnsi="Times New Roman" w:cs="Times New Roman"/>
+          <w:sz w:val="24"/>
+          <w:szCs w:val="24"/>
+        </w:rPr>
+        <w:t xml:space="preserve"> </w:t>
+      </w:r>
+      <w:proofErr w:type="spellStart"/>
+      <w:r>
+        <w:rPr>
+          <w:rFonts w:ascii="Times New Roman" w:eastAsia="Times New Roman" w:hAnsi="Times New Roman" w:cs="Times New Roman"/>
+          <w:sz w:val="24"/>
+          <w:szCs w:val="24"/>
+        </w:rPr>
+        <w:t>for</w:t>
+      </w:r>
+      <w:proofErr w:type="spellEnd"/>
+      <w:r>
+        <w:rPr>
+          <w:rFonts w:ascii="Times New Roman" w:eastAsia="Times New Roman" w:hAnsi="Times New Roman" w:cs="Times New Roman"/>
+          <w:sz w:val="24"/>
+          <w:szCs w:val="24"/>
+        </w:rPr>
+        <w:t xml:space="preserve"> software </w:t>
+      </w:r>
+      <w:proofErr w:type="spellStart"/>
+      <w:r>
+        <w:rPr>
+          <w:rFonts w:ascii="Times New Roman" w:eastAsia="Times New Roman" w:hAnsi="Times New Roman" w:cs="Times New Roman"/>
+          <w:sz w:val="24"/>
+          <w:szCs w:val="24"/>
+        </w:rPr>
+        <w:t>engineering</w:t>
+      </w:r>
+      <w:proofErr w:type="spellEnd"/>
+      <w:r>
+        <w:rPr>
+          <w:rFonts w:ascii="Times New Roman" w:eastAsia="Times New Roman" w:hAnsi="Times New Roman" w:cs="Times New Roman"/>
+          <w:sz w:val="24"/>
+          <w:szCs w:val="24"/>
+        </w:rPr>
+        <w:t xml:space="preserve">: A </w:t>
+      </w:r>
+      <w:proofErr w:type="spellStart"/>
+      <w:r>
+        <w:rPr>
+          <w:rFonts w:ascii="Times New Roman" w:eastAsia="Times New Roman" w:hAnsi="Times New Roman" w:cs="Times New Roman"/>
+          <w:sz w:val="24"/>
+          <w:szCs w:val="24"/>
+        </w:rPr>
+        <w:t>systematic</w:t>
+      </w:r>
+      <w:proofErr w:type="spellEnd"/>
+      <w:r>
+        <w:rPr>
+          <w:rFonts w:ascii="Times New Roman" w:eastAsia="Times New Roman" w:hAnsi="Times New Roman" w:cs="Times New Roman"/>
+          <w:sz w:val="24"/>
+          <w:szCs w:val="24"/>
+        </w:rPr>
+        <w:t xml:space="preserve"> </w:t>
+      </w:r>
+      <w:proofErr w:type="spellStart"/>
+      <w:r>
+        <w:rPr>
+          <w:rFonts w:ascii="Times New Roman" w:eastAsia="Times New Roman" w:hAnsi="Times New Roman" w:cs="Times New Roman"/>
+          <w:sz w:val="24"/>
+          <w:szCs w:val="24"/>
+        </w:rPr>
+        <w:t>literature</w:t>
+      </w:r>
+      <w:proofErr w:type="spellEnd"/>
+      <w:r>
+        <w:rPr>
+          <w:rFonts w:ascii="Times New Roman" w:eastAsia="Times New Roman" w:hAnsi="Times New Roman" w:cs="Times New Roman"/>
+          <w:sz w:val="24"/>
+          <w:szCs w:val="24"/>
+        </w:rPr>
+        <w:t xml:space="preserve"> </w:t>
+      </w:r>
+      <w:proofErr w:type="spellStart"/>
+      <w:r>
+        <w:rPr>
+          <w:rFonts w:ascii="Times New Roman" w:eastAsia="Times New Roman" w:hAnsi="Times New Roman" w:cs="Times New Roman"/>
+          <w:sz w:val="24"/>
+          <w:szCs w:val="24"/>
+        </w:rPr>
+        <w:t>review</w:t>
+      </w:r>
+      <w:proofErr w:type="spellEnd"/>
+      <w:r>
+        <w:rPr>
+          <w:rFonts w:ascii="Times New Roman" w:eastAsia="Times New Roman" w:hAnsi="Times New Roman" w:cs="Times New Roman"/>
+          <w:sz w:val="24"/>
+          <w:szCs w:val="24"/>
+        </w:rPr>
+        <w:t xml:space="preserve">. </w:t>
+      </w:r>
+      <w:r>
+        <w:rPr>
+          <w:rFonts w:ascii="Times New Roman" w:eastAsia="Times New Roman" w:hAnsi="Times New Roman" w:cs="Times New Roman"/>
+          <w:i/>
+          <w:iCs/>
+          <w:sz w:val="24"/>
+          <w:szCs w:val="24"/>
+        </w:rPr>
+        <w:t xml:space="preserve">ACM </w:t>
+      </w:r>
+      <w:proofErr w:type="spellStart"/>
+      <w:r>
+        <w:rPr>
+          <w:rFonts w:ascii="Times New Roman" w:eastAsia="Times New Roman" w:hAnsi="Times New Roman" w:cs="Times New Roman"/>
+          <w:i/>
+          <w:iCs/>
+          <w:sz w:val="24"/>
+          <w:szCs w:val="24"/>
+        </w:rPr>
+        <w:t>Transactions</w:t>
+      </w:r>
+      <w:proofErr w:type="spellEnd"/>
+      <w:r>
+        <w:rPr>
+          <w:rFonts w:ascii="Times New Roman" w:eastAsia="Times New Roman" w:hAnsi="Times New Roman" w:cs="Times New Roman"/>
+          <w:i/>
+          <w:iCs/>
+          <w:sz w:val="24"/>
+          <w:szCs w:val="24"/>
+        </w:rPr>
+        <w:t xml:space="preserve"> </w:t>
+      </w:r>
+      <w:proofErr w:type="spellStart"/>
+      <w:r>
+        <w:rPr>
+          <w:rFonts w:ascii="Times New Roman" w:eastAsia="Times New Roman" w:hAnsi="Times New Roman" w:cs="Times New Roman"/>
+          <w:i/>
+          <w:iCs/>
+          <w:sz w:val="24"/>
+          <w:szCs w:val="24"/>
+        </w:rPr>
+        <w:t>on</w:t>
+      </w:r>
+      <w:proofErr w:type="spellEnd"/>
+      <w:r>
+        <w:rPr>
+          <w:rFonts w:ascii="Times New Roman" w:eastAsia="Times New Roman" w:hAnsi="Times New Roman" w:cs="Times New Roman"/>
+          <w:i/>
+          <w:iCs/>
+          <w:sz w:val="24"/>
+          <w:szCs w:val="24"/>
+        </w:rPr>
+        <w:t xml:space="preserve"> Software </w:t>
+      </w:r>
+      <w:proofErr w:type="spellStart"/>
+      <w:r>
+        <w:rPr>
+          <w:rFonts w:ascii="Times New Roman" w:eastAsia="Times New Roman" w:hAnsi="Times New Roman" w:cs="Times New Roman"/>
+          <w:i/>
+          <w:iCs/>
+          <w:sz w:val="24"/>
+          <w:szCs w:val="24"/>
+        </w:rPr>
+        <w:t>Engineering</w:t>
+      </w:r>
+      <w:proofErr w:type="spellEnd"/>
+      <w:r>
+        <w:rPr>
+          <w:rFonts w:ascii="Times New Roman" w:eastAsia="Times New Roman" w:hAnsi="Times New Roman" w:cs="Times New Roman"/>
+          <w:i/>
+          <w:iCs/>
+          <w:sz w:val="24"/>
+          <w:szCs w:val="24"/>
+        </w:rPr>
+        <w:t xml:space="preserve"> and </w:t>
+      </w:r>
+      <w:proofErr w:type="spellStart"/>
+      <w:r>
+        <w:rPr>
+          <w:rFonts w:ascii="Times New Roman" w:eastAsia="Times New Roman" w:hAnsi="Times New Roman" w:cs="Times New Roman"/>
+          <w:i/>
+          <w:iCs/>
+          <w:sz w:val="24"/>
+          <w:szCs w:val="24"/>
+        </w:rPr>
+        <w:t>Methodology</w:t>
+      </w:r>
+      <w:proofErr w:type="spellEnd"/>
+      <w:r>
+        <w:rPr>
+          <w:rFonts w:ascii="Times New Roman" w:eastAsia="Times New Roman" w:hAnsi="Times New Roman" w:cs="Times New Roman"/>
+          <w:i/>
+          <w:iCs/>
+          <w:sz w:val="24"/>
+          <w:szCs w:val="24"/>
+        </w:rPr>
+        <w:t xml:space="preserve">, </w:t>
+      </w:r>
+      <w:r>
+        <w:rPr>
+          <w:rFonts w:ascii="Times New Roman" w:eastAsia="Times New Roman" w:hAnsi="Times New Roman" w:cs="Times New Roman"/>
+          <w:sz w:val="24"/>
+          <w:szCs w:val="24"/>
+        </w:rPr>
+        <w:t xml:space="preserve">33(8), </w:t>
+      </w:r>
+      <w:proofErr w:type="spellStart"/>
+      <w:r>
+        <w:rPr>
+          <w:rFonts w:ascii="Times New Roman" w:eastAsia="Times New Roman" w:hAnsi="Times New Roman" w:cs="Times New Roman"/>
+          <w:sz w:val="24"/>
+          <w:szCs w:val="24"/>
+        </w:rPr>
+        <w:t>Article</w:t>
+      </w:r>
+      <w:proofErr w:type="spellEnd"/>
+      <w:r>
+        <w:rPr>
+          <w:rFonts w:ascii="Times New Roman" w:eastAsia="Times New Roman" w:hAnsi="Times New Roman" w:cs="Times New Roman"/>
+          <w:sz w:val="24"/>
+          <w:szCs w:val="24"/>
+        </w:rPr>
+        <w:t xml:space="preserve"> 220. https://doi.org/10.1145/3695988</w:t>
       </w:r>
     </w:p>
     <w:p>
@@ -5050,15 +7490,93 @@
         <w:lastRenderedPageBreak/>
         <w:t xml:space="preserve">Laplante, P. A., &amp; Kassab, M. H. (2022). </w:t>
       </w:r>
-      <w:r>
-        <w:rPr>
-          <w:rFonts w:ascii="Times New Roman" w:eastAsia="Times New Roman" w:hAnsi="Times New Roman" w:cs="Times New Roman"/>
-          <w:i/>
-          <w:iCs/>
-          <w:sz w:val="24"/>
-          <w:szCs w:val="24"/>
-        </w:rPr>
-        <w:t xml:space="preserve">Requirements engineering for software and systems </w:t>
+      <w:proofErr w:type="spellStart"/>
+      <w:r>
+        <w:rPr>
+          <w:rFonts w:ascii="Times New Roman" w:eastAsia="Times New Roman" w:hAnsi="Times New Roman" w:cs="Times New Roman"/>
+          <w:i/>
+          <w:iCs/>
+          <w:sz w:val="24"/>
+          <w:szCs w:val="24"/>
+        </w:rPr>
+        <w:t>Requirements</w:t>
+      </w:r>
+      <w:proofErr w:type="spellEnd"/>
+      <w:r>
+        <w:rPr>
+          <w:rFonts w:ascii="Times New Roman" w:eastAsia="Times New Roman" w:hAnsi="Times New Roman" w:cs="Times New Roman"/>
+          <w:i/>
+          <w:iCs/>
+          <w:sz w:val="24"/>
+          <w:szCs w:val="24"/>
+        </w:rPr>
+        <w:t xml:space="preserve"> </w:t>
+      </w:r>
+      <w:proofErr w:type="spellStart"/>
+      <w:r>
+        <w:rPr>
+          <w:rFonts w:ascii="Times New Roman" w:eastAsia="Times New Roman" w:hAnsi="Times New Roman" w:cs="Times New Roman"/>
+          <w:i/>
+          <w:iCs/>
+          <w:sz w:val="24"/>
+          <w:szCs w:val="24"/>
+        </w:rPr>
+        <w:t>engineering</w:t>
+      </w:r>
+      <w:proofErr w:type="spellEnd"/>
+      <w:r>
+        <w:rPr>
+          <w:rFonts w:ascii="Times New Roman" w:eastAsia="Times New Roman" w:hAnsi="Times New Roman" w:cs="Times New Roman"/>
+          <w:i/>
+          <w:iCs/>
+          <w:sz w:val="24"/>
+          <w:szCs w:val="24"/>
+        </w:rPr>
+        <w:t xml:space="preserve"> </w:t>
+      </w:r>
+      <w:proofErr w:type="spellStart"/>
+      <w:r>
+        <w:rPr>
+          <w:rFonts w:ascii="Times New Roman" w:eastAsia="Times New Roman" w:hAnsi="Times New Roman" w:cs="Times New Roman"/>
+          <w:i/>
+          <w:iCs/>
+          <w:sz w:val="24"/>
+          <w:szCs w:val="24"/>
+        </w:rPr>
+        <w:t>for</w:t>
+      </w:r>
+      <w:proofErr w:type="spellEnd"/>
+      <w:r>
+        <w:rPr>
+          <w:rFonts w:ascii="Times New Roman" w:eastAsia="Times New Roman" w:hAnsi="Times New Roman" w:cs="Times New Roman"/>
+          <w:i/>
+          <w:iCs/>
+          <w:sz w:val="24"/>
+          <w:szCs w:val="24"/>
+        </w:rPr>
+        <w:t xml:space="preserve"> software and </w:t>
+      </w:r>
+      <w:proofErr w:type="spellStart"/>
+      <w:r>
+        <w:rPr>
+          <w:rFonts w:ascii="Times New Roman" w:eastAsia="Times New Roman" w:hAnsi="Times New Roman" w:cs="Times New Roman"/>
+          <w:i/>
+          <w:iCs/>
+          <w:sz w:val="24"/>
+          <w:szCs w:val="24"/>
+        </w:rPr>
+        <w:t>systems</w:t>
+      </w:r>
+      <w:proofErr w:type="spellEnd"/>
+      <w:r>
+        <w:rPr>
+          <w:rFonts w:ascii="Times New Roman" w:eastAsia="Times New Roman" w:hAnsi="Times New Roman" w:cs="Times New Roman"/>
+          <w:i/>
+          <w:iCs/>
+          <w:sz w:val="24"/>
+          <w:szCs w:val="24"/>
+        </w:rPr>
+        <w:t xml:space="preserve"> </w:t>
       </w:r>
       <w:r>
         <w:rPr>
@@ -5085,25 +7603,249 @@
           <w:sz w:val="24"/>
           <w:szCs w:val="24"/>
         </w:rPr>
-        <w:t xml:space="preserve">Lu, S., Tazin, A., Chen, Y., Kokar, M. M., &amp; Smith, J. (2023). Detection of inconsistencies in SysML/OCL models using OWL reasoning. </w:t>
-      </w:r>
-      <w:r>
-        <w:rPr>
-          <w:rFonts w:ascii="Times New Roman" w:eastAsia="Times New Roman" w:hAnsi="Times New Roman" w:cs="Times New Roman"/>
-          <w:i/>
-          <w:iCs/>
-          <w:sz w:val="24"/>
-          <w:szCs w:val="24"/>
-        </w:rPr>
-        <w:t xml:space="preserve">SN Computer Science, </w:t>
-      </w:r>
-      <w:r>
-        <w:rPr>
-          <w:rFonts w:ascii="Times New Roman" w:eastAsia="Times New Roman" w:hAnsi="Times New Roman" w:cs="Times New Roman"/>
-          <w:sz w:val="24"/>
-          <w:szCs w:val="24"/>
-        </w:rPr>
-        <w:t>4, Article 175. https://doi.org/10.1007/s42979-022-01577-0</w:t>
+        <w:t xml:space="preserve">Lu, S., </w:t>
+      </w:r>
+      <w:proofErr w:type="spellStart"/>
+      <w:r>
+        <w:rPr>
+          <w:rFonts w:ascii="Times New Roman" w:eastAsia="Times New Roman" w:hAnsi="Times New Roman" w:cs="Times New Roman"/>
+          <w:sz w:val="24"/>
+          <w:szCs w:val="24"/>
+        </w:rPr>
+        <w:t>Tazin</w:t>
+      </w:r>
+      <w:proofErr w:type="spellEnd"/>
+      <w:r>
+        <w:rPr>
+          <w:rFonts w:ascii="Times New Roman" w:eastAsia="Times New Roman" w:hAnsi="Times New Roman" w:cs="Times New Roman"/>
+          <w:sz w:val="24"/>
+          <w:szCs w:val="24"/>
+        </w:rPr>
+        <w:t xml:space="preserve">, A., Chen, Y., </w:t>
+      </w:r>
+      <w:proofErr w:type="spellStart"/>
+      <w:r>
+        <w:rPr>
+          <w:rFonts w:ascii="Times New Roman" w:eastAsia="Times New Roman" w:hAnsi="Times New Roman" w:cs="Times New Roman"/>
+          <w:sz w:val="24"/>
+          <w:szCs w:val="24"/>
+        </w:rPr>
+        <w:t>Kokar</w:t>
+      </w:r>
+      <w:proofErr w:type="spellEnd"/>
+      <w:r>
+        <w:rPr>
+          <w:rFonts w:ascii="Times New Roman" w:eastAsia="Times New Roman" w:hAnsi="Times New Roman" w:cs="Times New Roman"/>
+          <w:sz w:val="24"/>
+          <w:szCs w:val="24"/>
+        </w:rPr>
+        <w:t xml:space="preserve">, M. M., &amp; Smith, J. (2023). </w:t>
+      </w:r>
+      <w:proofErr w:type="spellStart"/>
+      <w:r>
+        <w:rPr>
+          <w:rFonts w:ascii="Times New Roman" w:eastAsia="Times New Roman" w:hAnsi="Times New Roman" w:cs="Times New Roman"/>
+          <w:sz w:val="24"/>
+          <w:szCs w:val="24"/>
+        </w:rPr>
+        <w:t>Detection</w:t>
+      </w:r>
+      <w:proofErr w:type="spellEnd"/>
+      <w:r>
+        <w:rPr>
+          <w:rFonts w:ascii="Times New Roman" w:eastAsia="Times New Roman" w:hAnsi="Times New Roman" w:cs="Times New Roman"/>
+          <w:sz w:val="24"/>
+          <w:szCs w:val="24"/>
+        </w:rPr>
+        <w:t xml:space="preserve"> </w:t>
+      </w:r>
+      <w:proofErr w:type="spellStart"/>
+      <w:r>
+        <w:rPr>
+          <w:rFonts w:ascii="Times New Roman" w:eastAsia="Times New Roman" w:hAnsi="Times New Roman" w:cs="Times New Roman"/>
+          <w:sz w:val="24"/>
+          <w:szCs w:val="24"/>
+        </w:rPr>
+        <w:t>of</w:t>
+      </w:r>
+      <w:proofErr w:type="spellEnd"/>
+      <w:r>
+        <w:rPr>
+          <w:rFonts w:ascii="Times New Roman" w:eastAsia="Times New Roman" w:hAnsi="Times New Roman" w:cs="Times New Roman"/>
+          <w:sz w:val="24"/>
+          <w:szCs w:val="24"/>
+        </w:rPr>
+        <w:t xml:space="preserve"> </w:t>
+      </w:r>
+      <w:proofErr w:type="spellStart"/>
+      <w:r>
+        <w:rPr>
+          <w:rFonts w:ascii="Times New Roman" w:eastAsia="Times New Roman" w:hAnsi="Times New Roman" w:cs="Times New Roman"/>
+          <w:sz w:val="24"/>
+          <w:szCs w:val="24"/>
+        </w:rPr>
+        <w:t>inconsistencies</w:t>
+      </w:r>
+      <w:proofErr w:type="spellEnd"/>
+      <w:r>
+        <w:rPr>
+          <w:rFonts w:ascii="Times New Roman" w:eastAsia="Times New Roman" w:hAnsi="Times New Roman" w:cs="Times New Roman"/>
+          <w:sz w:val="24"/>
+          <w:szCs w:val="24"/>
+        </w:rPr>
+        <w:t xml:space="preserve"> in </w:t>
+      </w:r>
+      <w:proofErr w:type="spellStart"/>
+      <w:r>
+        <w:rPr>
+          <w:rFonts w:ascii="Times New Roman" w:eastAsia="Times New Roman" w:hAnsi="Times New Roman" w:cs="Times New Roman"/>
+          <w:sz w:val="24"/>
+          <w:szCs w:val="24"/>
+        </w:rPr>
+        <w:t>SysML</w:t>
+      </w:r>
+      <w:proofErr w:type="spellEnd"/>
+      <w:r>
+        <w:rPr>
+          <w:rFonts w:ascii="Times New Roman" w:eastAsia="Times New Roman" w:hAnsi="Times New Roman" w:cs="Times New Roman"/>
+          <w:sz w:val="24"/>
+          <w:szCs w:val="24"/>
+        </w:rPr>
+        <w:t xml:space="preserve">/OCL </w:t>
+      </w:r>
+      <w:proofErr w:type="spellStart"/>
+      <w:r>
+        <w:rPr>
+          <w:rFonts w:ascii="Times New Roman" w:eastAsia="Times New Roman" w:hAnsi="Times New Roman" w:cs="Times New Roman"/>
+          <w:sz w:val="24"/>
+          <w:szCs w:val="24"/>
+        </w:rPr>
+        <w:t>models</w:t>
+      </w:r>
+      <w:proofErr w:type="spellEnd"/>
+      <w:r>
+        <w:rPr>
+          <w:rFonts w:ascii="Times New Roman" w:eastAsia="Times New Roman" w:hAnsi="Times New Roman" w:cs="Times New Roman"/>
+          <w:sz w:val="24"/>
+          <w:szCs w:val="24"/>
+        </w:rPr>
+        <w:t xml:space="preserve"> </w:t>
+      </w:r>
+      <w:proofErr w:type="spellStart"/>
+      <w:r>
+        <w:rPr>
+          <w:rFonts w:ascii="Times New Roman" w:eastAsia="Times New Roman" w:hAnsi="Times New Roman" w:cs="Times New Roman"/>
+          <w:sz w:val="24"/>
+          <w:szCs w:val="24"/>
+        </w:rPr>
+        <w:t>using</w:t>
+      </w:r>
+      <w:proofErr w:type="spellEnd"/>
+      <w:r>
+        <w:rPr>
+          <w:rFonts w:ascii="Times New Roman" w:eastAsia="Times New Roman" w:hAnsi="Times New Roman" w:cs="Times New Roman"/>
+          <w:sz w:val="24"/>
+          <w:szCs w:val="24"/>
+        </w:rPr>
+        <w:t xml:space="preserve"> OWL </w:t>
+      </w:r>
+      <w:proofErr w:type="spellStart"/>
+      <w:r>
+        <w:rPr>
+          <w:rFonts w:ascii="Times New Roman" w:eastAsia="Times New Roman" w:hAnsi="Times New Roman" w:cs="Times New Roman"/>
+          <w:sz w:val="24"/>
+          <w:szCs w:val="24"/>
+        </w:rPr>
+        <w:t>reasoning</w:t>
+      </w:r>
+      <w:proofErr w:type="spellEnd"/>
+      <w:r>
+        <w:rPr>
+          <w:rFonts w:ascii="Times New Roman" w:eastAsia="Times New Roman" w:hAnsi="Times New Roman" w:cs="Times New Roman"/>
+          <w:sz w:val="24"/>
+          <w:szCs w:val="24"/>
+        </w:rPr>
+        <w:t xml:space="preserve">. </w:t>
+      </w:r>
+      <w:r>
+        <w:rPr>
+          <w:rFonts w:ascii="Times New Roman" w:eastAsia="Times New Roman" w:hAnsi="Times New Roman" w:cs="Times New Roman"/>
+          <w:i/>
+          <w:iCs/>
+          <w:sz w:val="24"/>
+          <w:szCs w:val="24"/>
+        </w:rPr>
+        <w:t xml:space="preserve">SN </w:t>
+      </w:r>
+      <w:proofErr w:type="spellStart"/>
+      <w:r>
+        <w:rPr>
+          <w:rFonts w:ascii="Times New Roman" w:eastAsia="Times New Roman" w:hAnsi="Times New Roman" w:cs="Times New Roman"/>
+          <w:i/>
+          <w:iCs/>
+          <w:sz w:val="24"/>
+          <w:szCs w:val="24"/>
+        </w:rPr>
+        <w:t>Computer</w:t>
+      </w:r>
+      <w:proofErr w:type="spellEnd"/>
+      <w:r>
+        <w:rPr>
+          <w:rFonts w:ascii="Times New Roman" w:eastAsia="Times New Roman" w:hAnsi="Times New Roman" w:cs="Times New Roman"/>
+          <w:i/>
+          <w:iCs/>
+          <w:sz w:val="24"/>
+          <w:szCs w:val="24"/>
+        </w:rPr>
+        <w:t xml:space="preserve"> </w:t>
+      </w:r>
+      <w:proofErr w:type="spellStart"/>
+      <w:r>
+        <w:rPr>
+          <w:rFonts w:ascii="Times New Roman" w:eastAsia="Times New Roman" w:hAnsi="Times New Roman" w:cs="Times New Roman"/>
+          <w:i/>
+          <w:iCs/>
+          <w:sz w:val="24"/>
+          <w:szCs w:val="24"/>
+        </w:rPr>
+        <w:t>Science</w:t>
+      </w:r>
+      <w:proofErr w:type="spellEnd"/>
+      <w:r>
+        <w:rPr>
+          <w:rFonts w:ascii="Times New Roman" w:eastAsia="Times New Roman" w:hAnsi="Times New Roman" w:cs="Times New Roman"/>
+          <w:i/>
+          <w:iCs/>
+          <w:sz w:val="24"/>
+          <w:szCs w:val="24"/>
+        </w:rPr>
+        <w:t xml:space="preserve">, </w:t>
+      </w:r>
+      <w:r>
+        <w:rPr>
+          <w:rFonts w:ascii="Times New Roman" w:eastAsia="Times New Roman" w:hAnsi="Times New Roman" w:cs="Times New Roman"/>
+          <w:sz w:val="24"/>
+          <w:szCs w:val="24"/>
+        </w:rPr>
+        <w:t xml:space="preserve">4, </w:t>
+      </w:r>
+      <w:proofErr w:type="spellStart"/>
+      <w:r>
+        <w:rPr>
+          <w:rFonts w:ascii="Times New Roman" w:eastAsia="Times New Roman" w:hAnsi="Times New Roman" w:cs="Times New Roman"/>
+          <w:sz w:val="24"/>
+          <w:szCs w:val="24"/>
+        </w:rPr>
+        <w:t>Article</w:t>
+      </w:r>
+      <w:proofErr w:type="spellEnd"/>
+      <w:r>
+        <w:rPr>
+          <w:rFonts w:ascii="Times New Roman" w:eastAsia="Times New Roman" w:hAnsi="Times New Roman" w:cs="Times New Roman"/>
+          <w:sz w:val="24"/>
+          <w:szCs w:val="24"/>
+        </w:rPr>
+        <w:t xml:space="preserve"> 175. https://doi.org/10.1007/s42979-022-01577-0</w:t>
       </w:r>
     </w:p>
     <w:p>
@@ -5122,17 +7864,257 @@
           <w:sz w:val="24"/>
           <w:szCs w:val="24"/>
         </w:rPr>
-        <w:t xml:space="preserve">Nguyen, V.-V., Nguyen, H.-K., Nguyen, K.-S., Luong, T. M.-H., Vu, D.-Q., Phung, T.-N., &amp; Nguyen, T.-V. (2026). A novel unified framework for automated generation and multimodal validation of UML diagrams. </w:t>
-      </w:r>
-      <w:r>
-        <w:rPr>
-          <w:rFonts w:ascii="Times New Roman" w:eastAsia="Times New Roman" w:hAnsi="Times New Roman" w:cs="Times New Roman"/>
-          <w:i/>
-          <w:iCs/>
-          <w:sz w:val="24"/>
-          <w:szCs w:val="24"/>
-        </w:rPr>
-        <w:t xml:space="preserve">Computer Modeling in Engineering &amp; Sciences. </w:t>
+        <w:t xml:space="preserve">Nguyen, V.-V., Nguyen, H.-K., Nguyen, K.-S., Luong, T. M.-H., </w:t>
+      </w:r>
+      <w:proofErr w:type="spellStart"/>
+      <w:r>
+        <w:rPr>
+          <w:rFonts w:ascii="Times New Roman" w:eastAsia="Times New Roman" w:hAnsi="Times New Roman" w:cs="Times New Roman"/>
+          <w:sz w:val="24"/>
+          <w:szCs w:val="24"/>
+        </w:rPr>
+        <w:t>Vu</w:t>
+      </w:r>
+      <w:proofErr w:type="spellEnd"/>
+      <w:r>
+        <w:rPr>
+          <w:rFonts w:ascii="Times New Roman" w:eastAsia="Times New Roman" w:hAnsi="Times New Roman" w:cs="Times New Roman"/>
+          <w:sz w:val="24"/>
+          <w:szCs w:val="24"/>
+        </w:rPr>
+        <w:t xml:space="preserve">, D.-Q., Phung, T.-N., &amp; Nguyen, T.-V. (2026). A novel </w:t>
+      </w:r>
+      <w:proofErr w:type="spellStart"/>
+      <w:r>
+        <w:rPr>
+          <w:rFonts w:ascii="Times New Roman" w:eastAsia="Times New Roman" w:hAnsi="Times New Roman" w:cs="Times New Roman"/>
+          <w:sz w:val="24"/>
+          <w:szCs w:val="24"/>
+        </w:rPr>
+        <w:t>unified</w:t>
+      </w:r>
+      <w:proofErr w:type="spellEnd"/>
+      <w:r>
+        <w:rPr>
+          <w:rFonts w:ascii="Times New Roman" w:eastAsia="Times New Roman" w:hAnsi="Times New Roman" w:cs="Times New Roman"/>
+          <w:sz w:val="24"/>
+          <w:szCs w:val="24"/>
+        </w:rPr>
+        <w:t xml:space="preserve"> </w:t>
+      </w:r>
+      <w:proofErr w:type="spellStart"/>
+      <w:r>
+        <w:rPr>
+          <w:rFonts w:ascii="Times New Roman" w:eastAsia="Times New Roman" w:hAnsi="Times New Roman" w:cs="Times New Roman"/>
+          <w:sz w:val="24"/>
+          <w:szCs w:val="24"/>
+        </w:rPr>
+        <w:t>framework</w:t>
+      </w:r>
+      <w:proofErr w:type="spellEnd"/>
+      <w:r>
+        <w:rPr>
+          <w:rFonts w:ascii="Times New Roman" w:eastAsia="Times New Roman" w:hAnsi="Times New Roman" w:cs="Times New Roman"/>
+          <w:sz w:val="24"/>
+          <w:szCs w:val="24"/>
+        </w:rPr>
+        <w:t xml:space="preserve"> </w:t>
+      </w:r>
+      <w:proofErr w:type="spellStart"/>
+      <w:r>
+        <w:rPr>
+          <w:rFonts w:ascii="Times New Roman" w:eastAsia="Times New Roman" w:hAnsi="Times New Roman" w:cs="Times New Roman"/>
+          <w:sz w:val="24"/>
+          <w:szCs w:val="24"/>
+        </w:rPr>
+        <w:t>for</w:t>
+      </w:r>
+      <w:proofErr w:type="spellEnd"/>
+      <w:r>
+        <w:rPr>
+          <w:rFonts w:ascii="Times New Roman" w:eastAsia="Times New Roman" w:hAnsi="Times New Roman" w:cs="Times New Roman"/>
+          <w:sz w:val="24"/>
+          <w:szCs w:val="24"/>
+        </w:rPr>
+        <w:t xml:space="preserve"> </w:t>
+      </w:r>
+      <w:proofErr w:type="spellStart"/>
+      <w:r>
+        <w:rPr>
+          <w:rFonts w:ascii="Times New Roman" w:eastAsia="Times New Roman" w:hAnsi="Times New Roman" w:cs="Times New Roman"/>
+          <w:sz w:val="24"/>
+          <w:szCs w:val="24"/>
+        </w:rPr>
+        <w:t>automated</w:t>
+      </w:r>
+      <w:proofErr w:type="spellEnd"/>
+      <w:r>
+        <w:rPr>
+          <w:rFonts w:ascii="Times New Roman" w:eastAsia="Times New Roman" w:hAnsi="Times New Roman" w:cs="Times New Roman"/>
+          <w:sz w:val="24"/>
+          <w:szCs w:val="24"/>
+        </w:rPr>
+        <w:t xml:space="preserve"> </w:t>
+      </w:r>
+      <w:proofErr w:type="spellStart"/>
+      <w:r>
+        <w:rPr>
+          <w:rFonts w:ascii="Times New Roman" w:eastAsia="Times New Roman" w:hAnsi="Times New Roman" w:cs="Times New Roman"/>
+          <w:sz w:val="24"/>
+          <w:szCs w:val="24"/>
+        </w:rPr>
+        <w:t>generation</w:t>
+      </w:r>
+      <w:proofErr w:type="spellEnd"/>
+      <w:r>
+        <w:rPr>
+          <w:rFonts w:ascii="Times New Roman" w:eastAsia="Times New Roman" w:hAnsi="Times New Roman" w:cs="Times New Roman"/>
+          <w:sz w:val="24"/>
+          <w:szCs w:val="24"/>
+        </w:rPr>
+        <w:t xml:space="preserve"> and multimodal </w:t>
+      </w:r>
+      <w:proofErr w:type="spellStart"/>
+      <w:r>
+        <w:rPr>
+          <w:rFonts w:ascii="Times New Roman" w:eastAsia="Times New Roman" w:hAnsi="Times New Roman" w:cs="Times New Roman"/>
+          <w:sz w:val="24"/>
+          <w:szCs w:val="24"/>
+        </w:rPr>
+        <w:t>validation</w:t>
+      </w:r>
+      <w:proofErr w:type="spellEnd"/>
+      <w:r>
+        <w:rPr>
+          <w:rFonts w:ascii="Times New Roman" w:eastAsia="Times New Roman" w:hAnsi="Times New Roman" w:cs="Times New Roman"/>
+          <w:sz w:val="24"/>
+          <w:szCs w:val="24"/>
+        </w:rPr>
+        <w:t xml:space="preserve"> </w:t>
+      </w:r>
+      <w:proofErr w:type="spellStart"/>
+      <w:r>
+        <w:rPr>
+          <w:rFonts w:ascii="Times New Roman" w:eastAsia="Times New Roman" w:hAnsi="Times New Roman" w:cs="Times New Roman"/>
+          <w:sz w:val="24"/>
+          <w:szCs w:val="24"/>
+        </w:rPr>
+        <w:t>of</w:t>
+      </w:r>
+      <w:proofErr w:type="spellEnd"/>
+      <w:r>
+        <w:rPr>
+          <w:rFonts w:ascii="Times New Roman" w:eastAsia="Times New Roman" w:hAnsi="Times New Roman" w:cs="Times New Roman"/>
+          <w:sz w:val="24"/>
+          <w:szCs w:val="24"/>
+        </w:rPr>
+        <w:t xml:space="preserve"> UML </w:t>
+      </w:r>
+      <w:proofErr w:type="spellStart"/>
+      <w:r>
+        <w:rPr>
+          <w:rFonts w:ascii="Times New Roman" w:eastAsia="Times New Roman" w:hAnsi="Times New Roman" w:cs="Times New Roman"/>
+          <w:sz w:val="24"/>
+          <w:szCs w:val="24"/>
+        </w:rPr>
+        <w:t>diagrams</w:t>
+      </w:r>
+      <w:proofErr w:type="spellEnd"/>
+      <w:r>
+        <w:rPr>
+          <w:rFonts w:ascii="Times New Roman" w:eastAsia="Times New Roman" w:hAnsi="Times New Roman" w:cs="Times New Roman"/>
+          <w:sz w:val="24"/>
+          <w:szCs w:val="24"/>
+        </w:rPr>
+        <w:t xml:space="preserve">. </w:t>
+      </w:r>
+      <w:proofErr w:type="spellStart"/>
+      <w:r>
+        <w:rPr>
+          <w:rFonts w:ascii="Times New Roman" w:eastAsia="Times New Roman" w:hAnsi="Times New Roman" w:cs="Times New Roman"/>
+          <w:i/>
+          <w:iCs/>
+          <w:sz w:val="24"/>
+          <w:szCs w:val="24"/>
+        </w:rPr>
+        <w:t>Computer</w:t>
+      </w:r>
+      <w:proofErr w:type="spellEnd"/>
+      <w:r>
+        <w:rPr>
+          <w:rFonts w:ascii="Times New Roman" w:eastAsia="Times New Roman" w:hAnsi="Times New Roman" w:cs="Times New Roman"/>
+          <w:i/>
+          <w:iCs/>
+          <w:sz w:val="24"/>
+          <w:szCs w:val="24"/>
+        </w:rPr>
+        <w:t xml:space="preserve"> </w:t>
+      </w:r>
+      <w:proofErr w:type="spellStart"/>
+      <w:r>
+        <w:rPr>
+          <w:rFonts w:ascii="Times New Roman" w:eastAsia="Times New Roman" w:hAnsi="Times New Roman" w:cs="Times New Roman"/>
+          <w:i/>
+          <w:iCs/>
+          <w:sz w:val="24"/>
+          <w:szCs w:val="24"/>
+        </w:rPr>
+        <w:t>Modeling</w:t>
+      </w:r>
+      <w:proofErr w:type="spellEnd"/>
+      <w:r>
+        <w:rPr>
+          <w:rFonts w:ascii="Times New Roman" w:eastAsia="Times New Roman" w:hAnsi="Times New Roman" w:cs="Times New Roman"/>
+          <w:i/>
+          <w:iCs/>
+          <w:sz w:val="24"/>
+          <w:szCs w:val="24"/>
+        </w:rPr>
+        <w:t xml:space="preserve"> in </w:t>
+      </w:r>
+      <w:proofErr w:type="spellStart"/>
+      <w:r>
+        <w:rPr>
+          <w:rFonts w:ascii="Times New Roman" w:eastAsia="Times New Roman" w:hAnsi="Times New Roman" w:cs="Times New Roman"/>
+          <w:i/>
+          <w:iCs/>
+          <w:sz w:val="24"/>
+          <w:szCs w:val="24"/>
+        </w:rPr>
+        <w:t>Engineering</w:t>
+      </w:r>
+      <w:proofErr w:type="spellEnd"/>
+      <w:r>
+        <w:rPr>
+          <w:rFonts w:ascii="Times New Roman" w:eastAsia="Times New Roman" w:hAnsi="Times New Roman" w:cs="Times New Roman"/>
+          <w:i/>
+          <w:iCs/>
+          <w:sz w:val="24"/>
+          <w:szCs w:val="24"/>
+        </w:rPr>
+        <w:t xml:space="preserve"> &amp; </w:t>
+      </w:r>
+      <w:proofErr w:type="spellStart"/>
+      <w:r>
+        <w:rPr>
+          <w:rFonts w:ascii="Times New Roman" w:eastAsia="Times New Roman" w:hAnsi="Times New Roman" w:cs="Times New Roman"/>
+          <w:i/>
+          <w:iCs/>
+          <w:sz w:val="24"/>
+          <w:szCs w:val="24"/>
+        </w:rPr>
+        <w:t>Sciences</w:t>
+      </w:r>
+      <w:proofErr w:type="spellEnd"/>
+      <w:r>
+        <w:rPr>
+          <w:rFonts w:ascii="Times New Roman" w:eastAsia="Times New Roman" w:hAnsi="Times New Roman" w:cs="Times New Roman"/>
+          <w:i/>
+          <w:iCs/>
+          <w:sz w:val="24"/>
+          <w:szCs w:val="24"/>
+        </w:rPr>
+        <w:t xml:space="preserve">. </w:t>
       </w:r>
       <w:r>
         <w:rPr>
@@ -5159,25 +8141,359 @@
           <w:sz w:val="24"/>
           <w:szCs w:val="24"/>
         </w:rPr>
-        <w:t xml:space="preserve">Nguyen, J., Arora, C., Koe, R. E., Wang, F., &amp; Ferrari, A. (2026). Class model generation from requirements using large language models. En </w:t>
-      </w:r>
-      <w:r>
-        <w:rPr>
-          <w:rFonts w:ascii="Times New Roman" w:eastAsia="Times New Roman" w:hAnsi="Times New Roman" w:cs="Times New Roman"/>
-          <w:i/>
-          <w:iCs/>
-          <w:sz w:val="24"/>
-          <w:szCs w:val="24"/>
-        </w:rPr>
-        <w:t xml:space="preserve">Proceedings of the 2026 International Workshop on Modeling in Software Systems (MSSiS '26). </w:t>
-      </w:r>
-      <w:r>
-        <w:rPr>
-          <w:rFonts w:ascii="Times New Roman" w:eastAsia="Times New Roman" w:hAnsi="Times New Roman" w:cs="Times New Roman"/>
-          <w:sz w:val="24"/>
-          <w:szCs w:val="24"/>
-        </w:rPr>
-        <w:t>Association for Computing Machinery. https://doi.org/10.1145/3786146.3788643</w:t>
+        <w:t xml:space="preserve">Nguyen, J., Arora, C., Koe, R. E., Wang, F., &amp; Ferrari, A. (2026). Class </w:t>
+      </w:r>
+      <w:proofErr w:type="spellStart"/>
+      <w:r>
+        <w:rPr>
+          <w:rFonts w:ascii="Times New Roman" w:eastAsia="Times New Roman" w:hAnsi="Times New Roman" w:cs="Times New Roman"/>
+          <w:sz w:val="24"/>
+          <w:szCs w:val="24"/>
+        </w:rPr>
+        <w:t>model</w:t>
+      </w:r>
+      <w:proofErr w:type="spellEnd"/>
+      <w:r>
+        <w:rPr>
+          <w:rFonts w:ascii="Times New Roman" w:eastAsia="Times New Roman" w:hAnsi="Times New Roman" w:cs="Times New Roman"/>
+          <w:sz w:val="24"/>
+          <w:szCs w:val="24"/>
+        </w:rPr>
+        <w:t xml:space="preserve"> </w:t>
+      </w:r>
+      <w:proofErr w:type="spellStart"/>
+      <w:r>
+        <w:rPr>
+          <w:rFonts w:ascii="Times New Roman" w:eastAsia="Times New Roman" w:hAnsi="Times New Roman" w:cs="Times New Roman"/>
+          <w:sz w:val="24"/>
+          <w:szCs w:val="24"/>
+        </w:rPr>
+        <w:t>generation</w:t>
+      </w:r>
+      <w:proofErr w:type="spellEnd"/>
+      <w:r>
+        <w:rPr>
+          <w:rFonts w:ascii="Times New Roman" w:eastAsia="Times New Roman" w:hAnsi="Times New Roman" w:cs="Times New Roman"/>
+          <w:sz w:val="24"/>
+          <w:szCs w:val="24"/>
+        </w:rPr>
+        <w:t xml:space="preserve"> </w:t>
+      </w:r>
+      <w:proofErr w:type="spellStart"/>
+      <w:r>
+        <w:rPr>
+          <w:rFonts w:ascii="Times New Roman" w:eastAsia="Times New Roman" w:hAnsi="Times New Roman" w:cs="Times New Roman"/>
+          <w:sz w:val="24"/>
+          <w:szCs w:val="24"/>
+        </w:rPr>
+        <w:t>from</w:t>
+      </w:r>
+      <w:proofErr w:type="spellEnd"/>
+      <w:r>
+        <w:rPr>
+          <w:rFonts w:ascii="Times New Roman" w:eastAsia="Times New Roman" w:hAnsi="Times New Roman" w:cs="Times New Roman"/>
+          <w:sz w:val="24"/>
+          <w:szCs w:val="24"/>
+        </w:rPr>
+        <w:t xml:space="preserve"> </w:t>
+      </w:r>
+      <w:proofErr w:type="spellStart"/>
+      <w:r>
+        <w:rPr>
+          <w:rFonts w:ascii="Times New Roman" w:eastAsia="Times New Roman" w:hAnsi="Times New Roman" w:cs="Times New Roman"/>
+          <w:sz w:val="24"/>
+          <w:szCs w:val="24"/>
+        </w:rPr>
+        <w:t>requirements</w:t>
+      </w:r>
+      <w:proofErr w:type="spellEnd"/>
+      <w:r>
+        <w:rPr>
+          <w:rFonts w:ascii="Times New Roman" w:eastAsia="Times New Roman" w:hAnsi="Times New Roman" w:cs="Times New Roman"/>
+          <w:sz w:val="24"/>
+          <w:szCs w:val="24"/>
+        </w:rPr>
+        <w:t xml:space="preserve"> </w:t>
+      </w:r>
+      <w:proofErr w:type="spellStart"/>
+      <w:r>
+        <w:rPr>
+          <w:rFonts w:ascii="Times New Roman" w:eastAsia="Times New Roman" w:hAnsi="Times New Roman" w:cs="Times New Roman"/>
+          <w:sz w:val="24"/>
+          <w:szCs w:val="24"/>
+        </w:rPr>
+        <w:t>using</w:t>
+      </w:r>
+      <w:proofErr w:type="spellEnd"/>
+      <w:r>
+        <w:rPr>
+          <w:rFonts w:ascii="Times New Roman" w:eastAsia="Times New Roman" w:hAnsi="Times New Roman" w:cs="Times New Roman"/>
+          <w:sz w:val="24"/>
+          <w:szCs w:val="24"/>
+        </w:rPr>
+        <w:t xml:space="preserve"> </w:t>
+      </w:r>
+      <w:proofErr w:type="spellStart"/>
+      <w:r>
+        <w:rPr>
+          <w:rFonts w:ascii="Times New Roman" w:eastAsia="Times New Roman" w:hAnsi="Times New Roman" w:cs="Times New Roman"/>
+          <w:sz w:val="24"/>
+          <w:szCs w:val="24"/>
+        </w:rPr>
+        <w:t>large</w:t>
+      </w:r>
+      <w:proofErr w:type="spellEnd"/>
+      <w:r>
+        <w:rPr>
+          <w:rFonts w:ascii="Times New Roman" w:eastAsia="Times New Roman" w:hAnsi="Times New Roman" w:cs="Times New Roman"/>
+          <w:sz w:val="24"/>
+          <w:szCs w:val="24"/>
+        </w:rPr>
+        <w:t xml:space="preserve"> </w:t>
+      </w:r>
+      <w:proofErr w:type="spellStart"/>
+      <w:r>
+        <w:rPr>
+          <w:rFonts w:ascii="Times New Roman" w:eastAsia="Times New Roman" w:hAnsi="Times New Roman" w:cs="Times New Roman"/>
+          <w:sz w:val="24"/>
+          <w:szCs w:val="24"/>
+        </w:rPr>
+        <w:t>language</w:t>
+      </w:r>
+      <w:proofErr w:type="spellEnd"/>
+      <w:r>
+        <w:rPr>
+          <w:rFonts w:ascii="Times New Roman" w:eastAsia="Times New Roman" w:hAnsi="Times New Roman" w:cs="Times New Roman"/>
+          <w:sz w:val="24"/>
+          <w:szCs w:val="24"/>
+        </w:rPr>
+        <w:t xml:space="preserve"> </w:t>
+      </w:r>
+      <w:proofErr w:type="spellStart"/>
+      <w:r>
+        <w:rPr>
+          <w:rFonts w:ascii="Times New Roman" w:eastAsia="Times New Roman" w:hAnsi="Times New Roman" w:cs="Times New Roman"/>
+          <w:sz w:val="24"/>
+          <w:szCs w:val="24"/>
+        </w:rPr>
+        <w:t>models</w:t>
+      </w:r>
+      <w:proofErr w:type="spellEnd"/>
+      <w:r>
+        <w:rPr>
+          <w:rFonts w:ascii="Times New Roman" w:eastAsia="Times New Roman" w:hAnsi="Times New Roman" w:cs="Times New Roman"/>
+          <w:sz w:val="24"/>
+          <w:szCs w:val="24"/>
+        </w:rPr>
+        <w:t xml:space="preserve">. En </w:t>
+      </w:r>
+      <w:proofErr w:type="spellStart"/>
+      <w:r>
+        <w:rPr>
+          <w:rFonts w:ascii="Times New Roman" w:eastAsia="Times New Roman" w:hAnsi="Times New Roman" w:cs="Times New Roman"/>
+          <w:i/>
+          <w:iCs/>
+          <w:sz w:val="24"/>
+          <w:szCs w:val="24"/>
+        </w:rPr>
+        <w:t>Proceedings</w:t>
+      </w:r>
+      <w:proofErr w:type="spellEnd"/>
+      <w:r>
+        <w:rPr>
+          <w:rFonts w:ascii="Times New Roman" w:eastAsia="Times New Roman" w:hAnsi="Times New Roman" w:cs="Times New Roman"/>
+          <w:i/>
+          <w:iCs/>
+          <w:sz w:val="24"/>
+          <w:szCs w:val="24"/>
+        </w:rPr>
+        <w:t xml:space="preserve"> </w:t>
+      </w:r>
+      <w:proofErr w:type="spellStart"/>
+      <w:r>
+        <w:rPr>
+          <w:rFonts w:ascii="Times New Roman" w:eastAsia="Times New Roman" w:hAnsi="Times New Roman" w:cs="Times New Roman"/>
+          <w:i/>
+          <w:iCs/>
+          <w:sz w:val="24"/>
+          <w:szCs w:val="24"/>
+        </w:rPr>
+        <w:t>of</w:t>
+      </w:r>
+      <w:proofErr w:type="spellEnd"/>
+      <w:r>
+        <w:rPr>
+          <w:rFonts w:ascii="Times New Roman" w:eastAsia="Times New Roman" w:hAnsi="Times New Roman" w:cs="Times New Roman"/>
+          <w:i/>
+          <w:iCs/>
+          <w:sz w:val="24"/>
+          <w:szCs w:val="24"/>
+        </w:rPr>
+        <w:t xml:space="preserve"> </w:t>
+      </w:r>
+      <w:proofErr w:type="spellStart"/>
+      <w:r>
+        <w:rPr>
+          <w:rFonts w:ascii="Times New Roman" w:eastAsia="Times New Roman" w:hAnsi="Times New Roman" w:cs="Times New Roman"/>
+          <w:i/>
+          <w:iCs/>
+          <w:sz w:val="24"/>
+          <w:szCs w:val="24"/>
+        </w:rPr>
+        <w:t>the</w:t>
+      </w:r>
+      <w:proofErr w:type="spellEnd"/>
+      <w:r>
+        <w:rPr>
+          <w:rFonts w:ascii="Times New Roman" w:eastAsia="Times New Roman" w:hAnsi="Times New Roman" w:cs="Times New Roman"/>
+          <w:i/>
+          <w:iCs/>
+          <w:sz w:val="24"/>
+          <w:szCs w:val="24"/>
+        </w:rPr>
+        <w:t xml:space="preserve"> 2026 International Workshop </w:t>
+      </w:r>
+      <w:proofErr w:type="spellStart"/>
+      <w:r>
+        <w:rPr>
+          <w:rFonts w:ascii="Times New Roman" w:eastAsia="Times New Roman" w:hAnsi="Times New Roman" w:cs="Times New Roman"/>
+          <w:i/>
+          <w:iCs/>
+          <w:sz w:val="24"/>
+          <w:szCs w:val="24"/>
+        </w:rPr>
+        <w:t>on</w:t>
+      </w:r>
+      <w:proofErr w:type="spellEnd"/>
+      <w:r>
+        <w:rPr>
+          <w:rFonts w:ascii="Times New Roman" w:eastAsia="Times New Roman" w:hAnsi="Times New Roman" w:cs="Times New Roman"/>
+          <w:i/>
+          <w:iCs/>
+          <w:sz w:val="24"/>
+          <w:szCs w:val="24"/>
+        </w:rPr>
+        <w:t xml:space="preserve"> </w:t>
+      </w:r>
+      <w:proofErr w:type="spellStart"/>
+      <w:r>
+        <w:rPr>
+          <w:rFonts w:ascii="Times New Roman" w:eastAsia="Times New Roman" w:hAnsi="Times New Roman" w:cs="Times New Roman"/>
+          <w:i/>
+          <w:iCs/>
+          <w:sz w:val="24"/>
+          <w:szCs w:val="24"/>
+        </w:rPr>
+        <w:t>Modeling</w:t>
+      </w:r>
+      <w:proofErr w:type="spellEnd"/>
+      <w:r>
+        <w:rPr>
+          <w:rFonts w:ascii="Times New Roman" w:eastAsia="Times New Roman" w:hAnsi="Times New Roman" w:cs="Times New Roman"/>
+          <w:i/>
+          <w:iCs/>
+          <w:sz w:val="24"/>
+          <w:szCs w:val="24"/>
+        </w:rPr>
+        <w:t xml:space="preserve"> in Software </w:t>
+      </w:r>
+      <w:proofErr w:type="spellStart"/>
+      <w:r>
+        <w:rPr>
+          <w:rFonts w:ascii="Times New Roman" w:eastAsia="Times New Roman" w:hAnsi="Times New Roman" w:cs="Times New Roman"/>
+          <w:i/>
+          <w:iCs/>
+          <w:sz w:val="24"/>
+          <w:szCs w:val="24"/>
+        </w:rPr>
+        <w:t>Systems</w:t>
+      </w:r>
+      <w:proofErr w:type="spellEnd"/>
+      <w:r>
+        <w:rPr>
+          <w:rFonts w:ascii="Times New Roman" w:eastAsia="Times New Roman" w:hAnsi="Times New Roman" w:cs="Times New Roman"/>
+          <w:i/>
+          <w:iCs/>
+          <w:sz w:val="24"/>
+          <w:szCs w:val="24"/>
+        </w:rPr>
+        <w:t xml:space="preserve"> (</w:t>
+      </w:r>
+      <w:proofErr w:type="spellStart"/>
+      <w:r>
+        <w:rPr>
+          <w:rFonts w:ascii="Times New Roman" w:eastAsia="Times New Roman" w:hAnsi="Times New Roman" w:cs="Times New Roman"/>
+          <w:i/>
+          <w:iCs/>
+          <w:sz w:val="24"/>
+          <w:szCs w:val="24"/>
+        </w:rPr>
+        <w:t>MSSiS</w:t>
+      </w:r>
+      <w:proofErr w:type="spellEnd"/>
+      <w:r>
+        <w:rPr>
+          <w:rFonts w:ascii="Times New Roman" w:eastAsia="Times New Roman" w:hAnsi="Times New Roman" w:cs="Times New Roman"/>
+          <w:i/>
+          <w:iCs/>
+          <w:sz w:val="24"/>
+          <w:szCs w:val="24"/>
+        </w:rPr>
+        <w:t xml:space="preserve"> '26). </w:t>
+      </w:r>
+      <w:proofErr w:type="spellStart"/>
+      <w:r>
+        <w:rPr>
+          <w:rFonts w:ascii="Times New Roman" w:eastAsia="Times New Roman" w:hAnsi="Times New Roman" w:cs="Times New Roman"/>
+          <w:sz w:val="24"/>
+          <w:szCs w:val="24"/>
+        </w:rPr>
+        <w:t>Association</w:t>
+      </w:r>
+      <w:proofErr w:type="spellEnd"/>
+      <w:r>
+        <w:rPr>
+          <w:rFonts w:ascii="Times New Roman" w:eastAsia="Times New Roman" w:hAnsi="Times New Roman" w:cs="Times New Roman"/>
+          <w:sz w:val="24"/>
+          <w:szCs w:val="24"/>
+        </w:rPr>
+        <w:t xml:space="preserve"> </w:t>
+      </w:r>
+      <w:proofErr w:type="spellStart"/>
+      <w:r>
+        <w:rPr>
+          <w:rFonts w:ascii="Times New Roman" w:eastAsia="Times New Roman" w:hAnsi="Times New Roman" w:cs="Times New Roman"/>
+          <w:sz w:val="24"/>
+          <w:szCs w:val="24"/>
+        </w:rPr>
+        <w:t>for</w:t>
+      </w:r>
+      <w:proofErr w:type="spellEnd"/>
+      <w:r>
+        <w:rPr>
+          <w:rFonts w:ascii="Times New Roman" w:eastAsia="Times New Roman" w:hAnsi="Times New Roman" w:cs="Times New Roman"/>
+          <w:sz w:val="24"/>
+          <w:szCs w:val="24"/>
+        </w:rPr>
+        <w:t xml:space="preserve"> Computing </w:t>
+      </w:r>
+      <w:proofErr w:type="spellStart"/>
+      <w:r>
+        <w:rPr>
+          <w:rFonts w:ascii="Times New Roman" w:eastAsia="Times New Roman" w:hAnsi="Times New Roman" w:cs="Times New Roman"/>
+          <w:sz w:val="24"/>
+          <w:szCs w:val="24"/>
+        </w:rPr>
+        <w:t>Machinery</w:t>
+      </w:r>
+      <w:proofErr w:type="spellEnd"/>
+      <w:r>
+        <w:rPr>
+          <w:rFonts w:ascii="Times New Roman" w:eastAsia="Times New Roman" w:hAnsi="Times New Roman" w:cs="Times New Roman"/>
+          <w:sz w:val="24"/>
+          <w:szCs w:val="24"/>
+        </w:rPr>
+        <w:t>. https://doi.org/10.1145/3786146.3788643</w:t>
       </w:r>
     </w:p>
     <w:p>
@@ -5196,25 +8512,353 @@
           <w:sz w:val="24"/>
           <w:szCs w:val="24"/>
         </w:rPr>
-        <w:t xml:space="preserve">Norvell, T. S. (2023). Cogent: Code generation from statecharts for real-time reactive code. En </w:t>
-      </w:r>
-      <w:r>
-        <w:rPr>
-          <w:rFonts w:ascii="Times New Roman" w:eastAsia="Times New Roman" w:hAnsi="Times New Roman" w:cs="Times New Roman"/>
-          <w:i/>
-          <w:iCs/>
-          <w:sz w:val="24"/>
-          <w:szCs w:val="24"/>
-        </w:rPr>
-        <w:t xml:space="preserve">Proceedings of the Newfoundland and Labrador Electrical and Computer Engineering Conference 2023. </w:t>
-      </w:r>
-      <w:r>
-        <w:rPr>
-          <w:rFonts w:ascii="Times New Roman" w:eastAsia="Times New Roman" w:hAnsi="Times New Roman" w:cs="Times New Roman"/>
-          <w:sz w:val="24"/>
-          <w:szCs w:val="24"/>
-        </w:rPr>
-        <w:t>Memorial University of Newfoundland.</w:t>
+        <w:t xml:space="preserve">Norvell, T. S. (2023). </w:t>
+      </w:r>
+      <w:proofErr w:type="spellStart"/>
+      <w:r>
+        <w:rPr>
+          <w:rFonts w:ascii="Times New Roman" w:eastAsia="Times New Roman" w:hAnsi="Times New Roman" w:cs="Times New Roman"/>
+          <w:sz w:val="24"/>
+          <w:szCs w:val="24"/>
+        </w:rPr>
+        <w:t>Cogent</w:t>
+      </w:r>
+      <w:proofErr w:type="spellEnd"/>
+      <w:r>
+        <w:rPr>
+          <w:rFonts w:ascii="Times New Roman" w:eastAsia="Times New Roman" w:hAnsi="Times New Roman" w:cs="Times New Roman"/>
+          <w:sz w:val="24"/>
+          <w:szCs w:val="24"/>
+        </w:rPr>
+        <w:t xml:space="preserve">: Code </w:t>
+      </w:r>
+      <w:proofErr w:type="spellStart"/>
+      <w:r>
+        <w:rPr>
+          <w:rFonts w:ascii="Times New Roman" w:eastAsia="Times New Roman" w:hAnsi="Times New Roman" w:cs="Times New Roman"/>
+          <w:sz w:val="24"/>
+          <w:szCs w:val="24"/>
+        </w:rPr>
+        <w:t>generation</w:t>
+      </w:r>
+      <w:proofErr w:type="spellEnd"/>
+      <w:r>
+        <w:rPr>
+          <w:rFonts w:ascii="Times New Roman" w:eastAsia="Times New Roman" w:hAnsi="Times New Roman" w:cs="Times New Roman"/>
+          <w:sz w:val="24"/>
+          <w:szCs w:val="24"/>
+        </w:rPr>
+        <w:t xml:space="preserve"> </w:t>
+      </w:r>
+      <w:proofErr w:type="spellStart"/>
+      <w:r>
+        <w:rPr>
+          <w:rFonts w:ascii="Times New Roman" w:eastAsia="Times New Roman" w:hAnsi="Times New Roman" w:cs="Times New Roman"/>
+          <w:sz w:val="24"/>
+          <w:szCs w:val="24"/>
+        </w:rPr>
+        <w:t>from</w:t>
+      </w:r>
+      <w:proofErr w:type="spellEnd"/>
+      <w:r>
+        <w:rPr>
+          <w:rFonts w:ascii="Times New Roman" w:eastAsia="Times New Roman" w:hAnsi="Times New Roman" w:cs="Times New Roman"/>
+          <w:sz w:val="24"/>
+          <w:szCs w:val="24"/>
+        </w:rPr>
+        <w:t xml:space="preserve"> </w:t>
+      </w:r>
+      <w:proofErr w:type="spellStart"/>
+      <w:r>
+        <w:rPr>
+          <w:rFonts w:ascii="Times New Roman" w:eastAsia="Times New Roman" w:hAnsi="Times New Roman" w:cs="Times New Roman"/>
+          <w:sz w:val="24"/>
+          <w:szCs w:val="24"/>
+        </w:rPr>
+        <w:t>statecharts</w:t>
+      </w:r>
+      <w:proofErr w:type="spellEnd"/>
+      <w:r>
+        <w:rPr>
+          <w:rFonts w:ascii="Times New Roman" w:eastAsia="Times New Roman" w:hAnsi="Times New Roman" w:cs="Times New Roman"/>
+          <w:sz w:val="24"/>
+          <w:szCs w:val="24"/>
+        </w:rPr>
+        <w:t xml:space="preserve"> </w:t>
+      </w:r>
+      <w:proofErr w:type="spellStart"/>
+      <w:r>
+        <w:rPr>
+          <w:rFonts w:ascii="Times New Roman" w:eastAsia="Times New Roman" w:hAnsi="Times New Roman" w:cs="Times New Roman"/>
+          <w:sz w:val="24"/>
+          <w:szCs w:val="24"/>
+        </w:rPr>
+        <w:t>for</w:t>
+      </w:r>
+      <w:proofErr w:type="spellEnd"/>
+      <w:r>
+        <w:rPr>
+          <w:rFonts w:ascii="Times New Roman" w:eastAsia="Times New Roman" w:hAnsi="Times New Roman" w:cs="Times New Roman"/>
+          <w:sz w:val="24"/>
+          <w:szCs w:val="24"/>
+        </w:rPr>
+        <w:t xml:space="preserve"> real-time reactive </w:t>
+      </w:r>
+      <w:proofErr w:type="spellStart"/>
+      <w:r>
+        <w:rPr>
+          <w:rFonts w:ascii="Times New Roman" w:eastAsia="Times New Roman" w:hAnsi="Times New Roman" w:cs="Times New Roman"/>
+          <w:sz w:val="24"/>
+          <w:szCs w:val="24"/>
+        </w:rPr>
+        <w:t>code</w:t>
+      </w:r>
+      <w:proofErr w:type="spellEnd"/>
+      <w:r>
+        <w:rPr>
+          <w:rFonts w:ascii="Times New Roman" w:eastAsia="Times New Roman" w:hAnsi="Times New Roman" w:cs="Times New Roman"/>
+          <w:sz w:val="24"/>
+          <w:szCs w:val="24"/>
+        </w:rPr>
+        <w:t xml:space="preserve">. En </w:t>
+      </w:r>
+      <w:proofErr w:type="spellStart"/>
+      <w:r>
+        <w:rPr>
+          <w:rFonts w:ascii="Times New Roman" w:eastAsia="Times New Roman" w:hAnsi="Times New Roman" w:cs="Times New Roman"/>
+          <w:i/>
+          <w:iCs/>
+          <w:sz w:val="24"/>
+          <w:szCs w:val="24"/>
+        </w:rPr>
+        <w:t>Proceedings</w:t>
+      </w:r>
+      <w:proofErr w:type="spellEnd"/>
+      <w:r>
+        <w:rPr>
+          <w:rFonts w:ascii="Times New Roman" w:eastAsia="Times New Roman" w:hAnsi="Times New Roman" w:cs="Times New Roman"/>
+          <w:i/>
+          <w:iCs/>
+          <w:sz w:val="24"/>
+          <w:szCs w:val="24"/>
+        </w:rPr>
+        <w:t xml:space="preserve"> </w:t>
+      </w:r>
+      <w:proofErr w:type="spellStart"/>
+      <w:r>
+        <w:rPr>
+          <w:rFonts w:ascii="Times New Roman" w:eastAsia="Times New Roman" w:hAnsi="Times New Roman" w:cs="Times New Roman"/>
+          <w:i/>
+          <w:iCs/>
+          <w:sz w:val="24"/>
+          <w:szCs w:val="24"/>
+        </w:rPr>
+        <w:t>of</w:t>
+      </w:r>
+      <w:proofErr w:type="spellEnd"/>
+      <w:r>
+        <w:rPr>
+          <w:rFonts w:ascii="Times New Roman" w:eastAsia="Times New Roman" w:hAnsi="Times New Roman" w:cs="Times New Roman"/>
+          <w:i/>
+          <w:iCs/>
+          <w:sz w:val="24"/>
+          <w:szCs w:val="24"/>
+        </w:rPr>
+        <w:t xml:space="preserve"> </w:t>
+      </w:r>
+      <w:proofErr w:type="spellStart"/>
+      <w:r>
+        <w:rPr>
+          <w:rFonts w:ascii="Times New Roman" w:eastAsia="Times New Roman" w:hAnsi="Times New Roman" w:cs="Times New Roman"/>
+          <w:i/>
+          <w:iCs/>
+          <w:sz w:val="24"/>
+          <w:szCs w:val="24"/>
+        </w:rPr>
+        <w:t>the</w:t>
+      </w:r>
+      <w:proofErr w:type="spellEnd"/>
+      <w:r>
+        <w:rPr>
+          <w:rFonts w:ascii="Times New Roman" w:eastAsia="Times New Roman" w:hAnsi="Times New Roman" w:cs="Times New Roman"/>
+          <w:i/>
+          <w:iCs/>
+          <w:sz w:val="24"/>
+          <w:szCs w:val="24"/>
+        </w:rPr>
+        <w:t xml:space="preserve"> </w:t>
+      </w:r>
+      <w:proofErr w:type="spellStart"/>
+      <w:r>
+        <w:rPr>
+          <w:rFonts w:ascii="Times New Roman" w:eastAsia="Times New Roman" w:hAnsi="Times New Roman" w:cs="Times New Roman"/>
+          <w:i/>
+          <w:iCs/>
+          <w:sz w:val="24"/>
+          <w:szCs w:val="24"/>
+        </w:rPr>
+        <w:t>Newfoundland</w:t>
+      </w:r>
+      <w:proofErr w:type="spellEnd"/>
+      <w:r>
+        <w:rPr>
+          <w:rFonts w:ascii="Times New Roman" w:eastAsia="Times New Roman" w:hAnsi="Times New Roman" w:cs="Times New Roman"/>
+          <w:i/>
+          <w:iCs/>
+          <w:sz w:val="24"/>
+          <w:szCs w:val="24"/>
+        </w:rPr>
+        <w:t xml:space="preserve"> and Labrador </w:t>
+      </w:r>
+      <w:proofErr w:type="spellStart"/>
+      <w:r>
+        <w:rPr>
+          <w:rFonts w:ascii="Times New Roman" w:eastAsia="Times New Roman" w:hAnsi="Times New Roman" w:cs="Times New Roman"/>
+          <w:i/>
+          <w:iCs/>
+          <w:sz w:val="24"/>
+          <w:szCs w:val="24"/>
+        </w:rPr>
+        <w:t>Electrical</w:t>
+      </w:r>
+      <w:proofErr w:type="spellEnd"/>
+      <w:r>
+        <w:rPr>
+          <w:rFonts w:ascii="Times New Roman" w:eastAsia="Times New Roman" w:hAnsi="Times New Roman" w:cs="Times New Roman"/>
+          <w:i/>
+          <w:iCs/>
+          <w:sz w:val="24"/>
+          <w:szCs w:val="24"/>
+        </w:rPr>
+        <w:t xml:space="preserve"> and </w:t>
+      </w:r>
+      <w:proofErr w:type="spellStart"/>
+      <w:r>
+        <w:rPr>
+          <w:rFonts w:ascii="Times New Roman" w:eastAsia="Times New Roman" w:hAnsi="Times New Roman" w:cs="Times New Roman"/>
+          <w:i/>
+          <w:iCs/>
+          <w:sz w:val="24"/>
+          <w:szCs w:val="24"/>
+        </w:rPr>
+        <w:t>Computer</w:t>
+      </w:r>
+      <w:proofErr w:type="spellEnd"/>
+      <w:r>
+        <w:rPr>
+          <w:rFonts w:ascii="Times New Roman" w:eastAsia="Times New Roman" w:hAnsi="Times New Roman" w:cs="Times New Roman"/>
+          <w:i/>
+          <w:iCs/>
+          <w:sz w:val="24"/>
+          <w:szCs w:val="24"/>
+        </w:rPr>
+        <w:t xml:space="preserve"> </w:t>
+      </w:r>
+      <w:proofErr w:type="spellStart"/>
+      <w:r>
+        <w:rPr>
+          <w:rFonts w:ascii="Times New Roman" w:eastAsia="Times New Roman" w:hAnsi="Times New Roman" w:cs="Times New Roman"/>
+          <w:i/>
+          <w:iCs/>
+          <w:sz w:val="24"/>
+          <w:szCs w:val="24"/>
+        </w:rPr>
+        <w:t>Engineering</w:t>
+      </w:r>
+      <w:proofErr w:type="spellEnd"/>
+      <w:r>
+        <w:rPr>
+          <w:rFonts w:ascii="Times New Roman" w:eastAsia="Times New Roman" w:hAnsi="Times New Roman" w:cs="Times New Roman"/>
+          <w:i/>
+          <w:iCs/>
+          <w:sz w:val="24"/>
+          <w:szCs w:val="24"/>
+        </w:rPr>
+        <w:t xml:space="preserve"> </w:t>
+      </w:r>
+      <w:proofErr w:type="spellStart"/>
+      <w:r>
+        <w:rPr>
+          <w:rFonts w:ascii="Times New Roman" w:eastAsia="Times New Roman" w:hAnsi="Times New Roman" w:cs="Times New Roman"/>
+          <w:i/>
+          <w:iCs/>
+          <w:sz w:val="24"/>
+          <w:szCs w:val="24"/>
+        </w:rPr>
+        <w:t>Conference</w:t>
+      </w:r>
+      <w:proofErr w:type="spellEnd"/>
+      <w:r>
+        <w:rPr>
+          <w:rFonts w:ascii="Times New Roman" w:eastAsia="Times New Roman" w:hAnsi="Times New Roman" w:cs="Times New Roman"/>
+          <w:i/>
+          <w:iCs/>
+          <w:sz w:val="24"/>
+          <w:szCs w:val="24"/>
+        </w:rPr>
+        <w:t xml:space="preserve"> 2023. </w:t>
+      </w:r>
+      <w:r>
+        <w:rPr>
+          <w:rFonts w:ascii="Times New Roman" w:eastAsia="Times New Roman" w:hAnsi="Times New Roman" w:cs="Times New Roman"/>
+          <w:sz w:val="24"/>
+          <w:szCs w:val="24"/>
+        </w:rPr>
+        <w:t xml:space="preserve">Memorial </w:t>
+      </w:r>
+      <w:proofErr w:type="spellStart"/>
+      <w:r>
+        <w:rPr>
+          <w:rFonts w:ascii="Times New Roman" w:eastAsia="Times New Roman" w:hAnsi="Times New Roman" w:cs="Times New Roman"/>
+          <w:sz w:val="24"/>
+          <w:szCs w:val="24"/>
+        </w:rPr>
+        <w:t>University</w:t>
+      </w:r>
+      <w:proofErr w:type="spellEnd"/>
+      <w:r>
+        <w:rPr>
+          <w:rFonts w:ascii="Times New Roman" w:eastAsia="Times New Roman" w:hAnsi="Times New Roman" w:cs="Times New Roman"/>
+          <w:sz w:val="24"/>
+          <w:szCs w:val="24"/>
+        </w:rPr>
+        <w:t xml:space="preserve"> </w:t>
+      </w:r>
+      <w:proofErr w:type="spellStart"/>
+      <w:r>
+        <w:rPr>
+          <w:rFonts w:ascii="Times New Roman" w:eastAsia="Times New Roman" w:hAnsi="Times New Roman" w:cs="Times New Roman"/>
+          <w:sz w:val="24"/>
+          <w:szCs w:val="24"/>
+        </w:rPr>
+        <w:t>of</w:t>
+      </w:r>
+      <w:proofErr w:type="spellEnd"/>
+      <w:r>
+        <w:rPr>
+          <w:rFonts w:ascii="Times New Roman" w:eastAsia="Times New Roman" w:hAnsi="Times New Roman" w:cs="Times New Roman"/>
+          <w:sz w:val="24"/>
+          <w:szCs w:val="24"/>
+        </w:rPr>
+        <w:t xml:space="preserve"> </w:t>
+      </w:r>
+      <w:proofErr w:type="spellStart"/>
+      <w:r>
+        <w:rPr>
+          <w:rFonts w:ascii="Times New Roman" w:eastAsia="Times New Roman" w:hAnsi="Times New Roman" w:cs="Times New Roman"/>
+          <w:sz w:val="24"/>
+          <w:szCs w:val="24"/>
+        </w:rPr>
+        <w:t>Newfoundland</w:t>
+      </w:r>
+      <w:proofErr w:type="spellEnd"/>
+      <w:r>
+        <w:rPr>
+          <w:rFonts w:ascii="Times New Roman" w:eastAsia="Times New Roman" w:hAnsi="Times New Roman" w:cs="Times New Roman"/>
+          <w:sz w:val="24"/>
+          <w:szCs w:val="24"/>
+        </w:rPr>
+        <w:t>.</w:t>
       </w:r>
     </w:p>
     <w:p>
@@ -5227,15 +8871,49 @@
           <w:szCs w:val="24"/>
         </w:rPr>
       </w:pPr>
-      <w:r>
-        <w:rPr>
-          <w:rFonts w:ascii="Times New Roman" w:eastAsia="Times New Roman" w:hAnsi="Times New Roman" w:cs="Times New Roman"/>
-          <w:i/>
-          <w:iCs/>
-          <w:sz w:val="24"/>
-          <w:szCs w:val="24"/>
-        </w:rPr>
-        <w:t xml:space="preserve">PlantUML Language Reference Guide. </w:t>
+      <w:proofErr w:type="spellStart"/>
+      <w:r>
+        <w:rPr>
+          <w:rFonts w:ascii="Times New Roman" w:eastAsia="Times New Roman" w:hAnsi="Times New Roman" w:cs="Times New Roman"/>
+          <w:i/>
+          <w:iCs/>
+          <w:sz w:val="24"/>
+          <w:szCs w:val="24"/>
+        </w:rPr>
+        <w:t>PlantUML</w:t>
+      </w:r>
+      <w:proofErr w:type="spellEnd"/>
+      <w:r>
+        <w:rPr>
+          <w:rFonts w:ascii="Times New Roman" w:eastAsia="Times New Roman" w:hAnsi="Times New Roman" w:cs="Times New Roman"/>
+          <w:i/>
+          <w:iCs/>
+          <w:sz w:val="24"/>
+          <w:szCs w:val="24"/>
+        </w:rPr>
+        <w:t xml:space="preserve"> </w:t>
+      </w:r>
+      <w:proofErr w:type="spellStart"/>
+      <w:r>
+        <w:rPr>
+          <w:rFonts w:ascii="Times New Roman" w:eastAsia="Times New Roman" w:hAnsi="Times New Roman" w:cs="Times New Roman"/>
+          <w:i/>
+          <w:iCs/>
+          <w:sz w:val="24"/>
+          <w:szCs w:val="24"/>
+        </w:rPr>
+        <w:t>Language</w:t>
+      </w:r>
+      <w:proofErr w:type="spellEnd"/>
+      <w:r>
+        <w:rPr>
+          <w:rFonts w:ascii="Times New Roman" w:eastAsia="Times New Roman" w:hAnsi="Times New Roman" w:cs="Times New Roman"/>
+          <w:i/>
+          <w:iCs/>
+          <w:sz w:val="24"/>
+          <w:szCs w:val="24"/>
+        </w:rPr>
+        <w:t xml:space="preserve"> Reference Guide. </w:t>
       </w:r>
       <w:r>
         <w:rPr>

</xml_diff>